<commit_message>
docs: follow the landing-page change through the manuals
The Market Scanner's route moved to /options/scanner and / now redirects to the
Market Dashboard, so both end-user manuals had a stale "Route: the home page (/)"
and said nothing about where the app actually opens. Corrected in both, and the
Market Dashboard section in each now states that it IS the landing page.

Co-Authored-By: Claude Opus 5 <noreply@anthropic.com>
</commit_message>
<xml_diff>
--- a/docs/manuals/reference-guide/reference-guide.docx
+++ b/docs/manuals/reference-guide/reference-guide.docx
@@ -6617,6 +6617,40 @@
           <w:sz w:val="19"/>
         </w:rPr>
         <w:t>/market</w:t>
+      </w:r>
+      <w:r>
+        <w:rPr>
+          <w:i/>
+        </w:rPr>
+        <w:t xml:space="preserve"> — and the</w:t>
+        <w:br/>
+        <w:t xml:space="preserve">app's </w:t>
+      </w:r>
+      <w:r>
+        <w:rPr>
+          <w:i/>
+        </w:rPr>
+        <w:t>landing page</w:t>
+      </w:r>
+      <w:r>
+        <w:rPr>
+          <w:i/>
+        </w:rPr>
+        <w:t xml:space="preserve">: opening </w:t>
+      </w:r>
+      <w:r>
+        <w:rPr>
+          <w:rFonts w:ascii="Consolas" w:hAnsi="Consolas"/>
+          <w:color w:val="334455"/>
+          <w:sz w:val="19"/>
+        </w:rPr>
+        <w:t>http://127.0.0.1:8500</w:t>
+      </w:r>
+      <w:r>
+        <w:rPr>
+          <w:i/>
+        </w:rPr>
+        <w:t xml:space="preserve"> redirects here</w:t>
       </w:r>
     </w:p>
     <w:p>
@@ -14492,13 +14526,7 @@
           <w:color w:val="334455"/>
           <w:sz w:val="19"/>
         </w:rPr>
-        <w:t>/</w:t>
-      </w:r>
-      <w:r>
-        <w:rPr>
-          <w:i/>
-        </w:rPr>
-        <w:t xml:space="preserve"> (the app's home page)</w:t>
+        <w:t>/options/scanner</w:t>
       </w:r>
     </w:p>
     <w:p>

</xml_diff>

<commit_message>
docs: record the Momentum aligned-name list
Route detail, page help, both user-facing manuals and a CHANGELOG entry
for the Align panel gaining its membership. The Reference Guide's "the
highest-value output is the Align column" line was also corrected: that
column only covers the leaderboard's top/bottom slice, so a name aligned
at rank 40 never appeared in it — the panel list is the complete read.

Co-Authored-By: Claude Opus 5 <noreply@anthropic.com>
</commit_message>
<xml_diff>
--- a/docs/manuals/reference-guide/reference-guide.docx
+++ b/docs/manuals/reference-guide/reference-guide.docx
@@ -32,7 +32,7 @@
           <w:color w:val="5B6678"/>
           <w:sz w:val="18"/>
         </w:rPr>
-        <w:t>WebGUI Trading with Schwab · Generated 2026-08-17</w:t>
+        <w:t>WebGUI Trading with Schwab · Generated 2026-08-18</w:t>
       </w:r>
     </w:p>
     <w:p/>
@@ -12602,7 +12602,21 @@
         <w:rPr/>
         <w:t xml:space="preserve"> —</w:t>
         <w:br/>
-        <w:t>the highest-conviction rows on the page.</w:t>
+        <w:t xml:space="preserve">the highest-conviction rows on the page — </w:t>
+      </w:r>
+      <w:r>
+        <w:rPr>
+          <w:b/>
+        </w:rPr>
+        <w:t>and the names themselves, listed by rank</w:t>
+      </w:r>
+      <w:r>
+        <w:rPr/>
+        <w:t>.</w:t>
+        <w:br/>
+        <w:t>Click one to decompose it in section 4; since these are stocks, that switches the level</w:t>
+        <w:br/>
+        <w:t>selector to Stocks. Hovering a ticker shows its sector and industry.</w:t>
       </w:r>
     </w:p>
     <w:p>
@@ -13163,7 +13177,42 @@
     <w:p>
       <w:r>
         <w:rPr/>
-        <w:t xml:space="preserve">Practically, the highest-value output is the </w:t>
+        <w:t xml:space="preserve">Practically, the highest-value output is </w:t>
+      </w:r>
+      <w:r>
+        <w:rPr>
+          <w:b/>
+        </w:rPr>
+        <w:t>alignment</w:t>
+      </w:r>
+      <w:r>
+        <w:rPr/>
+        <w:t xml:space="preserve"> — a name where the whole hierarchy</w:t>
+        <w:br/>
+        <w:t>agrees. The green panel in section 2 lists every one of them, ranked, and those are the</w:t>
+        <w:br/>
+        <w:t xml:space="preserve">candidates worth taking to </w:t>
+      </w:r>
+      <w:r>
+        <w:rPr>
+          <w:color w:val="2E6DB4"/>
+        </w:rPr>
+        <w:t>Trade Analyzer</w:t>
+      </w:r>
+      <w:r>
+        <w:rPr/>
+        <w:t xml:space="preserve"> or</w:t>
+        <w:br/>
+      </w:r>
+      <w:r>
+        <w:rPr>
+          <w:color w:val="2E6DB4"/>
+        </w:rPr>
+        <w:t>Strategy Finder</w:t>
+      </w:r>
+      <w:r>
+        <w:rPr/>
+        <w:t xml:space="preserve">. The leaderboard's </w:t>
       </w:r>
       <w:r>
         <w:rPr>
@@ -13173,30 +13222,9 @@
       </w:r>
       <w:r>
         <w:rPr/>
-        <w:t xml:space="preserve"> column. A three-block row is a</w:t>
-        <w:br/>
-        <w:t>name where the whole hierarchy agrees, and those are the candidates worth taking to</w:t>
-        <w:br/>
-      </w:r>
-      <w:r>
-        <w:rPr>
-          <w:color w:val="2E6DB4"/>
-        </w:rPr>
-        <w:t>Trade Analyzer</w:t>
-      </w:r>
-      <w:r>
-        <w:rPr/>
-        <w:t xml:space="preserve"> or </w:t>
-      </w:r>
-      <w:r>
-        <w:rPr>
-          <w:color w:val="2E6DB4"/>
-        </w:rPr>
-        <w:t>Strategy Finder</w:t>
-      </w:r>
-      <w:r>
-        <w:rPr/>
-        <w:t>.</w:t>
+        <w:t xml:space="preserve"> column shows the same</w:t>
+        <w:br/>
+        <w:t>thing per row, as three blocks, but only for the names inside its top/bottom slice.</w:t>
       </w:r>
     </w:p>
     <w:p>

</xml_diff>

<commit_message>
docs: record the dashboard changes, and fix three stale manual claims
CHANGELOG entry plus the user-facing half of the previous commit: the
reference guide and user guide both listed four ranked frames and described
the breadth meter without a scope.

Three corrections found in passing, all of the kind the maintenance rule
warns rots silently because nothing fails when it does:

- Both manuals and page_help still listed the Entry Score / Current Score /
  Score Drift columns on Captured Signals, which captured_columns dropped;
  neither mentioned Cur Price, which replaced them.
- The user guide still called /market the landing page. That has been /desk
  since 2026-08-18.

The reference guide's five-minute captured auto-management cadence was
checked against scheduler._CAPTURED_MANAGE_INTERVAL_MIN and is correct.

Manuals rebuilt; the two untouched ones carry only their generated-date line.

Co-Authored-By: Claude Opus 5 <noreply@anthropic.com>
</commit_message>
<xml_diff>
--- a/docs/manuals/reference-guide/reference-guide.docx
+++ b/docs/manuals/reference-guide/reference-guide.docx
@@ -32,7 +32,7 @@
           <w:color w:val="5B6678"/>
           <w:sz w:val="18"/>
         </w:rPr>
-        <w:t>WebGUI Trading with Schwab · Generated 2026-08-18</w:t>
+        <w:t>WebGUI Trading with Schwab · Generated 2026-08-19</w:t>
       </w:r>
     </w:p>
     <w:p/>
@@ -2076,6 +2076,685 @@
     </w:p>
     <w:p>
       <w:pPr>
+        <w:pStyle w:val="Heading2"/>
+      </w:pPr>
+      <w:r>
+        <w:rPr/>
+        <w:t>Desk</w:t>
+      </w:r>
+    </w:p>
+    <w:p>
+      <w:r>
+        <w:rPr>
+          <w:i/>
+        </w:rPr>
+        <w:t xml:space="preserve">Menu: pinned at the top of the rail · Route </w:t>
+      </w:r>
+      <w:r>
+        <w:rPr>
+          <w:rFonts w:ascii="Consolas" w:hAnsi="Consolas"/>
+          <w:color w:val="334455"/>
+          <w:sz w:val="19"/>
+        </w:rPr>
+        <w:t>/desk</w:t>
+      </w:r>
+      <w:r>
+        <w:rPr>
+          <w:i/>
+        </w:rPr>
+        <w:t xml:space="preserve"> — also the app's home page,</w:t>
+        <w:br/>
+        <w:t xml:space="preserve">so plain </w:t>
+      </w:r>
+      <w:r>
+        <w:rPr>
+          <w:rFonts w:ascii="Consolas" w:hAnsi="Consolas"/>
+          <w:color w:val="334455"/>
+          <w:sz w:val="19"/>
+        </w:rPr>
+        <w:t>http://127.0.0.1:8500</w:t>
+      </w:r>
+      <w:r>
+        <w:rPr>
+          <w:i/>
+        </w:rPr>
+        <w:t xml:space="preserve"> lands here</w:t>
+      </w:r>
+    </w:p>
+    <w:p>
+      <w:pPr>
+        <w:pStyle w:val="Heading3"/>
+      </w:pPr>
+      <w:r>
+        <w:rPr/>
+        <w:t>What it is</w:t>
+      </w:r>
+    </w:p>
+    <w:p>
+      <w:r>
+        <w:rPr/>
+        <w:t>One screen that answers, in order down the page, the four questions a trading</w:t>
+        <w:br/>
+        <w:t>session actually opens with:</w:t>
+      </w:r>
+    </w:p>
+    <w:p>
+      <w:pPr>
+        <w:pStyle w:val="ListNumber"/>
+      </w:pPr>
+      <w:r>
+        <w:rPr>
+          <w:b/>
+        </w:rPr>
+        <w:t>What is the market doing?</w:t>
+      </w:r>
+      <w:r>
+        <w:t xml:space="preserve"> — the top strip</w:t>
+      </w:r>
+    </w:p>
+    <w:p>
+      <w:pPr>
+        <w:pStyle w:val="ListNumber"/>
+      </w:pPr>
+      <w:r>
+        <w:rPr>
+          <w:b/>
+        </w:rPr>
+        <w:t>Where is the structure?</w:t>
+      </w:r>
+      <w:r>
+        <w:t xml:space="preserve"> — Dealer Positioning</w:t>
+      </w:r>
+    </w:p>
+    <w:p>
+      <w:pPr>
+        <w:pStyle w:val="ListNumber"/>
+      </w:pPr>
+      <w:r>
+        <w:rPr>
+          <w:b/>
+        </w:rPr>
+        <w:t>What should I act on?</w:t>
+      </w:r>
+      <w:r>
+        <w:t xml:space="preserve"> — the Opportunity Board and Flow Alerts</w:t>
+      </w:r>
+    </w:p>
+    <w:p>
+      <w:pPr>
+        <w:pStyle w:val="ListNumber"/>
+      </w:pPr>
+      <w:r>
+        <w:rPr>
+          <w:b/>
+        </w:rPr>
+        <w:t>What am I holding?</w:t>
+      </w:r>
+      <w:r>
+        <w:t xml:space="preserve"> — Positions</w:t>
+      </w:r>
+    </w:p>
+    <w:p>
+      <w:r>
+        <w:rPr/>
+        <w:t>That sequence is the whole design. It is also the admission rule: a panel earns a</w:t>
+        <w:br/>
+        <w:t xml:space="preserve">place here only if it answers one of those four </w:t>
+      </w:r>
+      <w:r>
+        <w:rPr>
+          <w:i/>
+        </w:rPr>
+        <w:t>at a glance</w:t>
+      </w:r>
+      <w:r>
+        <w:rPr/>
+        <w:t>. Screens that reward</w:t>
+        <w:br/>
+        <w:t>deliberate study — the RRG, the sector heat grid, the momentum leaderboard, the</w:t>
+        <w:br/>
+        <w:t>Calculator, the Simulator — are deliberately absent, not overlooked.</w:t>
+      </w:r>
+    </w:p>
+    <w:p>
+      <w:pPr>
+        <w:pStyle w:val="Heading3"/>
+      </w:pPr>
+      <w:r>
+        <w:rPr/>
+        <w:t>When to open it</w:t>
+      </w:r>
+    </w:p>
+    <w:p>
+      <w:r>
+        <w:rPr/>
+        <w:t>First thing, and whenever you have lost the thread. Every panel is a summary of a</w:t>
+        <w:br/>
+        <w:t xml:space="preserve">page that goes deeper, and </w:t>
+      </w:r>
+      <w:r>
+        <w:rPr>
+          <w:b/>
+        </w:rPr>
+        <w:t>clicking any row opens that page already set to the</w:t>
+        <w:br/>
+        <w:t>symbol you clicked</w:t>
+      </w:r>
+      <w:r>
+        <w:rPr/>
+        <w:t>.</w:t>
+      </w:r>
+    </w:p>
+    <w:p>
+      <w:pPr>
+        <w:pStyle w:val="Heading3"/>
+      </w:pPr>
+      <w:r>
+        <w:rPr/>
+        <w:t>The panels</w:t>
+      </w:r>
+    </w:p>
+    <w:p>
+      <w:r>
+        <w:rPr>
+          <w:b/>
+        </w:rPr>
+        <w:t>Top strip.</w:t>
+      </w:r>
+      <w:r>
+        <w:rPr/>
+        <w:t xml:space="preserve"> The clock; </w:t>
+      </w:r>
+      <w:r>
+        <w:rPr>
+          <w:b/>
+        </w:rPr>
+        <w:t>VIX</w:t>
+      </w:r>
+      <w:r>
+        <w:rPr/>
+        <w:t xml:space="preserve"> and its regime band; the </w:t>
+      </w:r>
+      <w:r>
+        <w:rPr>
+          <w:b/>
+        </w:rPr>
+        <w:t>market regime</w:t>
+      </w:r>
+      <w:r>
+        <w:rPr/>
+        <w:t xml:space="preserve"> word</w:t>
+        <w:br/>
+        <w:t xml:space="preserve">(Rallying, Balanced, Whipsaw, Stressed…); and two dials showing </w:t>
+      </w:r>
+      <w:r>
+        <w:rPr>
+          <w:b/>
+        </w:rPr>
+        <w:t>Day / Week /</w:t>
+        <w:br/>
+        <w:t>Month</w:t>
+      </w:r>
+      <w:r>
+        <w:rPr/>
+        <w:t xml:space="preserve"> for market </w:t>
+      </w:r>
+      <w:r>
+        <w:rPr>
+          <w:b/>
+        </w:rPr>
+        <w:t>sentiment</w:t>
+      </w:r>
+      <w:r>
+        <w:rPr/>
+        <w:t xml:space="preserve"> and market </w:t>
+      </w:r>
+      <w:r>
+        <w:rPr>
+          <w:b/>
+        </w:rPr>
+        <w:t>trend</w:t>
+      </w:r>
+      <w:r>
+        <w:rPr/>
+        <w:t>.</w:t>
+      </w:r>
+    </w:p>
+    <w:p>
+      <w:r>
+        <w:rPr/>
+        <w:t xml:space="preserve">Note it shows VIX but </w:t>
+      </w:r>
+      <w:r>
+        <w:rPr>
+          <w:i/>
+        </w:rPr>
+        <w:t>not</w:t>
+      </w:r>
+      <w:r>
+        <w:rPr/>
+        <w:t xml:space="preserve"> SPX or QQQ. That is deliberate. Those prices appear in</w:t>
+        <w:br/>
+        <w:t>Dealer Positioning immediately below with more context, and the two panels read</w:t>
+        <w:br/>
+        <w:t>from different caches with independent update counters — so showing both could</w:t>
+        <w:br/>
+        <w:t>display two different prices for one symbol on one screen. VIX stays because it is</w:t>
+        <w:br/>
+        <w:t>excluded from the dealer-row universe by design and cannot appear below.</w:t>
+      </w:r>
+    </w:p>
+    <w:p>
+      <w:r>
+        <w:rPr>
+          <w:b/>
+        </w:rPr>
+        <w:t>Dealer Positioning.</w:t>
+      </w:r>
+      <w:r>
+        <w:rPr/>
+        <w:t xml:space="preserve"> One row each for </w:t>
+      </w:r>
+      <w:r>
+        <w:rPr>
+          <w:b/>
+        </w:rPr>
+        <w:t>$SPX, SPY, QQQ, $NDX</w:t>
+      </w:r>
+      <w:r>
+        <w:rPr/>
+        <w:t>: price and day</w:t>
+        <w:br/>
+        <w:t xml:space="preserve">change, the </w:t>
+      </w:r>
+      <w:r>
+        <w:rPr>
+          <w:b/>
+        </w:rPr>
+        <w:t>gamma flip</w:t>
+      </w:r>
+      <w:r>
+        <w:rPr/>
+        <w:t xml:space="preserve"> with the signed distance to it, the </w:t>
+      </w:r>
+      <w:r>
+        <w:rPr>
+          <w:b/>
+        </w:rPr>
+        <w:t>call and put</w:t>
+        <w:br/>
+        <w:t>walls</w:t>
+      </w:r>
+      <w:r>
+        <w:rPr/>
+        <w:t>, net gamma exposure, and a regime chip. The small bar shows where price</w:t>
+        <w:br/>
+        <w:t xml:space="preserve">sits </w:t>
+      </w:r>
+      <w:r>
+        <w:rPr>
+          <w:i/>
+        </w:rPr>
+        <w:t>between the two walls</w:t>
+      </w:r>
+      <w:r>
+        <w:rPr/>
+        <w:t>.</w:t>
+      </w:r>
+    </w:p>
+    <w:p>
+      <w:r>
+        <w:rPr/>
+        <w:t xml:space="preserve">The chip reads </w:t>
+      </w:r>
+      <w:r>
+        <w:rPr>
+          <w:b/>
+        </w:rPr>
+        <w:t>LONG GAMMA · PINS</w:t>
+      </w:r>
+      <w:r>
+        <w:rPr/>
+        <w:t xml:space="preserve"> or </w:t>
+      </w:r>
+      <w:r>
+        <w:rPr>
+          <w:b/>
+        </w:rPr>
+        <w:t>SHORT GAMMA · RUNS</w:t>
+      </w:r>
+      <w:r>
+        <w:rPr/>
+        <w:t>, and it is derived</w:t>
+        <w:br/>
+        <w:t>from price-versus-flip and nothing else. Net gamma exposure is shown beside it as a</w:t>
+        <w:br/>
+        <w:t>magnitude only. The two can legitimately disagree, and when they do that is real</w:t>
+        <w:br/>
+        <w:t>information — but the screen will never print two conflicting regime claims in one</w:t>
+        <w:br/>
+        <w:t xml:space="preserve">row. See </w:t>
+      </w:r>
+      <w:r>
+        <w:rPr>
+          <w:i/>
+        </w:rPr>
+        <w:t>Dealer Positioning</w:t>
+      </w:r>
+      <w:r>
+        <w:rPr/>
+        <w:t xml:space="preserve"> below for what these levels mean.</w:t>
+      </w:r>
+    </w:p>
+    <w:p>
+      <w:r>
+        <w:rPr>
+          <w:b/>
+        </w:rPr>
+        <w:t>Opportunity Board.</w:t>
+      </w:r>
+      <w:r>
+        <w:rPr/>
+        <w:t xml:space="preserve"> The five hottest names, each with a one-line reason, its</w:t>
+        <w:br/>
+        <w:t xml:space="preserve">at-the-money implied volatility </w:t>
+      </w:r>
+      <w:r>
+        <w:rPr>
+          <w:b/>
+        </w:rPr>
+        <w:t>and whether that is rising or falling</w:t>
+      </w:r>
+      <w:r>
+        <w:rPr/>
+        <w:t>, signal</w:t>
+        <w:br/>
+        <w:t>strength, put/call ratio, net premium, and a setup tag when one is active.</w:t>
+      </w:r>
+    </w:p>
+    <w:p>
+      <w:r>
+        <w:rPr/>
+        <w:t xml:space="preserve">There is no "edge" column. Edge normally means implied volatility minus </w:t>
+      </w:r>
+      <w:r>
+        <w:rPr>
+          <w:i/>
+        </w:rPr>
+        <w:t>realized</w:t>
+      </w:r>
+      <w:r>
+        <w:rPr/>
+        <w:br/>
+        <w:t>volatility, and this app has no realized-volatility series — so the column would be</w:t>
+        <w:br/>
+        <w:t xml:space="preserve">decoration. Implied volatility's </w:t>
+      </w:r>
+      <w:r>
+        <w:rPr>
+          <w:b/>
+        </w:rPr>
+        <w:t>direction</w:t>
+      </w:r>
+      <w:r>
+        <w:rPr/>
+        <w:t xml:space="preserve"> is published instead, and it is the</w:t>
+        <w:br/>
+        <w:t>more useful half: it is what separates a volatility-crush setup from a</w:t>
+        <w:br/>
+        <w:t>negative-gamma cascade.</w:t>
+      </w:r>
+    </w:p>
+    <w:p>
+      <w:r>
+        <w:rPr>
+          <w:b/>
+        </w:rPr>
+        <w:t>Live Flow Alerts.</w:t>
+      </w:r>
+      <w:r>
+        <w:rPr/>
+        <w:t xml:space="preserve"> The five newest unusual-options events — crossover, unusual</w:t>
+        <w:br/>
+        <w:t>activity, gamma flip, large delta.</w:t>
+      </w:r>
+    </w:p>
+    <w:p>
+      <w:r>
+        <w:rPr/>
+        <w:t xml:space="preserve">These show </w:t>
+      </w:r>
+      <w:r>
+        <w:rPr>
+          <w:b/>
+        </w:rPr>
+        <w:t>call or put</w:t>
+      </w:r>
+      <w:r>
+        <w:rPr/>
+        <w:t xml:space="preserve">, never </w:t>
+      </w:r>
+      <w:r>
+        <w:rPr>
+          <w:i/>
+        </w:rPr>
+        <w:t>bought</w:t>
+      </w:r>
+      <w:r>
+        <w:rPr/>
+        <w:t xml:space="preserve"> or </w:t>
+      </w:r>
+      <w:r>
+        <w:rPr>
+          <w:i/>
+        </w:rPr>
+        <w:t>sold</w:t>
+      </w:r>
+      <w:r>
+        <w:rPr/>
+        <w:t>. Schwab publishes no</w:t>
+        <w:br/>
+        <w:t>time-and-sales tape, so no one can honestly say which side initiated. Any product</w:t>
+        <w:br/>
+        <w:t xml:space="preserve">that tells you "$3.9M of calls were </w:t>
+      </w:r>
+      <w:r>
+        <w:rPr>
+          <w:b/>
+        </w:rPr>
+        <w:t>bought</w:t>
+      </w:r>
+      <w:r>
+        <w:rPr/>
+        <w:t>" is inferring it, usually from the</w:t>
+        <w:br/>
+        <w:t>bid/ask side, and that inference is often wrong.</w:t>
+      </w:r>
+    </w:p>
+    <w:p>
+      <w:r>
+        <w:rPr>
+          <w:b/>
+        </w:rPr>
+        <w:t>Positions.</w:t>
+      </w:r>
+      <w:r>
+        <w:rPr/>
+        <w:t xml:space="preserve"> Your paper trades and Claude's, merged, open only: source, strikes,</w:t>
+        <w:br/>
+        <w:t>days to expiration, size, entry, live mark, unrealized profit or loss, and a flag —</w:t>
+        <w:br/>
+      </w:r>
+      <w:r>
+        <w:rPr>
+          <w:b/>
+        </w:rPr>
+        <w:t>OK</w:t>
+      </w:r>
+      <w:r>
+        <w:rPr/>
+        <w:t xml:space="preserve">, </w:t>
+      </w:r>
+      <w:r>
+        <w:rPr>
+          <w:b/>
+        </w:rPr>
+        <w:t>Watch</w:t>
+      </w:r>
+      <w:r>
+        <w:rPr/>
+        <w:t xml:space="preserve">, </w:t>
+      </w:r>
+      <w:r>
+        <w:rPr>
+          <w:b/>
+        </w:rPr>
+        <w:t>At risk</w:t>
+      </w:r>
+      <w:r>
+        <w:rPr/>
+        <w:t xml:space="preserve">, </w:t>
+      </w:r>
+      <w:r>
+        <w:rPr>
+          <w:b/>
+        </w:rPr>
+        <w:t>Rescue</w:t>
+      </w:r>
+      <w:r>
+        <w:rPr/>
+        <w:t>. The header totals open trades,</w:t>
+        <w:br/>
+        <w:t xml:space="preserve">unrealized P&amp;L, and how many need attention. </w:t>
+      </w:r>
+      <w:r>
+        <w:rPr>
+          <w:i/>
+        </w:rPr>
+        <w:t>At risk</w:t>
+      </w:r>
+      <w:r>
+        <w:rPr/>
+        <w:t xml:space="preserve"> and </w:t>
+      </w:r>
+      <w:r>
+        <w:rPr>
+          <w:i/>
+        </w:rPr>
+        <w:t>Rescue</w:t>
+      </w:r>
+      <w:r>
+        <w:rPr/>
+        <w:t xml:space="preserve"> are the two</w:t>
+        <w:br/>
+        <w:t xml:space="preserve">that count toward that total; </w:t>
+      </w:r>
+      <w:r>
+        <w:rPr>
+          <w:i/>
+        </w:rPr>
+        <w:t>Watch</w:t>
+      </w:r>
+      <w:r>
+        <w:rPr/>
+        <w:t xml:space="preserve"> does not.</w:t>
+      </w:r>
+    </w:p>
+    <w:p>
+      <w:pPr>
+        <w:pStyle w:val="Heading3"/>
+      </w:pPr>
+      <w:r>
+        <w:rPr/>
+        <w:t>What the numbers are, and are not</w:t>
+      </w:r>
+    </w:p>
+    <w:p>
+      <w:pPr>
+        <w:pStyle w:val="ListBullet"/>
+      </w:pPr>
+      <w:r>
+        <w:rPr>
+          <w:b/>
+        </w:rPr>
+        <w:t>The Desk computes nothing of its own.</w:t>
+      </w:r>
+      <w:r>
+        <w:t xml:space="preserve"> Every figure is produced by the same</w:t>
+        <w:br/>
+        <w:t xml:space="preserve">  function that produces it on the page it came from. This is deliberate: a summary</w:t>
+        <w:br/>
+        <w:t xml:space="preserve">  screen that quietly disagrees with the page it links to is worse than no summary</w:t>
+        <w:br/>
+        <w:t xml:space="preserve">  screen.</w:t>
+      </w:r>
+    </w:p>
+    <w:p>
+      <w:pPr>
+        <w:pStyle w:val="ListBullet"/>
+      </w:pPr>
+      <w:r>
+        <w:rPr>
+          <w:b/>
+        </w:rPr>
+        <w:t>After the close, the walls disappear rather than going to zero.</w:t>
+      </w:r>
+      <w:r>
+        <w:t xml:space="preserve"> Index option</w:t>
+        <w:br/>
+        <w:t xml:space="preserve">  open interest reads 0 overnight, which produces an all-zero exposure grid and</w:t>
+        <w:br/>
+        <w:t xml:space="preserve">  therefore </w:t>
+      </w:r>
+      <w:r>
+        <w:rPr>
+          <w:i/>
+        </w:rPr>
+        <w:t>arbitrary</w:t>
+      </w:r>
+      <w:r>
+        <w:t xml:space="preserve"> walls. A greyed panel with a timestamp means "this is the</w:t>
+        <w:br/>
+        <w:t xml:space="preserve">  last reading I trust", not "the market is flat".</w:t>
+      </w:r>
+    </w:p>
+    <w:p>
+      <w:pPr>
+        <w:pStyle w:val="ListBullet"/>
+      </w:pPr>
+      <w:r>
+        <w:rPr>
+          <w:b/>
+        </w:rPr>
+        <w:t>The freshness indicator reports the real collection state</w:t>
+      </w:r>
+      <w:r>
+        <w:t>, including</w:t>
+        <w:br/>
+        <w:t xml:space="preserve">  "unknown". It is not a decorative "live" light.</w:t>
+      </w:r>
+    </w:p>
+    <w:p>
+      <w:pPr>
+        <w:pStyle w:val="ListBullet"/>
+      </w:pPr>
+      <w:r>
+        <w:rPr>
+          <w:b/>
+        </w:rPr>
+        <w:t>Nothing on this page can place, change, or close a trade.</w:t>
+      </w:r>
+      <w:r>
+        <w:t xml:space="preserve"> It reads and links.</w:t>
+      </w:r>
+    </w:p>
+    <w:p>
+      <w:r>
+        <w:br/>
+      </w:r>
+    </w:p>
+    <w:p>
+      <w:pPr>
         <w:pStyle w:val="Heading1"/>
       </w:pPr>
       <w:r>
@@ -7299,7 +7978,7 @@
             <w:r/>
             <w:r>
               <w:rPr/>
-              <w:t xml:space="preserve">RSP and QQEW are </w:t>
+              <w:t xml:space="preserve">Ranked by the day's move. RSP and QQEW are </w:t>
             </w:r>
             <w:r>
               <w:rPr>
@@ -7309,7 +7988,7 @@
             </w:r>
             <w:r>
               <w:rPr/>
-              <w:t xml:space="preserve"> — compare them to SPY and QQQ to see if the move is broad or driven by a few giants.</w:t>
+              <w:t xml:space="preserve"> — compare where they land against SPY and QQQ to see if the move is broad or driven by a few giants.</w:t>
             </w:r>
           </w:p>
         </w:tc>
@@ -7586,27 +8265,26 @@
         <w:rPr>
           <w:b/>
         </w:rPr>
-        <w:t>Four frames re-rank themselves</w:t>
-      </w:r>
-      <w:r>
-        <w:rPr/>
-        <w:t xml:space="preserve"> by the day's move — Top 10, Sector SPDR, Thematic,</w:t>
-        <w:br/>
-        <w:t xml:space="preserve">and Countries — so leaders and laggards are always at the ends. </w:t>
-      </w:r>
-      <w:r>
-        <w:rPr>
-          <w:b/>
-        </w:rPr>
-        <w:t>Every other frame</w:t>
-        <w:br/>
-        <w:t>keeps its curated order on purpose</w:t>
-      </w:r>
-      <w:r>
-        <w:rPr/>
-        <w:t>: SPY/DIA/QQQ/IWM in that sequence, VIX before its</w:t>
-        <w:br/>
-        <w:t>tenors. That layout is itself information.</w:t>
+        <w:t>Five frames re-rank themselves</w:t>
+      </w:r>
+      <w:r>
+        <w:rPr/>
+        <w:t xml:space="preserve"> by the day's move — Broad-Market ETF, Top 10,</w:t>
+        <w:br/>
+        <w:t>Sector SPDR, Thematic, and Countries — so leaders and laggards are always at the ends.</w:t>
+        <w:br/>
+      </w:r>
+      <w:r>
+        <w:rPr>
+          <w:b/>
+        </w:rPr>
+        <w:t>Every other frame keeps its curated order on purpose</w:t>
+      </w:r>
+      <w:r>
+        <w:rPr/>
+        <w:t>: VIX before its tenors, the</w:t>
+        <w:br/>
+        <w:t>cash indices paired with their futures. That layout is itself information.</w:t>
       </w:r>
     </w:p>
     <w:p>
@@ -7651,6 +8329,36 @@
       <w:r>
         <w:rPr/>
         <w:t xml:space="preserve"> when their value changes.</w:t>
+      </w:r>
+    </w:p>
+    <w:p>
+      <w:r>
+        <w:rPr>
+          <w:b/>
+        </w:rPr>
+        <w:t>What the breadth meter counts.</w:t>
+      </w:r>
+      <w:r>
+        <w:rPr/>
+        <w:t xml:space="preserve"> The four </w:t>
+      </w:r>
+      <w:r>
+        <w:rPr>
+          <w:i/>
+        </w:rPr>
+        <w:t>stock</w:t>
+      </w:r>
+      <w:r>
+        <w:rPr/>
+        <w:t xml:space="preserve"> frames only — Broad-Market ETF,</w:t>
+        <w:br/>
+        <w:t>Top 10, Sector SPDR and Thematic / Industry — so a bid VIX, a stronger dollar or a</w:t>
+        <w:br/>
+        <w:t>rallying Treasury does not register as a decline, and the meter reads the equity tape</w:t>
+        <w:br/>
+        <w:t>rather than the whole risk complex. The BIG10 composite is skipped, since it is the</w:t>
+        <w:br/>
+        <w:t>average of the ten mega-caps already counted beside it.</w:t>
       </w:r>
     </w:p>
     <w:p>
@@ -18307,6 +19015,22 @@
     <w:p/>
     <w:p>
       <w:r>
+        <w:rPr/>
+        <w:t xml:space="preserve">The table opens </w:t>
+      </w:r>
+      <w:r>
+        <w:rPr>
+          <w:b/>
+        </w:rPr>
+        <w:t>newest capture first</w:t>
+      </w:r>
+      <w:r>
+        <w:rPr/>
+        <w:t>; click any column heading to re-sort it.</w:t>
+      </w:r>
+    </w:p>
+    <w:p>
+      <w:r>
         <w:rPr>
           <w:b/>
         </w:rPr>
@@ -18325,7 +19049,9 @@
       <w:r>
         <w:rPr/>
         <w:br/>
-        <w:t>records an exit.</w:t>
+        <w:t>records an exit — click a row first to pick it, which also loads it into the detail</w:t>
+        <w:br/>
+        <w:t>panel on the right.</w:t>
       </w:r>
     </w:p>
     <w:p>

</xml_diff>

<commit_message>
docs: rebuild the two manuals whose markdown moved
The .html/.docx are TRACKED and are what More -> User Manuals actually serves,
so a markdown-only edit leaves the in-app manual stale — which is the silent
rot CLAUDE.md warns about, one layer below the prose.

Only user-guide and reference-guide. build_docs.py rebuilds all four, but the
other two differed by nothing except their generated date stamp, and a binary
.docx churned for a date is noise in the history.

Co-Authored-By: Claude Opus 5 <noreply@anthropic.com>
</commit_message>
<xml_diff>
--- a/docs/manuals/reference-guide/reference-guide.docx
+++ b/docs/manuals/reference-guide/reference-guide.docx
@@ -2724,41 +2724,144 @@
         <w:rPr/>
         <w:t xml:space="preserve"> is announced in a synthetic</w:t>
         <w:br/>
-        <w:t xml:space="preserve">human voice — the ticker spelled letter by letter, then the cause: </w:t>
+        <w:t>human voice and the row glows cyan for ten seconds. Tickers are always spelled</w:t>
+        <w:br/>
+        <w:t>letter by letter rather than read as words, which is squawk-box convention and also</w:t>
+        <w:br/>
+        <w:t xml:space="preserve">the only rule that survives an unbounded symbol list: "SPY" read aloud as </w:t>
       </w:r>
       <w:r>
         <w:rPr>
           <w:i/>
         </w:rPr>
+        <w:t>spy</w:t>
+      </w:r>
+      <w:r>
+        <w:rPr/>
+        <w:t xml:space="preserve"> is</w:t>
+        <w:br/>
+        <w:t>actively misleading.</w:t>
+      </w:r>
+    </w:p>
+    <w:p>
+      <w:r>
+        <w:rPr>
+          <w:b/>
+        </w:rPr>
+        <w:t>Two of the four flow detectors name a contract, and the announcement says it.</w:t>
+      </w:r>
+      <w:r>
+        <w:rPr/>
+        <w:br/>
+        <w:t>Unusual activity and large delta are about one option, so the sentence carries its</w:t>
+        <w:br/>
+        <w:t xml:space="preserve">expiry, strike and side: </w:t>
+      </w:r>
+      <w:r>
+        <w:rPr>
+          <w:i/>
+        </w:rPr>
+        <w:t>"N D X. Unusual activity, 0-D T E 7 15 Put."</w:t>
+      </w:r>
+      <w:r>
+        <w:rPr/>
+        <w:t xml:space="preserve"> A crossover</w:t>
+        <w:br/>
+        <w:t>is a fact about a symbol's whole premium tape and a gamma flip about the whole</w:t>
+        <w:br/>
+        <w:t xml:space="preserve">dealer book — neither has a contract to name, so both keep the short form: </w:t>
+      </w:r>
+      <w:r>
+        <w:rPr>
+          <w:i/>
+        </w:rPr>
         <w:t>"S P Y.</w:t>
         <w:br/>
         <w:t>Crossover alert, calls over."</w:t>
       </w:r>
       <w:r>
         <w:rPr/>
-        <w:t xml:space="preserve"> — and the row glows cyan for ten seconds. Tickers are</w:t>
-        <w:br/>
-        <w:t>always spelled rather than read as words, which is squawk-box convention and also</w:t>
-        <w:br/>
-        <w:t xml:space="preserve">the only rule that survives an unbounded symbol list: "SPY" read aloud as </w:t>
+        <w:t xml:space="preserve"> A new position speaks its strikes, expiry and entry</w:t>
+        <w:br/>
+        <w:t xml:space="preserve">price, and says </w:t>
+      </w:r>
+      <w:r>
+        <w:rPr>
+          <w:b/>
+        </w:rPr>
+        <w:t>credit or debit</w:t>
+      </w:r>
+      <w:r>
+        <w:rPr/>
+        <w:t xml:space="preserve"> explicitly, because the paper book stores a</w:t>
+        <w:br/>
+        <w:t>debit as a negative credit and a debit that sounded like a credit would be the most</w:t>
+        <w:br/>
+        <w:t>expensive sentence this feature could say.</w:t>
+      </w:r>
+    </w:p>
+    <w:p>
+      <w:r>
+        <w:rPr/>
+        <w:t>Numbers are spoken the way a trader hears them, not the way a computer reads them:</w:t>
+        <w:br/>
+        <w:t xml:space="preserve">leading digits one at a time and the last two as a pair, so 715 is </w:t>
       </w:r>
       <w:r>
         <w:rPr>
           <w:i/>
         </w:rPr>
-        <w:t>spy</w:t>
-      </w:r>
-      <w:r>
-        <w:rPr/>
-        <w:t xml:space="preserve"> is</w:t>
-        <w:br/>
-        <w:t>actively misleading.</w:t>
-      </w:r>
-    </w:p>
-    <w:p>
-      <w:r>
-        <w:rPr/>
-        <w:t>Three rules are worth knowing, because each is a decision rather than an accident:</w:t>
+        <w:t>"seven</w:t>
+        <w:br/>
+        <w:t>fifteen"</w:t>
+      </w:r>
+      <w:r>
+        <w:rPr/>
+        <w:t xml:space="preserve">, 21500 is </w:t>
+      </w:r>
+      <w:r>
+        <w:rPr>
+          <w:i/>
+        </w:rPr>
+        <w:t>"two one five hundred"</w:t>
+      </w:r>
+      <w:r>
+        <w:rPr/>
+        <w:t xml:space="preserve"> and 207.5 is </w:t>
+      </w:r>
+      <w:r>
+        <w:rPr>
+          <w:i/>
+        </w:rPr>
+        <w:t>"two oh seven point</w:t>
+        <w:br/>
+        <w:t>five"</w:t>
+      </w:r>
+      <w:r>
+        <w:rPr/>
+        <w:t>. This was settled by listening, not by argument. If any part of a contract</w:t>
+        <w:br/>
+        <w:t>is missing or unreadable, the announcement falls back to the short form rather than</w:t>
+        <w:br/>
+        <w:t xml:space="preserve">speaking a sentence with a hole in it — </w:t>
+      </w:r>
+      <w:r>
+        <w:rPr>
+          <w:b/>
+        </w:rPr>
+        <w:t>shorter, never half</w:t>
+      </w:r>
+      <w:r>
+        <w:rPr/>
+        <w:t>.</w:t>
+      </w:r>
+    </w:p>
+    <w:p>
+      <w:r>
+        <w:rPr/>
+        <w:t>Three more rules are worth knowing, because each is a decision rather than an</w:t>
+        <w:br/>
+        <w:t>accident:</w:t>
       </w:r>
     </w:p>
     <w:p>
@@ -2814,7 +2917,7 @@
       <w:r>
         <w:t xml:space="preserve"> carrying no information is noise at that detector's frequency. An</w:t>
         <w:br/>
-        <w:t xml:space="preserve">  announcement that names the ticker and the cause is not: if it does not concern</w:t>
+        <w:t xml:space="preserve">  announcement that names the ticker and the contract is not: if it does not concern</w:t>
         <w:br/>
         <w:t xml:space="preserve">  you, ignoring it costs nothing.</w:t>
       </w:r>

</xml_diff>

<commit_message>
docs(manuals): rebuild the four manuals
The Reference Guide's Overview section now states what the Position rail's
number actually is — a calibration band cut from the model's own five-year
output, not a percentile of today's names, with the measured 20/20/12/14/12
split as the evidence — and why Earnings trajectory always reads "not
published by Schwab".

The other three rebuild with pending content of their own: the user guide's
Trade Analyzer entry was still a single page in the built HTML while the
markdown had carried the four Signal Desk screens since the rewrite. A
markdown-only edit leaves the built pair stale, and nothing fails when it
does — the same rot the maintenance banner warns about.

Co-Authored-By: Claude Fable 5 <noreply@anthropic.com>
</commit_message>
<xml_diff>
--- a/docs/manuals/reference-guide/reference-guide.docx
+++ b/docs/manuals/reference-guide/reference-guide.docx
@@ -32,7 +32,7 @@
           <w:color w:val="5B6678"/>
           <w:sz w:val="18"/>
         </w:rPr>
-        <w:t>WebGUI Trading with Schwab · Generated 2026-08-21</w:t>
+        <w:t>WebGUI Trading with Schwab · Generated 2026-08-22</w:t>
       </w:r>
     </w:p>
     <w:p/>
@@ -1275,7 +1275,7 @@
             <w:r/>
             <w:r>
               <w:rPr/>
-              <w:t>You want a Buy/Hold/Sell read on one stock.</w:t>
+              <w:t>You want a Buy/Hold/Sell read on one stock, or a ranked shortlist to pick one from.</w:t>
             </w:r>
           </w:p>
         </w:tc>
@@ -15071,7 +15071,7 @@
         <w:rPr>
           <w:color w:val="2E6DB4"/>
         </w:rPr>
-        <w:t>Trade Analyzer</w:t>
+        <w:t>Overview</w:t>
       </w:r>
       <w:r>
         <w:rPr/>
@@ -15236,7 +15236,7 @@
         <w:rPr>
           <w:color w:val="2E6DB4"/>
         </w:rPr>
-        <w:t>Trade Analyzer</w:t>
+        <w:t>Overview</w:t>
       </w:r>
       <w:r>
         <w:rPr/>
@@ -19320,7 +19320,7 @@
         <w:rPr>
           <w:color w:val="2E6DB4"/>
         </w:rPr>
-        <w:t>Trade Analyzer</w:t>
+        <w:t>Overview</w:t>
       </w:r>
       <w:r>
         <w:rPr/>
@@ -22710,7 +22710,7 @@
       </w:pPr>
       <w:r>
         <w:rPr/>
-        <w:t>Trade Analyzer</w:t>
+        <w:t>Overview</w:t>
       </w:r>
     </w:p>
     <w:p>
@@ -22718,7 +22718,7 @@
         <w:rPr>
           <w:i/>
         </w:rPr>
-        <w:t xml:space="preserve">Menu: STRATEGY → Trade Analyzer · Route </w:t>
+        <w:t xml:space="preserve">Menu: STRATEGY -&gt; Trade Analyzer -&gt; Overview · Route </w:t>
       </w:r>
       <w:r>
         <w:rPr>
@@ -22741,19 +22741,9 @@
     <w:p>
       <w:r>
         <w:rPr/>
-        <w:t>A Buy / Hold / Sell verdict on a single stock, over two horizons, with all the evidence</w:t>
-        <w:br/>
-        <w:t xml:space="preserve">exposed. This is the app's only genuinely </w:t>
-      </w:r>
-      <w:r>
-        <w:rPr>
-          <w:i/>
-        </w:rPr>
-        <w:t>stock-level</w:t>
-      </w:r>
-      <w:r>
-        <w:rPr/>
-        <w:t xml:space="preserve"> (rather than options-level) view.</w:t>
+        <w:t>The Signal desk's landing screen: market state, both verdicts, dealer positioning and</w:t>
+        <w:br/>
+        <w:t>peer placement for one symbol, under a command bar shared by all four tabs.</w:t>
       </w:r>
     </w:p>
     <w:p>
@@ -22877,17 +22867,7 @@
             <w:r/>
             <w:r>
               <w:rPr/>
-              <w:t xml:space="preserve">On demand — type a symbol and press </w:t>
-            </w:r>
-            <w:r>
-              <w:rPr>
-                <w:b/>
-              </w:rPr>
-              <w:t>Analyze</w:t>
-            </w:r>
-            <w:r>
-              <w:rPr/>
-              <w:t>, or just tab out of the field</w:t>
+              <w:t>Commit a symbol in the command bar - Enter, Tab, or blur</w:t>
             </w:r>
           </w:p>
         </w:tc>
@@ -22913,7 +22893,7 @@
             <w:r/>
             <w:r>
               <w:rPr/>
-              <w:t>Remembers the last analyzed symbol across navigation</w:t>
+              <w:t>The committed symbol persists across all four screens and across navigation</w:t>
             </w:r>
           </w:p>
         </w:tc>
@@ -22934,191 +22914,263 @@
         <w:rPr>
           <w:b/>
         </w:rPr>
-        <w:t>Two verdict cards, side by side.</w:t>
-      </w:r>
-    </w:p>
-    <w:p>
-      <w:r>
-        <w:rPr>
-          <w:b/>
-        </w:rPr>
-        <w:t>Position (1–8 weeks)</w:t>
-      </w:r>
-      <w:r>
-        <w:rPr/>
-        <w:t xml:space="preserve"> is the more rigorous of the two. It is a </w:t>
-      </w:r>
-      <w:r>
-        <w:rPr>
-          <w:b/>
-        </w:rPr>
-        <w:t>backtested,</w:t>
-        <w:br/>
-        <w:t>IC-weighted cross-sectional factor model</w:t>
-      </w:r>
-      <w:r>
-        <w:rPr/>
-        <w:t xml:space="preserve"> — meaning each factor's weight was set by how</w:t>
-        <w:br/>
-        <w:t xml:space="preserve">well it actually predicted forward returns historically (its </w:t>
-      </w:r>
+        <w:t>The command bar</w:t>
+      </w:r>
+      <w:r>
+        <w:rPr/>
+        <w:t xml:space="preserve"> carries a draft/committed distinction: the symbol box outlines</w:t>
+        <w:br/>
+        <w:t>indigo while your typing differs from what is on screen, and an emptied box reverts</w:t>
+        <w:br/>
+        <w:t>rather than clearing. The company and sector line, and every panel below, follow the</w:t>
+        <w:br/>
+        <w:t>committed symbol.</w:t>
+      </w:r>
+    </w:p>
+    <w:p>
+      <w:r>
+        <w:rPr>
+          <w:b/>
+        </w:rPr>
+        <w:t>Deep Dive</w:t>
+      </w:r>
+      <w:r>
+        <w:rPr/>
+        <w:t xml:space="preserve"> and </w:t>
+      </w:r>
+      <w:r>
+        <w:rPr>
+          <w:b/>
+        </w:rPr>
+        <w:t>AI Query</w:t>
+      </w:r>
+      <w:r>
+        <w:rPr/>
+        <w:t xml:space="preserve"> sit in the command bar. Each enqueues its report for the</w:t>
+        <w:br/>
+        <w:t>committed symbol and opens the result in a new tab when it lands; the cache version is</w:t>
+        <w:br/>
+        <w:t>baselined at click time, so a stale report from an earlier run never opens a tab.</w:t>
+      </w:r>
+    </w:p>
+    <w:p>
+      <w:r>
+        <w:rPr>
+          <w:b/>
+        </w:rPr>
+        <w:t>Position</w:t>
+      </w:r>
+      <w:r>
+        <w:rPr/>
+        <w:t xml:space="preserve"> shows a band reading on a rail rather than a verdict word, because the</w:t>
+        <w:br/>
+        <w:t xml:space="preserve">model's output is a rank. </w:t>
+      </w:r>
+      <w:r>
+        <w:rPr>
+          <w:b/>
+        </w:rPr>
+        <w:t>The band is not a percentile of today's names.</w:t>
+      </w:r>
+      <w:r>
+        <w:rPr/>
+        <w:t xml:space="preserve"> The</w:t>
+        <w:br/>
+        <w:t>score's inputs are today's cross-section - each factor measured against the same 78</w:t>
+        <w:br/>
+        <w:t>symbols the model was fitted on - but the five bands are fixed score thresholds cut</w:t>
+        <w:br/>
+        <w:t>from five years of the model's own output. So 90th means "top band", not "top 10% of</w:t>
+        <w:br/>
+        <w:t>the board", and the bands fill unevenly: on 2026-08-22 the 78 names landed 20 / 20 /</w:t>
+        <w:br/>
+        <w:t>12 / 14 / 12 from the weakest band to the strongest, where a true percentile would put</w:t>
+        <w:br/>
+        <w:t>about 15 or 16 in each. A defensive market can leave the top band nearly empty. Hover</w:t>
+        <w:br/>
+        <w:t>the rail for that explanation in the app. The two side cards state what the tape</w:t>
+        <w:br/>
+        <w:t>permits per side.</w:t>
+      </w:r>
+    </w:p>
+    <w:p>
+      <w:r>
+        <w:rPr>
+          <w:b/>
+        </w:rPr>
+        <w:t>Investor</w:t>
+      </w:r>
+      <w:r>
+        <w:rPr/>
+        <w:t xml:space="preserve"> puts its six factors on the same centred bar language used on the</w:t>
+        <w:br/>
+        <w:t>Evidence screen - right of centre is a positive contribution. A factor the engine did</w:t>
+        <w:br/>
+        <w:t xml:space="preserve">not return reads </w:t>
+      </w:r>
+      <w:r>
+        <w:rPr>
+          <w:rFonts w:ascii="Consolas" w:hAnsi="Consolas"/>
+          <w:color w:val="334455"/>
+          <w:sz w:val="19"/>
+        </w:rPr>
+        <w:t>n/a</w:t>
+      </w:r>
+      <w:r>
+        <w:rPr/>
+        <w:t xml:space="preserve"> with no bar, never a zero-length one. </w:t>
+      </w:r>
+      <w:r>
+        <w:rPr>
+          <w:b/>
+        </w:rPr>
+        <w:t>Earnings trajectory is</w:t>
+        <w:br/>
+        <w:t>a special case and always reads "not published by Schwab".</w:t>
+      </w:r>
+      <w:r>
+        <w:rPr/>
+        <w:t xml:space="preserve"> Schwab's fundamentals</w:t>
+        <w:br/>
+        <w:t>payload carries 56 fields and neither earnings surprises nor company guidance, so both</w:t>
+        <w:br/>
+        <w:t>of that component's inputs are missing and it contributes exactly 0 for every symbol -</w:t>
+        <w:br/>
+        <w:t>15 of the score's 100 points are off the table before any stock is examined. Free cash</w:t>
+        <w:br/>
+        <w:t>flow is absent for the same reason, so the check that would cap a stock at HOLD on</w:t>
+        <w:br/>
+        <w:t>negative cash flow can never fire. Read a middling Investor score against what could</w:t>
+        <w:br/>
+        <w:t>have contributed, not as a verdict on the company.</w:t>
+      </w:r>
+    </w:p>
+    <w:p>
+      <w:r>
+        <w:rPr>
+          <w:b/>
+        </w:rPr>
+        <w:t>Dealer positioning</w:t>
+      </w:r>
+      <w:r>
+        <w:rPr/>
+        <w:t xml:space="preserve"> is withheld in full when uncollected or stale. That is the</w:t>
+        <w:br/>
+        <w:t>off-hours case, and an absent ladder is the honest rendering of it.</w:t>
+      </w:r>
+    </w:p>
+    <w:p>
+      <w:pPr>
+        <w:pStyle w:val="Heading3"/>
+      </w:pPr>
+      <w:r>
+        <w:rPr/>
+        <w:t>When to open it</w:t>
+      </w:r>
+    </w:p>
+    <w:p>
+      <w:r>
+        <w:rPr/>
+        <w:t>First, for any symbol. It is the orientation screen.</w:t>
+      </w:r>
+    </w:p>
+    <w:p>
+      <w:pPr>
+        <w:pStyle w:val="Heading3"/>
+      </w:pPr>
+      <w:r>
+        <w:rPr/>
+        <w:t>Related pages</w:t>
+      </w:r>
+    </w:p>
+    <w:p>
+      <w:r>
+        <w:rPr>
+          <w:color w:val="2E6DB4"/>
+        </w:rPr>
+        <w:t>Evidence</w:t>
+      </w:r>
+      <w:r>
+        <w:rPr/>
+        <w:t xml:space="preserve"> · </w:t>
+      </w:r>
+      <w:r>
+        <w:rPr>
+          <w:color w:val="2E6DB4"/>
+        </w:rPr>
+        <w:t>Rank Board</w:t>
+      </w:r>
+      <w:r>
+        <w:rPr/>
+        <w:t xml:space="preserve"> · </w:t>
+      </w:r>
+      <w:r>
+        <w:rPr>
+          <w:color w:val="2E6DB4"/>
+        </w:rPr>
+        <w:t>Trade Plan</w:t>
+      </w:r>
+      <w:r>
+        <w:rPr/>
+        <w:t>.</w:t>
+      </w:r>
+    </w:p>
+    <w:p>
+      <w:r>
+        <w:br/>
+      </w:r>
+    </w:p>
+    <w:p>
+      <w:pPr>
+        <w:pStyle w:val="Heading2"/>
+      </w:pPr>
+      <w:r>
+        <w:rPr/>
+        <w:t>Evidence</w:t>
+      </w:r>
+    </w:p>
+    <w:p>
       <w:r>
         <w:rPr>
           <w:i/>
         </w:rPr>
-        <w:t>information coefficient</w:t>
-      </w:r>
-      <w:r>
-        <w:rPr/>
-        <w:t>),</w:t>
-        <w:br/>
-        <w:t xml:space="preserve">not by hand-tuning. The verdict comes from a </w:t>
-      </w:r>
-      <w:r>
-        <w:rPr>
-          <w:b/>
-        </w:rPr>
-        <w:t>calibration band</w:t>
-      </w:r>
-      <w:r>
-        <w:rPr/>
-        <w:t>, and the headline</w:t>
-        <w:br/>
-        <w:t>reports what that band has historically delivered:</w:t>
+        <w:t xml:space="preserve">Menu: STRATEGY -&gt; Trade Analyzer -&gt; Evidence · Route </w:t>
+      </w:r>
+      <w:r>
+        <w:rPr>
+          <w:rFonts w:ascii="Consolas" w:hAnsi="Consolas"/>
+          <w:color w:val="334455"/>
+          <w:sz w:val="19"/>
+        </w:rPr>
+        <w:t>/trade/evidence</w:t>
       </w:r>
     </w:p>
     <w:p>
       <w:pPr>
-        <w:pStyle w:val="ListBullet"/>
+        <w:pStyle w:val="Heading3"/>
       </w:pPr>
       <w:r>
-        <w:t xml:space="preserve">an </w:t>
-      </w:r>
-      <w:r>
-        <w:rPr>
-          <w:b/>
-        </w:rPr>
-        <w:t>expected return</w:t>
-      </w:r>
-      <w:r>
-        <w:t xml:space="preserve"> over roughly the next four weeks, stated as </w:t>
-      </w:r>
-      <w:r>
-        <w:rPr>
-          <w:b/>
-        </w:rPr>
-        <w:t>excess versus the</w:t>
-        <w:br/>
-        <w:t xml:space="preserve">  S&amp;P 500</w:t>
-      </w:r>
-      <w:r>
-        <w:t xml:space="preserve"> — how much it beat or trailed the index, not the raw move;</w:t>
+        <w:rPr/>
+        <w:t>What it is</w:t>
+      </w:r>
+    </w:p>
+    <w:p>
+      <w:r>
+        <w:rPr/>
+        <w:t>Why the Position verdict is what it is - every weighted factor, its z-score against</w:t>
+        <w:br/>
+        <w:t>the cross-section, its contribution, and its historical IC - plus how the model has</w:t>
+        <w:br/>
+        <w:t>been doing and what this name has done before.</w:t>
       </w:r>
     </w:p>
     <w:p>
       <w:pPr>
-        <w:pStyle w:val="ListBullet"/>
+        <w:pStyle w:val="Heading3"/>
       </w:pPr>
       <w:r>
-        <w:t xml:space="preserve">a </w:t>
-      </w:r>
-      <w:r>
-        <w:rPr>
-          <w:b/>
-        </w:rPr>
-        <w:t>beat-SPY hit rate</w:t>
-      </w:r>
-      <w:r>
-        <w:t xml:space="preserve"> (e.g. </w:t>
-      </w:r>
-      <w:r>
-        <w:rPr>
-          <w:i/>
-        </w:rPr>
-        <w:t>"+1.3% excess / 20d · 52% beat-SPY"</w:t>
-      </w:r>
-      <w:r>
-        <w:t>).</w:t>
-      </w:r>
-    </w:p>
-    <w:p>
-      <w:r>
-        <w:rPr>
-          <w:b/>
-        </w:rPr>
-        <w:t>"Why — validated factors"</w:t>
-      </w:r>
-      <w:r>
-        <w:rPr/>
-        <w:t xml:space="preserve"> expands to each factor's z-score, weight, contribution and</w:t>
-        <w:br/>
-        <w:t xml:space="preserve">information coefficient, plus the model's version and its </w:t>
-      </w:r>
-      <w:r>
-        <w:rPr>
-          <w:b/>
-        </w:rPr>
-        <w:t>out-of-sample</w:t>
-      </w:r>
-      <w:r>
-        <w:rPr/>
-        <w:t xml:space="preserve"> IC. The</w:t>
-        <w:br/>
-        <w:t xml:space="preserve">older hand-tuned score is preserved under </w:t>
-      </w:r>
-      <w:r>
-        <w:rPr>
-          <w:b/>
-        </w:rPr>
-        <w:t>"Legacy heuristic"</w:t>
-      </w:r>
-      <w:r>
-        <w:rPr/>
-        <w:t xml:space="preserve"> for comparison.</w:t>
-      </w:r>
-    </w:p>
-    <w:p>
-      <w:r>
-        <w:rPr>
-          <w:b/>
-        </w:rPr>
-        <w:t>Investor (months+)</w:t>
-      </w:r>
-      <w:r>
-        <w:rPr/>
-        <w:t xml:space="preserve"> remains a heuristic score with its top reasons listed.</w:t>
-      </w:r>
-    </w:p>
-    <w:p>
-      <w:r>
-        <w:rPr>
-          <w:b/>
-        </w:rPr>
-        <w:t>Hard gates (⛔)</w:t>
-      </w:r>
-      <w:r>
-        <w:rPr/>
-        <w:t xml:space="preserve"> override the score outright — for example </w:t>
-      </w:r>
-      <w:r>
-        <w:rPr>
-          <w:i/>
-        </w:rPr>
-        <w:t>"Below 200EMA: cannot be</w:t>
-        <w:br/>
-        <w:t>BUY"</w:t>
-      </w:r>
-      <w:r>
-        <w:rPr/>
-        <w:t>. A gate is a veto, not a deduction.</w:t>
-      </w:r>
-    </w:p>
-    <w:p>
-      <w:r>
-        <w:rPr>
-          <w:b/>
-        </w:rPr>
-        <w:t>The evidence panels below:</w:t>
+        <w:rPr/>
+        <w:t>Where the data comes from</w:t>
       </w:r>
     </w:p>
     <w:tbl>
@@ -23152,12 +23204,6 @@
                 <w:b/>
               </w:rPr>
             </w:r>
-            <w:r>
-              <w:rPr>
-                <w:b/>
-              </w:rPr>
-              <w:t>Panel</w:t>
-            </w:r>
           </w:p>
         </w:tc>
         <w:tc>
@@ -23171,12 +23217,6 @@
                 <w:b/>
               </w:rPr>
             </w:r>
-            <w:r>
-              <w:rPr>
-                <w:b/>
-              </w:rPr>
-              <w:t>What it shows</w:t>
-            </w:r>
           </w:p>
         </w:tc>
       </w:tr>
@@ -23188,10 +23228,8 @@
           <w:p>
             <w:r/>
             <w:r>
-              <w:rPr>
-                <w:b/>
-              </w:rPr>
-              <w:t>MTF EMA alignment</w:t>
+              <w:rPr/>
+              <w:t>Service</w:t>
             </w:r>
           </w:p>
         </w:tc>
@@ -23202,8 +23240,40 @@
           <w:p>
             <w:r/>
             <w:r>
-              <w:rPr/>
-              <w:t>Whether the trend agrees across 1-minute, 5, 15, 60 and daily. A percentage plus per-timeframe labels. All five aligned is a strong, rare condition.</w:t>
+              <w:rPr>
+                <w:rFonts w:ascii="Consolas" w:hAnsi="Consolas"/>
+                <w:color w:val="334455"/>
+                <w:sz w:val="19"/>
+              </w:rPr>
+              <w:t>trade_svc</w:t>
+            </w:r>
+            <w:r>
+              <w:rPr/>
+              <w:t xml:space="preserve">, </w:t>
+            </w:r>
+            <w:r>
+              <w:rPr>
+                <w:rFonts w:ascii="Consolas" w:hAnsi="Consolas"/>
+                <w:color w:val="334455"/>
+                <w:sz w:val="19"/>
+              </w:rPr>
+              <w:t>cache:trade:analysis</w:t>
+            </w:r>
+            <w:r>
+              <w:rPr/>
+              <w:t xml:space="preserve"> (</w:t>
+            </w:r>
+            <w:r>
+              <w:rPr>
+                <w:rFonts w:ascii="Consolas" w:hAnsi="Consolas"/>
+                <w:color w:val="334455"/>
+                <w:sz w:val="19"/>
+              </w:rPr>
+              <w:t>swing_model.contributions</w:t>
+            </w:r>
+            <w:r>
+              <w:rPr/>
+              <w:t>)</w:t>
             </w:r>
           </w:p>
         </w:tc>
@@ -23217,10 +23287,8 @@
           <w:p>
             <w:r/>
             <w:r>
-              <w:rPr>
-                <w:b/>
-              </w:rPr>
-              <w:t>Momentum</w:t>
+              <w:rPr/>
+              <w:t>Track record</w:t>
             </w:r>
           </w:p>
         </w:tc>
@@ -23233,7 +23301,15 @@
             <w:r/>
             <w:r>
               <w:rPr/>
-              <w:t>RSI, ADX, MACD histogram, VWAP, relative volume.</w:t>
+              <w:t xml:space="preserve">The artifact's own OOS IC, plus the live monitor over </w:t>
+            </w:r>
+            <w:r>
+              <w:rPr>
+                <w:rFonts w:ascii="Consolas" w:hAnsi="Consolas"/>
+                <w:color w:val="334455"/>
+                <w:sz w:val="19"/>
+              </w:rPr>
+              <w:t>rec_journal.db</w:t>
             </w:r>
           </w:p>
         </w:tc>
@@ -23246,10 +23322,8 @@
           <w:p>
             <w:r/>
             <w:r>
-              <w:rPr>
-                <w:b/>
-              </w:rPr>
-              <w:t>Sector</w:t>
+              <w:rPr/>
+              <w:t>History</w:t>
             </w:r>
           </w:p>
         </w:tc>
@@ -23261,37 +23335,7 @@
             <w:r/>
             <w:r>
               <w:rPr/>
-              <w:t>Sector strength, as a signed adjustment.</w:t>
-            </w:r>
-          </w:p>
-        </w:tc>
-      </w:tr>
-      <w:tr>
-        <w:tc>
-          <w:tcPr>
-            <w:tcW w:type="dxa" w:w="4320"/>
-            <w:shd w:val="clear" w:color="auto" w:fill="F4F6FA"/>
-          </w:tcPr>
-          <w:p>
-            <w:r/>
-            <w:r>
-              <w:rPr>
-                <w:b/>
-              </w:rPr>
-              <w:t>Fundamentals</w:t>
-            </w:r>
-          </w:p>
-        </w:tc>
-        <w:tc>
-          <w:tcPr>
-            <w:tcW w:type="dxa" w:w="4320"/>
-            <w:shd w:val="clear" w:color="auto" w:fill="F4F6FA"/>
-          </w:tcPr>
-          <w:p>
-            <w:r/>
-            <w:r>
-              <w:rPr/>
-              <w:t>P/E, PEG, revenue and EPS growth, ROE, margin direction.</w:t>
+              <w:t>This symbol's journalled reads, labelled once their 20 days elapse</w:t>
             </w:r>
           </w:p>
         </w:tc>
@@ -23299,64 +23343,12 @@
     </w:tbl>
     <w:p/>
     <w:p>
-      <w:r>
-        <w:rPr>
-          <w:b/>
-        </w:rPr>
-        <w:t>Deep Dive</w:t>
-      </w:r>
-      <w:r>
-        <w:rPr/>
-        <w:t xml:space="preserve"> opens a full standalone report in a new tab — technicals, fundamentals and</w:t>
-        <w:br/>
-        <w:t>short interest, plus options analytics (at-the-money IV, implied move, max pain, 25-delta</w:t>
-        <w:br/>
-        <w:t>skew, IV term structure, 30-day constant-maturity IV, net GEX and flip, open-interest</w:t>
-        <w:br/>
-        <w:t xml:space="preserve">walls) and an IV/RV rank. </w:t>
-      </w:r>
-      <w:r>
-        <w:rPr>
-          <w:b/>
-        </w:rPr>
-        <w:t>AI Query</w:t>
-      </w:r>
-      <w:r>
-        <w:rPr/>
-        <w:t xml:space="preserve"> opens the same digest formatted as a chat prompt</w:t>
-        <w:br/>
-        <w:t>you can copy into an AI assistant — it makes no API call itself.</w:t>
-      </w:r>
-    </w:p>
-    <w:p>
       <w:pPr>
         <w:pStyle w:val="Heading3"/>
       </w:pPr>
       <w:r>
         <w:rPr/>
-        <w:t>Why it matters</w:t>
-      </w:r>
-    </w:p>
-    <w:p>
-      <w:r>
-        <w:rPr/>
-        <w:t>The honesty of the Position verdict is what sets it apart. Most retail scoring systems</w:t>
-        <w:br/>
-        <w:t>are hand-tuned and never tested; this one publishes its own out-of-sample accuracy, so</w:t>
-        <w:br/>
-        <w:t>you can see how much to trust it. An expected excess return of +1.3% with a 52% hit rate</w:t>
-        <w:br/>
-        <w:t xml:space="preserve">is a </w:t>
-      </w:r>
-      <w:r>
-        <w:rPr>
-          <w:b/>
-        </w:rPr>
-        <w:t>small</w:t>
-      </w:r>
-      <w:r>
-        <w:rPr/>
-        <w:t xml:space="preserve"> edge, and the page says so plainly rather than dressing it up.</w:t>
+        <w:t>Reading the screen</w:t>
       </w:r>
     </w:p>
     <w:p>
@@ -23368,42 +23360,56 @@
         <w:rPr>
           <w:b/>
         </w:rPr>
-        <w:t>excess-versus-S&amp;P</w:t>
-      </w:r>
-      <w:r>
-        <w:rPr/>
-        <w:t xml:space="preserve"> framing is the right one and is frequently missed elsewhere: a</w:t>
-        <w:br/>
-        <w:t>stock returning +3% in a month the index returned +5% has lost you money in</w:t>
-        <w:br/>
-        <w:t>opportunity terms.</w:t>
-      </w:r>
-    </w:p>
-    <w:p>
-      <w:r>
-        <w:rPr>
-          <w:b/>
-        </w:rPr>
-        <w:t>Where it is weak.</w:t>
-      </w:r>
-      <w:r>
-        <w:rPr/>
-        <w:t xml:space="preserve"> Fundamentals come from the broker's instrument data and are</w:t>
-        <w:br/>
-        <w:t>sometimes stale or odd — negative P/E on unprofitable companies, extreme PEG values.</w:t>
-        <w:br/>
-        <w:t>Read the fundamentals card as indicative. The model is also cross-sectional, so it ranks</w:t>
-        <w:br/>
-      </w:r>
-      <w:r>
-        <w:rPr>
-          <w:i/>
-        </w:rPr>
-        <w:t>relative</w:t>
-      </w:r>
-      <w:r>
-        <w:rPr/>
-        <w:t xml:space="preserve"> to the universe; in a falling market the top-ranked stock still falls.</w:t>
+        <w:t>contribution bar</w:t>
+      </w:r>
+      <w:r>
+        <w:rPr/>
+        <w:t xml:space="preserve"> is the same centred language as the Investor factors: right</w:t>
+        <w:br/>
+        <w:t>of the axis is a positive contribution to the composite, left negative, and the</w:t>
+        <w:br/>
+        <w:t>foot of the table is their weighted sum.</w:t>
+      </w:r>
+    </w:p>
+    <w:p>
+      <w:r>
+        <w:rPr/>
+        <w:t xml:space="preserve">⚠ </w:t>
+      </w:r>
+      <w:r>
+        <w:rPr>
+          <w:b/>
+        </w:rPr>
+        <w:t>The two right-hand cards are not the same question.</w:t>
+      </w:r>
+      <w:r>
+        <w:rPr/>
+        <w:t xml:space="preserve"> Track record is about the</w:t>
+        <w:br/>
+        <w:t>MODEL across every symbol; history is about THIS symbol. Five reads of one name</w:t>
+        <w:br/>
+        <w:t xml:space="preserve">cannot support a correlation, so the history is a list of outcomes with </w:t>
+      </w:r>
+      <w:r>
+        <w:rPr>
+          <w:rFonts w:ascii="Consolas" w:hAnsi="Consolas"/>
+          <w:color w:val="334455"/>
+          <w:sz w:val="19"/>
+        </w:rPr>
+        <w:t>pending</w:t>
+      </w:r>
+      <w:r>
+        <w:rPr/>
+        <w:br/>
+        <w:t>where the horizon has not elapsed - never a statistic.</w:t>
+      </w:r>
+    </w:p>
+    <w:p>
+      <w:r>
+        <w:rPr/>
+        <w:t>The amber callout states what share of the model's weight sits on volatility</w:t>
+        <w:br/>
+        <w:t>factors. Read it before reading the table.</w:t>
       </w:r>
     </w:p>
     <w:p>
@@ -23412,25 +23418,15 @@
       </w:pPr>
       <w:r>
         <w:rPr/>
-        <w:t>When to use it</w:t>
-      </w:r>
-    </w:p>
-    <w:p>
-      <w:r>
-        <w:rPr/>
-        <w:t xml:space="preserve">Before taking a directional options position, and when </w:t>
-      </w:r>
-      <w:r>
-        <w:rPr>
-          <w:color w:val="2E6DB4"/>
-        </w:rPr>
-        <w:t>Momentum</w:t>
-      </w:r>
-      <w:r>
-        <w:rPr/>
-        <w:t xml:space="preserve"> surfaces a</w:t>
-        <w:br/>
-        <w:t>name you do not know.</w:t>
+        <w:t>When to open it</w:t>
+      </w:r>
+    </w:p>
+    <w:p>
+      <w:r>
+        <w:rPr/>
+        <w:t>Before acting on a Position read you intend to size, and any time the verdict</w:t>
+        <w:br/>
+        <w:t>surprises you.</w:t>
       </w:r>
     </w:p>
     <w:p>
@@ -23447,7 +23443,7 @@
         <w:rPr>
           <w:color w:val="2E6DB4"/>
         </w:rPr>
-        <w:t>Momentum</w:t>
+        <w:t>Overview</w:t>
       </w:r>
       <w:r>
         <w:rPr/>
@@ -23457,18 +23453,7 @@
         <w:rPr>
           <w:color w:val="2E6DB4"/>
         </w:rPr>
-        <w:t>Strategy Finder</w:t>
-      </w:r>
-      <w:r>
-        <w:rPr/>
-        <w:t xml:space="preserve"> (how to express the view) ·</w:t>
-        <w:br/>
-      </w:r>
-      <w:r>
-        <w:rPr>
-          <w:color w:val="2E6DB4"/>
-        </w:rPr>
-        <w:t>Expected Move</w:t>
+        <w:t>Trade Plan</w:t>
       </w:r>
       <w:r>
         <w:rPr/>
@@ -23486,7 +23471,7 @@
       </w:pPr>
       <w:r>
         <w:rPr/>
-        <w:t>Claude Trades</w:t>
+        <w:t>Rank Board</w:t>
       </w:r>
     </w:p>
     <w:p>
@@ -23494,7 +23479,7 @@
         <w:rPr>
           <w:i/>
         </w:rPr>
-        <w:t xml:space="preserve">Menu: STRATEGY → Claude Trades · Route </w:t>
+        <w:t xml:space="preserve">Menu: STRATEGY → Trade Analyzer → Rank Board · Route </w:t>
       </w:r>
       <w:r>
         <w:rPr>
@@ -23502,7 +23487,7 @@
           <w:color w:val="334455"/>
           <w:sz w:val="19"/>
         </w:rPr>
-        <w:t>/driver</w:t>
+        <w:t>/trade/board</w:t>
       </w:r>
     </w:p>
     <w:p>
@@ -23517,33 +23502,33 @@
     <w:p>
       <w:r>
         <w:rPr/>
-        <w:t xml:space="preserve">An </w:t>
-      </w:r>
-      <w:r>
-        <w:rPr>
-          <w:b/>
-        </w:rPr>
-        <w:t>autonomous paper options trader</w:t>
-      </w:r>
-      <w:r>
-        <w:rPr/>
-        <w:t>. Claude selects and sizes defined-risk credit</w:t>
-        <w:br/>
-        <w:t>spreads from the scanner's output; code-enforced guardrails cap the risk. This page</w:t>
-        <w:br/>
-        <w:t>monitors it and can stop it.</w:t>
-      </w:r>
-    </w:p>
-    <w:p>
-      <w:r>
-        <w:rPr>
-          <w:b/>
-        </w:rPr>
-        <w:t>Nothing is ever sent to Schwab.</w:t>
-      </w:r>
-      <w:r>
-        <w:rPr/>
-        <w:t xml:space="preserve"> It trades its own isolated paper book.</w:t>
+        <w:t xml:space="preserve">The same swing model as </w:t>
+      </w:r>
+      <w:r>
+        <w:rPr>
+          <w:color w:val="2E6DB4"/>
+        </w:rPr>
+        <w:t>Overview</w:t>
+      </w:r>
+      <w:r>
+        <w:rPr/>
+        <w:t xml:space="preserve">, run over </w:t>
+      </w:r>
+      <w:r>
+        <w:rPr>
+          <w:b/>
+        </w:rPr>
+        <w:t>every name in the</w:t>
+        <w:br/>
+        <w:t>model's universe at once</w:t>
+      </w:r>
+      <w:r>
+        <w:rPr/>
+        <w:t xml:space="preserve"> and sorted. Analyze answers "what about this stock?"; the</w:t>
+        <w:br/>
+        <w:t>Rank Board answers "of everything the model can see, what is best and worst today?" —</w:t>
+        <w:br/>
+        <w:t>the shortlist you start from rather than the verdict you end on.</w:t>
       </w:r>
     </w:p>
     <w:p>
@@ -23627,11 +23612,11 @@
                 <w:color w:val="334455"/>
                 <w:sz w:val="19"/>
               </w:rPr>
-              <w:t>driver_svc</w:t>
-            </w:r>
-            <w:r>
-              <w:rPr/>
-              <w:t xml:space="preserve"> (:8214) decides; </w:t>
+              <w:t>trade_svc</w:t>
+            </w:r>
+            <w:r>
+              <w:rPr/>
+              <w:t xml:space="preserve"> (:8213), </w:t>
             </w:r>
             <w:r>
               <w:rPr>
@@ -23639,11 +23624,7 @@
                 <w:color w:val="334455"/>
                 <w:sz w:val="19"/>
               </w:rPr>
-              <w:t>options_svc</w:t>
-            </w:r>
-            <w:r>
-              <w:rPr/>
-              <w:t xml:space="preserve"> (:8211) executes into the isolated book</w:t>
+              <w:t>cache:trade:rank_board</w:t>
             </w:r>
           </w:p>
         </w:tc>
@@ -23658,7 +23639,7 @@
             <w:r/>
             <w:r>
               <w:rPr/>
-              <w:t>Cache keys</w:t>
+              <w:t>Trigger</w:t>
             </w:r>
           </w:p>
         </w:tc>
@@ -23670,48 +23651,18 @@
           <w:p>
             <w:r/>
             <w:r>
-              <w:rPr>
-                <w:rFonts w:ascii="Consolas" w:hAnsi="Consolas"/>
-                <w:color w:val="334455"/>
-                <w:sz w:val="19"/>
-              </w:rPr>
-              <w:t>cache:driver:autonomous</w:t>
-            </w:r>
-            <w:r>
-              <w:rPr/>
-              <w:t xml:space="preserve">, </w:t>
-            </w:r>
-            <w:r>
-              <w:rPr>
-                <w:rFonts w:ascii="Consolas" w:hAnsi="Consolas"/>
-                <w:color w:val="334455"/>
-                <w:sz w:val="19"/>
-              </w:rPr>
-              <w:t>:control</w:t>
-            </w:r>
-            <w:r>
-              <w:rPr/>
-              <w:t xml:space="preserve">, </w:t>
-            </w:r>
-            <w:r>
-              <w:rPr>
-                <w:rFonts w:ascii="Consolas" w:hAnsi="Consolas"/>
-                <w:color w:val="334455"/>
-                <w:sz w:val="19"/>
-              </w:rPr>
-              <w:t>cache:options:driver_paper_account</w:t>
-            </w:r>
-            <w:r>
-              <w:rPr/>
-              <w:t xml:space="preserve">, </w:t>
-            </w:r>
-            <w:r>
-              <w:rPr>
-                <w:rFonts w:ascii="Consolas" w:hAnsi="Consolas"/>
-                <w:color w:val="334455"/>
-                <w:sz w:val="19"/>
-              </w:rPr>
-              <w:t>:driver_paper_perf</w:t>
+              <w:rPr/>
+              <w:t xml:space="preserve">Rebuilt from the daily universe snapshot; </w:t>
+            </w:r>
+            <w:r>
+              <w:rPr>
+                <w:b/>
+              </w:rPr>
+              <w:t>Rebuild</w:t>
+            </w:r>
+            <w:r>
+              <w:rPr/>
+              <w:t xml:space="preserve"> forces it</w:t>
             </w:r>
           </w:p>
         </w:tc>
@@ -23725,7 +23676,7 @@
             <w:r/>
             <w:r>
               <w:rPr/>
-              <w:t>Checkpoints</w:t>
+              <w:t>Scoring</w:t>
             </w:r>
           </w:p>
         </w:tc>
@@ -23737,51 +23688,17 @@
             <w:r/>
             <w:r>
               <w:rPr/>
-              <w:t xml:space="preserve">09:28 ET morning run, then every 30 minutes within the entry window </w:t>
-            </w:r>
-            <w:r>
-              <w:rPr>
-                <w:b/>
-              </w:rPr>
-              <w:t>09:45–15:30 ET</w:t>
-            </w:r>
-          </w:p>
-        </w:tc>
-      </w:tr>
-      <w:tr>
-        <w:tc>
-          <w:tcPr>
-            <w:tcW w:type="dxa" w:w="4320"/>
-            <w:shd w:val="clear" w:color="auto" w:fill="F4F6FA"/>
-          </w:tcPr>
-          <w:p>
-            <w:r/>
-            <w:r>
-              <w:rPr/>
-              <w:t>Re-pricing</w:t>
-            </w:r>
-          </w:p>
-        </w:tc>
-        <w:tc>
-          <w:tcPr>
-            <w:tcW w:type="dxa" w:w="4320"/>
-            <w:shd w:val="clear" w:color="auto" w:fill="F4F6FA"/>
-          </w:tcPr>
-          <w:p>
-            <w:r/>
-            <w:r>
-              <w:rPr/>
-              <w:t xml:space="preserve">Open positions re-priced </w:t>
-            </w:r>
-            <w:r>
-              <w:rPr>
-                <w:b/>
-              </w:rPr>
-              <w:t>every minute</w:t>
-            </w:r>
-            <w:r>
-              <w:rPr/>
-              <w:t xml:space="preserve"> during market hours</w:t>
+              <w:t xml:space="preserve">The </w:t>
+            </w:r>
+            <w:r>
+              <w:rPr>
+                <w:i/>
+              </w:rPr>
+              <w:t>same</w:t>
+            </w:r>
+            <w:r>
+              <w:rPr/>
+              <w:t xml:space="preserve"> scorer the Analyze card uses — one code path, so the two can never disagree about a symbol</w:t>
             </w:r>
           </w:p>
         </w:tc>
@@ -23789,32 +23706,6 @@
     </w:tbl>
     <w:p/>
     <w:p>
-      <w:r>
-        <w:rPr>
-          <w:b/>
-        </w:rPr>
-        <w:t>Why the entry window is shaped that way.</w:t>
-      </w:r>
-      <w:r>
-        <w:rPr/>
-        <w:t xml:space="preserve"> The first ~15 minutes after the open are</w:t>
-        <w:br/>
-        <w:t xml:space="preserve">skipped so the post-open structure is readable, and no </w:t>
-      </w:r>
-      <w:r>
-        <w:rPr>
-          <w:i/>
-        </w:rPr>
-        <w:t>new</w:t>
-      </w:r>
-      <w:r>
-        <w:rPr/>
-        <w:t xml:space="preserve"> entries are taken in the</w:t>
-        <w:br/>
-        <w:t>last 30 minutes before the close. Management and exits are unaffected.</w:t>
-      </w:r>
-    </w:p>
-    <w:p>
       <w:pPr>
         <w:pStyle w:val="Heading3"/>
       </w:pPr>
@@ -23828,273 +23719,151 @@
         <w:rPr>
           <w:b/>
         </w:rPr>
-        <w:t>Status row:</w:t>
-      </w:r>
-      <w:r>
-        <w:rPr/>
-        <w:t xml:space="preserve"> whether autonomy is ACTIVE, the last cycle time, and three controls —</w:t>
-        <w:br/>
-      </w:r>
-      <w:r>
-        <w:rPr>
-          <w:b/>
-        </w:rPr>
-        <w:t>Autonomous</w:t>
-      </w:r>
-      <w:r>
-        <w:rPr/>
-        <w:t xml:space="preserve"> (enable/disable), </w:t>
-      </w:r>
-      <w:r>
-        <w:rPr>
-          <w:b/>
-        </w:rPr>
-        <w:t>Run now</w:t>
-      </w:r>
-      <w:r>
-        <w:rPr/>
-        <w:t xml:space="preserve"> (one immediate checkpoint) and a</w:t>
-        <w:br/>
-        <w:t xml:space="preserve">confirm-gated </w:t>
-      </w:r>
-      <w:r>
-        <w:rPr>
-          <w:b/>
-        </w:rPr>
-        <w:t>STOP</w:t>
-      </w:r>
-      <w:r>
-        <w:rPr/>
-        <w:t xml:space="preserve"> (halts new trades for the day; open positions keep managing).</w:t>
-      </w:r>
-    </w:p>
-    <w:p>
-      <w:r>
-        <w:rPr>
-          <w:b/>
-        </w:rPr>
-        <w:t>Tiles:</w:t>
-      </w:r>
-      <w:r>
-        <w:rPr/>
-        <w:t xml:space="preserve"> Day P&amp;L against the day's target · Session P&amp;L · Realized · Open P&amp;L ·</w:t>
-        <w:br/>
-        <w:t>Equity · Open count.</w:t>
+        <w:t>Deciles are today's ranking, not a historical grade.</w:t>
+      </w:r>
+      <w:r>
+        <w:rPr/>
+        <w:t xml:space="preserve"> A name in decile 10 is</w:t>
+        <w:br/>
+        <w:t xml:space="preserve">the best of </w:t>
+      </w:r>
+      <w:r>
+        <w:rPr>
+          <w:i/>
+        </w:rPr>
+        <w:t>this</w:t>
+      </w:r>
+      <w:r>
+        <w:rPr/>
+        <w:t xml:space="preserve"> cross-section right now. That is a different question from the</w:t>
+        <w:br/>
+        <w:t>calibration band shown on the Analyze card, which asks where the score sat against</w:t>
+        <w:br/>
+        <w:t>five years — a universe where every name is mid-band still has a best and a worst.</w:t>
+      </w:r>
+    </w:p>
+    <w:p>
+      <w:r>
+        <w:rPr>
+          <w:b/>
+        </w:rPr>
+        <w:t>Long candidates / Short candidates</w:t>
+      </w:r>
+      <w:r>
+        <w:rPr/>
+        <w:t xml:space="preserve"> are the top and bottom deciles. Each carries a</w:t>
+        <w:br/>
+        <w:t>note explaining its own state, because a thin short list has three quite different</w:t>
+        <w:br/>
+        <w:t>causes:</w:t>
       </w:r>
     </w:p>
     <w:p>
       <w:pPr>
-        <w:pStyle w:val="IntenseQuote"/>
+        <w:pStyle w:val="ListBullet"/>
       </w:pPr>
       <w:r>
         <w:rPr>
-          <w:b/>
-        </w:rPr>
-        <w:t>The daily target is dynamic.</w:t>
-      </w:r>
-      <w:r>
-        <w:rPr/>
-        <w:t xml:space="preserve"> The base is </w:t>
-      </w:r>
-      <w:r>
-        <w:rPr>
-          <w:b/>
-        </w:rPr>
-        <w:t>$500</w:t>
-      </w:r>
-      <w:r>
-        <w:rPr/>
-        <w:t>, but it ratchets against the</w:t>
-        <w:br/>
-        <w:t xml:space="preserve">month-to-date pace — up to a </w:t>
-      </w:r>
-      <w:r>
-        <w:rPr>
-          <w:b/>
-        </w:rPr>
-        <w:t>$1,000</w:t>
-      </w:r>
-      <w:r>
-        <w:rPr/>
-        <w:t xml:space="preserve"> cap when behind, down to a </w:t>
-      </w:r>
-      <w:r>
-        <w:rPr>
-          <w:b/>
-        </w:rPr>
-        <w:t>$250</w:t>
-      </w:r>
-      <w:r>
-        <w:rPr/>
-        <w:t xml:space="preserve"> floor when</w:t>
-        <w:br/>
-        <w:t xml:space="preserve">ahead. So the number in the tile changes day to day. A </w:t>
-      </w:r>
-      <w:r>
-        <w:rPr>
-          <w:b/>
-        </w:rPr>
-        <w:t>−$1,500</w:t>
-      </w:r>
-      <w:r>
-        <w:rPr/>
-        <w:t xml:space="preserve"> daily loss halts new</w:t>
-        <w:br/>
-        <w:t>entries outright.</w:t>
-      </w:r>
-    </w:p>
-    <w:p>
-      <w:r>
-        <w:rPr>
-          <w:b/>
-        </w:rPr>
-        <w:t>Open positions</w:t>
-      </w:r>
-      <w:r>
-        <w:rPr/>
-        <w:t xml:space="preserve"> and a </w:t>
-      </w:r>
-      <w:r>
-        <w:rPr>
-          <w:b/>
-        </w:rPr>
-        <w:t>decision log</w:t>
-      </w:r>
-      <w:r>
-        <w:rPr/>
-        <w:t xml:space="preserve"> (newest first, in CT) showing each checkpoint's</w:t>
-        <w:br/>
-        <w:t>reasoning, including a one-line market-context summary.</w:t>
-      </w:r>
-    </w:p>
-    <w:p>
-      <w:r>
-        <w:rPr>
-          <w:b/>
-        </w:rPr>
-        <w:t>Performance scorecard:</w:t>
-      </w:r>
-      <w:r>
-        <w:rPr/>
-        <w:t xml:space="preserve"> trades, open, closed, </w:t>
-      </w:r>
-      <w:r>
-        <w:rPr>
-          <w:b/>
-        </w:rPr>
-        <w:t>win rate</w:t>
-      </w:r>
-      <w:r>
-        <w:rPr/>
-        <w:t>, realized, open P&amp;L, total</w:t>
-        <w:br/>
-        <w:t xml:space="preserve">P&amp;L, </w:t>
-      </w:r>
-      <w:r>
-        <w:rPr>
-          <w:b/>
-        </w:rPr>
-        <w:t>average win</w:t>
-      </w:r>
-      <w:r>
-        <w:rPr/>
-        <w:t xml:space="preserve">, </w:t>
-      </w:r>
-      <w:r>
-        <w:rPr>
-          <w:b/>
-        </w:rPr>
-        <w:t>average loss</w:t>
-      </w:r>
-      <w:r>
-        <w:rPr/>
-        <w:t xml:space="preserve">, </w:t>
-      </w:r>
-      <w:r>
-        <w:rPr>
-          <w:b/>
-        </w:rPr>
-        <w:t>profit factor</w:t>
-      </w:r>
-      <w:r>
-        <w:rPr/>
-        <w:t>, best and worst trade, plus</w:t>
-        <w:br/>
-        <w:t xml:space="preserve">breakdowns of </w:t>
-      </w:r>
-      <w:r>
-        <w:rPr>
-          <w:b/>
-        </w:rPr>
-        <w:t>P&amp;L by symbol</w:t>
-      </w:r>
-      <w:r>
-        <w:rPr/>
-        <w:t xml:space="preserve"> and </w:t>
-      </w:r>
-      <w:r>
-        <w:rPr>
-          <w:b/>
-        </w:rPr>
-        <w:t>by strategy</w:t>
-      </w:r>
-      <w:r>
-        <w:rPr/>
-        <w:t>.</w:t>
-      </w:r>
-    </w:p>
-    <w:p>
-      <w:r>
-        <w:rPr>
-          <w:b/>
-        </w:rPr>
-        <w:t>Performance view:</w:t>
-      </w:r>
-      <w:r>
-        <w:rPr/>
-        <w:t xml:space="preserve"> the closed-trade list with exit reasons — </w:t>
-      </w:r>
-      <w:r>
-        <w:rPr>
           <w:i/>
         </w:rPr>
-        <w:t>Target hit</w:t>
-      </w:r>
-      <w:r>
-        <w:rPr/>
-        <w:t xml:space="preserve">, </w:t>
-      </w:r>
+        <w:t>"Express these RELATIVE…"</w:t>
+      </w:r>
+      <w:r>
+        <w:t xml:space="preserve"> — the tape has not cleared the short side. The model</w:t>
+        <w:br/>
+        <w:t xml:space="preserve">  predicts </w:t>
+      </w:r>
+      <w:r>
+        <w:rPr>
+          <w:b/>
+        </w:rPr>
+        <w:t>excess return versus SPY</w:t>
+      </w:r>
+      <w:r>
+        <w:t>, so a bottom-decile name in an uptrend is</w:t>
+        <w:br/>
+        <w:t xml:space="preserve">  predicted to </w:t>
+      </w:r>
+      <w:r>
+        <w:rPr>
+          <w:b/>
+        </w:rPr>
+        <w:t>lag</w:t>
+      </w:r>
+      <w:r>
+        <w:t>, not to fall. Pair it against the index rather than shorting it</w:t>
+        <w:br/>
+        <w:t xml:space="preserve">  outright.</w:t>
+      </w:r>
+    </w:p>
+    <w:p>
+      <w:pPr>
+        <w:pStyle w:val="ListBullet"/>
+      </w:pPr>
       <w:r>
         <w:rPr>
           <w:i/>
         </w:rPr>
-        <w:t>Delta</w:t>
-        <w:br/>
-        <w:t>stop</w:t>
-      </w:r>
-      <w:r>
-        <w:rPr/>
-        <w:t xml:space="preserve">, </w:t>
-      </w:r>
+        <w:t>"Too few names in today's cross-section…"</w:t>
+      </w:r>
+      <w:r>
+        <w:t xml:space="preserve"> — a sample-size limit, not a reading of</w:t>
+        <w:br/>
+        <w:t xml:space="preserve">  the market. With fewer than ten names there is no bottom decile to speak of.</w:t>
+      </w:r>
+    </w:p>
+    <w:p>
+      <w:pPr>
+        <w:pStyle w:val="ListBullet"/>
+      </w:pPr>
       <w:r>
         <w:rPr>
           <w:i/>
         </w:rPr>
-        <w:t>Time stop</w:t>
-      </w:r>
-      <w:r>
-        <w:rPr/>
-        <w:t xml:space="preserve">, </w:t>
+        <w:t>"Directional expression is cleared"</w:t>
+      </w:r>
+      <w:r>
+        <w:t xml:space="preserve"> — the tape permits the trade as stated.</w:t>
+      </w:r>
+    </w:p>
+    <w:p>
+      <w:r>
+        <w:rPr>
+          <w:b/>
+        </w:rPr>
+        <w:t>Gates mark rows; they never remove them.</w:t>
+      </w:r>
+      <w:r>
+        <w:rPr/>
+        <w:t xml:space="preserve"> A gated row stays visible with its reasons,</w:t>
+        <w:br/>
+        <w:t>because "the top-ranked name reports earnings in two days" is exactly what you opened</w:t>
+        <w:br/>
+        <w:t xml:space="preserve">the board to find out. The line beneath the header names </w:t>
+      </w:r>
+      <w:r>
+        <w:rPr>
+          <w:b/>
+        </w:rPr>
+        <w:t>which</w:t>
+      </w:r>
+      <w:r>
+        <w:rPr/>
+        <w:t xml:space="preserve"> gates were checked</w:t>
+        <w:br/>
+        <w:t xml:space="preserve">here — the board evaluates a </w:t>
       </w:r>
       <w:r>
         <w:rPr>
           <w:i/>
         </w:rPr>
-        <w:t>Money stop</w:t>
-      </w:r>
-      <w:r>
-        <w:rPr/>
-        <w:t>.</w:t>
+        <w:t>subset</w:t>
+      </w:r>
+      <w:r>
+        <w:rPr/>
+        <w:t xml:space="preserve"> of the Analyze card's, so a row with no gates has</w:t>
+        <w:br/>
+        <w:t>not cleared everything the card would test.</w:t>
       </w:r>
     </w:p>
     <w:p>
@@ -24103,111 +23872,40 @@
       </w:pPr>
       <w:r>
         <w:rPr/>
-        <w:t>How the guardrails work</w:t>
-      </w:r>
-    </w:p>
-    <w:p>
-      <w:r>
-        <w:rPr/>
-        <w:t>This is the part worth understanding, because it is what makes the design defensible:</w:t>
-        <w:br/>
-      </w:r>
-      <w:r>
-        <w:rPr>
-          <w:b/>
-        </w:rPr>
-        <w:t>the model never sizes its own risk.</w:t>
-      </w:r>
-      <w:r>
-        <w:rPr/>
-        <w:t xml:space="preserve"> The cycle is</w:t>
-      </w:r>
-    </w:p>
-    <w:p>
-      <w:pPr>
-        <w:pStyle w:val="ListNumber"/>
-      </w:pPr>
-      <w:r>
-        <w:rPr>
-          <w:rFonts w:ascii="Consolas" w:hAnsi="Consolas"/>
-          <w:color w:val="334455"/>
-          <w:sz w:val="19"/>
-        </w:rPr>
-        <w:t>build_packet</w:t>
-      </w:r>
-      <w:r>
-        <w:t xml:space="preserve"> — assemble market context, candidates and account state;</w:t>
-      </w:r>
-    </w:p>
-    <w:p>
-      <w:pPr>
-        <w:pStyle w:val="ListNumber"/>
-      </w:pPr>
-      <w:r>
-        <w:rPr>
-          <w:rFonts w:ascii="Consolas" w:hAnsi="Consolas"/>
-          <w:color w:val="334455"/>
-          <w:sz w:val="19"/>
-        </w:rPr>
-        <w:t>decider.decide</w:t>
-      </w:r>
-      <w:r>
-        <w:t xml:space="preserve"> — Claude picks a candidate and proposes a size;</w:t>
-      </w:r>
-    </w:p>
-    <w:p>
-      <w:pPr>
-        <w:pStyle w:val="ListNumber"/>
-      </w:pPr>
-      <w:r>
-        <w:rPr>
-          <w:rFonts w:ascii="Consolas" w:hAnsi="Consolas"/>
-          <w:color w:val="334455"/>
-          <w:sz w:val="19"/>
-        </w:rPr>
-        <w:t>guardrails.apply_guardrails</w:t>
-      </w:r>
-      <w:r>
-        <w:t xml:space="preserve"> — </w:t>
-      </w:r>
-      <w:r>
-        <w:rPr>
-          <w:b/>
-        </w:rPr>
-        <w:t>pure code</w:t>
-      </w:r>
-      <w:r>
-        <w:t xml:space="preserve"> clamps the size and halts on the banked</w:t>
-        <w:br/>
-        <w:t xml:space="preserve">   target, the loss cap, or a VIX threshold;</w:t>
-      </w:r>
-    </w:p>
-    <w:p>
-      <w:pPr>
-        <w:pStyle w:val="ListNumber"/>
-      </w:pPr>
-      <w:r>
-        <w:t>the clamped order is enqueued to the paper book.</w:t>
-      </w:r>
-    </w:p>
-    <w:p>
-      <w:r>
-        <w:rPr/>
-        <w:t xml:space="preserve">Step 3 cannot be argued with by the model. Per-trade risk is evaluated in </w:t>
-      </w:r>
-      <w:r>
-        <w:rPr>
-          <w:b/>
-        </w:rPr>
-        <w:t>per-contract</w:t>
-        <w:br/>
-        <w:t>dollars</w:t>
-      </w:r>
-      <w:r>
-        <w:rPr/>
-        <w:t>, and the driver's own book carries a higher per-trade cap ($1,500) than the</w:t>
-        <w:br/>
-        <w:t>manual account ($250).</w:t>
+        <w:t>⚠ What the ranking is actually sorted by</w:t>
+      </w:r>
+    </w:p>
+    <w:p>
+      <w:r>
+        <w:rPr/>
+        <w:t xml:space="preserve">An amber line states what share of the model's weight sits on </w:t>
+      </w:r>
+      <w:r>
+        <w:rPr>
+          <w:b/>
+        </w:rPr>
+        <w:t>volatility factors</w:t>
+      </w:r>
+      <w:r>
+        <w:rPr/>
+        <w:t xml:space="preserve"> —</w:t>
+        <w:br/>
+        <w:t>currently about half. That matters more here than anywhere else in the app: it means</w:t>
+        <w:br/>
+      </w:r>
+      <w:r>
+        <w:rPr>
+          <w:b/>
+        </w:rPr>
+        <w:t>the top of this board is the high-beta end of the universe</w:t>
+      </w:r>
+      <w:r>
+        <w:rPr/>
+        <w:t>. Measured over five</w:t>
+        <w:br/>
+        <w:t>years, this ordering works when the market rises and inverts when it falls. Treat the</w:t>
+        <w:br/>
+        <w:t>board as a starting shortlist to research, never as a ranked buy list.</w:t>
       </w:r>
     </w:p>
     <w:p>
@@ -24216,330 +23914,19 @@
       </w:pPr>
       <w:r>
         <w:rPr/>
-        <w:t>Why it matters</w:t>
-      </w:r>
-    </w:p>
-    <w:p>
-      <w:r>
-        <w:rPr/>
-        <w:t>As a research instrument this is the most interesting thing in the app: an unbiased,</w:t>
-        <w:br/>
-        <w:t>fully-logged record of what a rules-plus-model system does with the app's own signals.</w:t>
-        <w:br/>
-        <w:t xml:space="preserve">The decision log tells you </w:t>
-      </w:r>
-      <w:r>
-        <w:rPr>
-          <w:i/>
-        </w:rPr>
-        <w:t>why</w:t>
-      </w:r>
-      <w:r>
-        <w:rPr/>
-        <w:t xml:space="preserve"> each trade was taken, which no human trading journal</w:t>
-        <w:br/>
-        <w:t>manages consistently.</w:t>
-      </w:r>
-    </w:p>
-    <w:p>
-      <w:r>
-        <w:rPr>
-          <w:b/>
-        </w:rPr>
-        <w:t>Be clear-eyed about the results.</w:t>
-      </w:r>
-      <w:r>
-        <w:rPr/>
-        <w:t xml:space="preserve"> At the time of writing this book's record is</w:t>
-        <w:br/>
-      </w:r>
-      <w:r>
-        <w:rPr>
-          <w:b/>
-        </w:rPr>
-        <w:t>negative</w:t>
-      </w:r>
-      <w:r>
-        <w:rPr/>
-        <w:t xml:space="preserve">: 151 closed trades, a </w:t>
-      </w:r>
-      <w:r>
-        <w:rPr>
-          <w:b/>
-        </w:rPr>
-        <w:t>45% win rate</w:t>
-      </w:r>
-      <w:r>
-        <w:rPr/>
-        <w:t xml:space="preserve">, a </w:t>
-      </w:r>
-      <w:r>
-        <w:rPr>
-          <w:b/>
-        </w:rPr>
-        <w:t>profit factor of 0.57</w:t>
-      </w:r>
-      <w:r>
-        <w:rPr/>
-        <w:t>, an</w:t>
-        <w:br/>
-        <w:t xml:space="preserve">average win of </w:t>
-      </w:r>
-      <w:r>
-        <w:rPr>
-          <w:b/>
-        </w:rPr>
-        <w:t>+$165</w:t>
-      </w:r>
-      <w:r>
-        <w:rPr/>
-        <w:t xml:space="preserve"> against an average loss of </w:t>
-      </w:r>
-      <w:r>
-        <w:rPr>
-          <w:b/>
-        </w:rPr>
-        <w:t>−$236</w:t>
-      </w:r>
-      <w:r>
-        <w:rPr/>
-        <w:t>, and realized P&amp;L of</w:t>
-        <w:br/>
-        <w:t xml:space="preserve">about </w:t>
-      </w:r>
-      <w:r>
-        <w:rPr>
-          <w:b/>
-        </w:rPr>
-        <w:t>−$8,300</w:t>
-      </w:r>
-      <w:r>
-        <w:rPr/>
-        <w:t>. Put credit spreads account for essentially all of the loss while call</w:t>
-        <w:br/>
-        <w:t>credit spreads are roughly flat.</w:t>
-      </w:r>
-    </w:p>
-    <w:p>
-      <w:r>
-        <w:rPr/>
-        <w:t>That shape — winning less than half the time while losing more per loss than you make</w:t>
-        <w:br/>
-        <w:t>per win — is the classic failure mode for premium selling: the wins are capped at the</w:t>
-        <w:br/>
-        <w:t xml:space="preserve">credit while the losses run to the width. It is </w:t>
-      </w:r>
-      <w:r>
-        <w:rPr>
-          <w:i/>
-        </w:rPr>
-        <w:t>the</w:t>
-      </w:r>
-      <w:r>
-        <w:rPr/>
-        <w:t xml:space="preserve"> thing this page exists to make</w:t>
-        <w:br/>
-        <w:t>visible, and it is a strong argument for treating the driver as an experiment rather</w:t>
-        <w:br/>
-        <w:t>than a strategy.</w:t>
-      </w:r>
-    </w:p>
-    <w:p>
-      <w:pPr>
-        <w:pStyle w:val="Heading3"/>
-      </w:pPr>
-      <w:r>
-        <w:rPr/>
-        <w:t>Caveats and gotchas</w:t>
-      </w:r>
-    </w:p>
-    <w:p>
-      <w:pPr>
-        <w:pStyle w:val="ListBullet"/>
-      </w:pPr>
-      <w:r>
-        <w:rPr>
-          <w:b/>
-        </w:rPr>
-        <w:t>"Executed" in the decision log means the order was enqueued, not filled.</w:t>
-      </w:r>
-      <w:r>
-        <w:t xml:space="preserve"> The true</w:t>
-        <w:br/>
-        <w:t xml:space="preserve">  outcome is in the account view's open results. A trade can be logged as executed and</w:t>
-        <w:br/>
-        <w:t xml:space="preserve">  then rejected for risk.</w:t>
-      </w:r>
-    </w:p>
-    <w:p>
-      <w:pPr>
-        <w:pStyle w:val="ListBullet"/>
-      </w:pPr>
-      <w:r>
-        <w:t xml:space="preserve">Analytics are </w:t>
-      </w:r>
-      <w:r>
-        <w:rPr>
-          <w:b/>
-        </w:rPr>
-        <w:t>forward-only</w:t>
-      </w:r>
-      <w:r>
-        <w:t xml:space="preserve"> — the equity curve is complete, but posture and</w:t>
-        <w:br/>
-        <w:t xml:space="preserve">  MAE/MFE statistics only accrue on trades opened after those were added.</w:t>
-      </w:r>
-    </w:p>
-    <w:p>
-      <w:pPr>
-        <w:pStyle w:val="ListBullet"/>
-      </w:pPr>
-      <w:r>
-        <w:t xml:space="preserve">Enabling autonomy costs Claude API calls per checkpoint. </w:t>
-      </w:r>
-      <w:r>
-        <w:rPr>
-          <w:color w:val="2E6DB4"/>
-        </w:rPr>
-        <w:t>Settings</w:t>
-      </w:r>
-      <w:r>
-        <w:t xml:space="preserve"> shows</w:t>
-        <w:br/>
-        <w:t xml:space="preserve">  the running count.</w:t>
-      </w:r>
-    </w:p>
-    <w:p>
-      <w:pPr>
-        <w:pStyle w:val="Heading3"/>
-      </w:pPr>
-      <w:r>
-        <w:rPr/>
-        <w:t>Related pages</w:t>
-      </w:r>
-    </w:p>
-    <w:p>
-      <w:r>
-        <w:rPr>
-          <w:color w:val="2E6DB4"/>
-        </w:rPr>
-        <w:t>Market Scanner</w:t>
-      </w:r>
-      <w:r>
-        <w:rPr/>
-        <w:t xml:space="preserve"> (its candidate source) · </w:t>
-      </w:r>
-      <w:r>
-        <w:rPr>
-          <w:color w:val="2E6DB4"/>
-        </w:rPr>
-        <w:t>Sentiment</w:t>
-      </w:r>
-      <w:r>
-        <w:rPr/>
-        <w:t xml:space="preserve"> ·</w:t>
-        <w:br/>
-      </w:r>
-      <w:r>
-        <w:rPr>
-          <w:color w:val="2E6DB4"/>
-        </w:rPr>
-        <w:t>Paper Account</w:t>
-      </w:r>
-      <w:r>
-        <w:rPr/>
-        <w:t xml:space="preserve"> · </w:t>
-      </w:r>
-      <w:r>
-        <w:rPr>
-          <w:color w:val="2E6DB4"/>
-        </w:rPr>
-        <w:t>EOD Report</w:t>
-      </w:r>
-      <w:r>
-        <w:rPr/>
-        <w:t>.</w:t>
-      </w:r>
-    </w:p>
-    <w:p>
-      <w:r>
-        <w:br/>
-      </w:r>
-    </w:p>
-    <w:p>
-      <w:pPr>
-        <w:pStyle w:val="Heading1"/>
-      </w:pPr>
-      <w:r>
-        <w:rPr/>
-        <w:t>ACCOUNT</w:t>
-      </w:r>
-    </w:p>
-    <w:p>
-      <w:r>
-        <w:rPr/>
-        <w:t>Two entries: your real holdings, and the day's results.</w:t>
-      </w:r>
-    </w:p>
-    <w:p>
-      <w:pPr>
-        <w:pStyle w:val="Heading2"/>
-      </w:pPr>
-      <w:r>
-        <w:rPr/>
-        <w:t>Portfolio</w:t>
-      </w:r>
-    </w:p>
-    <w:p>
-      <w:r>
-        <w:rPr>
-          <w:i/>
-        </w:rPr>
-        <w:t xml:space="preserve">Menu: ACCOUNT → Portfolio · Route </w:t>
-      </w:r>
-      <w:r>
-        <w:rPr>
-          <w:rFonts w:ascii="Consolas" w:hAnsi="Consolas"/>
-          <w:color w:val="334455"/>
-          <w:sz w:val="19"/>
-        </w:rPr>
-        <w:t>/portfolio</w:t>
-      </w:r>
-    </w:p>
-    <w:p>
-      <w:pPr>
-        <w:pStyle w:val="Heading3"/>
-      </w:pPr>
-      <w:r>
-        <w:rPr/>
-        <w:t>What it is</w:t>
-      </w:r>
-    </w:p>
-    <w:p>
-      <w:r>
-        <w:rPr/>
-        <w:t xml:space="preserve">Your </w:t>
-      </w:r>
-      <w:r>
-        <w:rPr>
-          <w:b/>
-        </w:rPr>
-        <w:t>real</w:t>
-      </w:r>
-      <w:r>
-        <w:rPr/>
-        <w:t xml:space="preserve"> Schwab holdings — the only place in the app where real money appears. It</w:t>
-        <w:br/>
-        <w:t>is strictly read-only; no action on this page can affect your account.</w:t>
-      </w:r>
-    </w:p>
-    <w:p>
-      <w:pPr>
-        <w:pStyle w:val="Heading3"/>
-      </w:pPr>
-      <w:r>
-        <w:rPr/>
-        <w:t>Where the data comes from</w:t>
+        <w:t>The model paper book</w:t>
+      </w:r>
+    </w:p>
+    <w:p>
+      <w:r>
+        <w:rPr/>
+        <w:t>Beneath the board, an isolated paper book follows the board's own pools so the</w:t>
+        <w:br/>
+        <w:t>model accrues a track record nobody has to place. It takes the ungated names</w:t>
+        <w:br/>
+        <w:t>from each pool, applies the Trade Plan's stop, target and 20-trading-day time</w:t>
+        <w:br/>
+        <w:t>stop, and splits its reporting by side.</w:t>
       </w:r>
     </w:p>
     <w:tbl>
@@ -24614,11 +24001,11 @@
                 <w:color w:val="334455"/>
                 <w:sz w:val="19"/>
               </w:rPr>
-              <w:t>portfolio_svc</w:t>
-            </w:r>
-            <w:r>
-              <w:rPr/>
-              <w:t xml:space="preserve"> (:8212), </w:t>
+              <w:t>trade_svc</w:t>
+            </w:r>
+            <w:r>
+              <w:rPr/>
+              <w:t xml:space="preserve">, </w:t>
             </w:r>
             <w:r>
               <w:rPr>
@@ -24626,7 +24013,19 @@
                 <w:color w:val="334455"/>
                 <w:sz w:val="19"/>
               </w:rPr>
-              <w:t>cache:portfolio:positions</w:t>
+              <w:t>cache:trade:model_book</w:t>
+            </w:r>
+            <w:r>
+              <w:rPr/>
+              <w:t xml:space="preserve">, store </w:t>
+            </w:r>
+            <w:r>
+              <w:rPr>
+                <w:rFonts w:ascii="Consolas" w:hAnsi="Consolas"/>
+                <w:color w:val="334455"/>
+                <w:sz w:val="19"/>
+              </w:rPr>
+              <w:t>model_book.db</w:t>
             </w:r>
           </w:p>
         </w:tc>
@@ -24641,7 +24040,7 @@
             <w:r/>
             <w:r>
               <w:rPr/>
-              <w:t>Live P&amp;L</w:t>
+              <w:t>Trigger</w:t>
             </w:r>
           </w:p>
         </w:tc>
@@ -24654,13 +24053,17 @@
             <w:r/>
             <w:r>
               <w:rPr/>
-              <w:t xml:space="preserve">Streamed from Schwab and republished at most every </w:t>
+              <w:t xml:space="preserve">The board's </w:t>
             </w:r>
             <w:r>
               <w:rPr>
                 <w:b/>
               </w:rPr>
-              <w:t>2 seconds</w:t>
+              <w:t>Rebuild</w:t>
+            </w:r>
+            <w:r>
+              <w:rPr/>
+              <w:t xml:space="preserve"> advances it; otherwise it follows the board</w:t>
             </w:r>
           </w:p>
         </w:tc>
@@ -24674,7 +24077,7 @@
             <w:r/>
             <w:r>
               <w:rPr/>
-              <w:t>Full rebuild</w:t>
+              <w:t>Scope</w:t>
             </w:r>
           </w:p>
         </w:tc>
@@ -24685,24 +24088,14 @@
           <w:p>
             <w:r/>
             <w:r>
-              <w:rPr/>
-              <w:t xml:space="preserve">Every </w:t>
-            </w:r>
-            <w:r>
               <w:rPr>
                 <w:b/>
               </w:rPr>
-              <w:t>10 minutes</w:t>
-            </w:r>
-            <w:r>
-              <w:rPr/>
-              <w:t xml:space="preserve"> during market hours (hourly off-hours), or on </w:t>
-            </w:r>
-            <w:r>
-              <w:rPr>
-                <w:b/>
-              </w:rPr>
-              <w:t>Refresh</w:t>
+              <w:t>Paper only</w:t>
+            </w:r>
+            <w:r>
+              <w:rPr/>
+              <w:t>, and isolated from the Claude Trades book</w:t>
             </w:r>
           </w:p>
         </w:tc>
@@ -24710,32 +24103,153 @@
     </w:tbl>
     <w:p/>
     <w:p>
+      <w:r>
+        <w:rPr/>
+        <w:t xml:space="preserve">⚠ Two things about what it measures. It trades the </w:t>
+      </w:r>
+      <w:r>
+        <w:rPr>
+          <w:b/>
+        </w:rPr>
+        <w:t>underlying</w:t>
+      </w:r>
+      <w:r>
+        <w:rPr/>
+        <w:t>, not the</w:t>
+        <w:br/>
+        <w:t>options structure the plan suggests — a spread's theta and vega would swamp the</w:t>
+        <w:br/>
+        <w:t>question of whether the ranking works, so a book that lost money on correct</w:t>
+        <w:br/>
+        <w:t xml:space="preserve">calls would look identical to one whose calls were wrong. And a </w:t>
+      </w:r>
+      <w:r>
+        <w:rPr>
+          <w:b/>
+        </w:rPr>
+        <w:t>relative</w:t>
+      </w:r>
+      <w:r>
+        <w:rPr/>
+        <w:br/>
+        <w:t>short is held as a pair against SPY, because return-versus-the-index is what the</w:t>
+        <w:br/>
+        <w:t>model actually predicts.</w:t>
+      </w:r>
+    </w:p>
+    <w:p>
       <w:pPr>
         <w:pStyle w:val="Heading3"/>
       </w:pPr>
       <w:r>
         <w:rPr/>
-        <w:t>Reading the screen</w:t>
-      </w:r>
-    </w:p>
-    <w:p>
-      <w:r>
-        <w:rPr>
-          <w:b/>
-        </w:rPr>
-        <w:t>Three subtabs: Holdings · Sectors · Performance.</w:t>
-      </w:r>
-    </w:p>
-    <w:p>
-      <w:r>
-        <w:rPr>
-          <w:b/>
-        </w:rPr>
-        <w:t>Holdings</w:t>
-      </w:r>
-      <w:r>
-        <w:rPr/>
-        <w:t xml:space="preserve"> — one row per position:</w:t>
+        <w:t>When to open it</w:t>
+      </w:r>
+    </w:p>
+    <w:p>
+      <w:r>
+        <w:rPr/>
+        <w:t>At the start of a research session, to pick what to analyze. Not as a signal in itself.</w:t>
+      </w:r>
+    </w:p>
+    <w:p>
+      <w:pPr>
+        <w:pStyle w:val="Heading3"/>
+      </w:pPr>
+      <w:r>
+        <w:rPr/>
+        <w:t>Related pages</w:t>
+      </w:r>
+    </w:p>
+    <w:p>
+      <w:r>
+        <w:rPr>
+          <w:color w:val="2E6DB4"/>
+        </w:rPr>
+        <w:t>Overview</w:t>
+      </w:r>
+      <w:r>
+        <w:rPr/>
+        <w:t xml:space="preserve"> (the per-symbol verdict) · </w:t>
+      </w:r>
+      <w:r>
+        <w:rPr>
+          <w:color w:val="2E6DB4"/>
+        </w:rPr>
+        <w:t>Momentum</w:t>
+      </w:r>
+      <w:r>
+        <w:rPr/>
+        <w:t xml:space="preserve"> ·</w:t>
+        <w:br/>
+      </w:r>
+      <w:r>
+        <w:rPr>
+          <w:color w:val="2E6DB4"/>
+        </w:rPr>
+        <w:t>Strategy Finder</w:t>
+      </w:r>
+      <w:r>
+        <w:rPr/>
+        <w:t>.</w:t>
+      </w:r>
+    </w:p>
+    <w:p>
+      <w:r>
+        <w:br/>
+      </w:r>
+    </w:p>
+    <w:p>
+      <w:pPr>
+        <w:pStyle w:val="Heading2"/>
+      </w:pPr>
+      <w:r>
+        <w:rPr/>
+        <w:t>Trade Plan</w:t>
+      </w:r>
+    </w:p>
+    <w:p>
+      <w:r>
+        <w:rPr>
+          <w:i/>
+        </w:rPr>
+        <w:t xml:space="preserve">Menu: STRATEGY -&gt; Trade Analyzer -&gt; Trade Plan · Route </w:t>
+      </w:r>
+      <w:r>
+        <w:rPr>
+          <w:rFonts w:ascii="Consolas" w:hAnsi="Consolas"/>
+          <w:color w:val="334455"/>
+          <w:sz w:val="19"/>
+        </w:rPr>
+        <w:t>/trade/plan</w:t>
+      </w:r>
+    </w:p>
+    <w:p>
+      <w:pPr>
+        <w:pStyle w:val="Heading3"/>
+      </w:pPr>
+      <w:r>
+        <w:rPr/>
+        <w:t>What it is</w:t>
+      </w:r>
+    </w:p>
+    <w:p>
+      <w:r>
+        <w:rPr/>
+        <w:t>The verdict rendered as something you could be wrong about: structure, legs, entry</w:t>
+        <w:br/>
+        <w:t>zone, stop, target, time stop and events - beside a card stating what would change</w:t>
+        <w:br/>
+        <w:t>the call.</w:t>
+      </w:r>
+    </w:p>
+    <w:p>
+      <w:pPr>
+        <w:pStyle w:val="Heading3"/>
+      </w:pPr>
+      <w:r>
+        <w:rPr/>
+        <w:t>Where the data comes from</w:t>
       </w:r>
     </w:p>
     <w:tbl>
@@ -24769,12 +24283,6 @@
                 <w:b/>
               </w:rPr>
             </w:r>
-            <w:r>
-              <w:rPr>
-                <w:b/>
-              </w:rPr>
-              <w:t>Column</w:t>
-            </w:r>
           </w:p>
         </w:tc>
         <w:tc>
@@ -24788,12 +24296,6 @@
                 <w:b/>
               </w:rPr>
             </w:r>
-            <w:r>
-              <w:rPr>
-                <w:b/>
-              </w:rPr>
-              <w:t>Meaning</w:t>
-            </w:r>
           </w:p>
         </w:tc>
       </w:tr>
@@ -24805,10 +24307,8 @@
           <w:p>
             <w:r/>
             <w:r>
-              <w:rPr>
-                <w:b/>
-              </w:rPr>
-              <w:t>SYMBOL</w:t>
+              <w:rPr/>
+              <w:t>Service</w:t>
             </w:r>
           </w:p>
         </w:tc>
@@ -24818,21 +24318,41 @@
           </w:tcPr>
           <w:p>
             <w:r/>
-            <w:r>
-              <w:rPr/>
-              <w:t xml:space="preserve">Stock, ETF, or an option contract in OCC format (e.g. </w:t>
-            </w:r>
             <w:r>
               <w:rPr>
                 <w:rFonts w:ascii="Consolas" w:hAnsi="Consolas"/>
                 <w:color w:val="334455"/>
                 <w:sz w:val="19"/>
               </w:rPr>
-              <w:t>IWM 270617C00400000</w:t>
-            </w:r>
-            <w:r>
-              <w:rPr/>
-              <w:t xml:space="preserve"> = IWM, expiring 2027-06-17, Call, strike 400).</w:t>
+              <w:t>trade_svc</w:t>
+            </w:r>
+            <w:r>
+              <w:rPr/>
+              <w:t xml:space="preserve">, </w:t>
+            </w:r>
+            <w:r>
+              <w:rPr>
+                <w:rFonts w:ascii="Consolas" w:hAnsi="Consolas"/>
+                <w:color w:val="334455"/>
+                <w:sz w:val="19"/>
+              </w:rPr>
+              <w:t>cache:trade:analysis</w:t>
+            </w:r>
+            <w:r>
+              <w:rPr/>
+              <w:t xml:space="preserve"> (</w:t>
+            </w:r>
+            <w:r>
+              <w:rPr>
+                <w:rFonts w:ascii="Consolas" w:hAnsi="Consolas"/>
+                <w:color w:val="334455"/>
+                <w:sz w:val="19"/>
+              </w:rPr>
+              <w:t>trade_plan</w:t>
+            </w:r>
+            <w:r>
+              <w:rPr/>
+              <w:t>)</w:t>
             </w:r>
           </w:p>
         </w:tc>
@@ -24846,10 +24366,8 @@
           <w:p>
             <w:r/>
             <w:r>
-              <w:rPr>
-                <w:b/>
-              </w:rPr>
-              <w:t>SECTOR</w:t>
+              <w:rPr/>
+              <w:t>Structure</w:t>
             </w:r>
           </w:p>
         </w:tc>
@@ -24862,17 +24380,7 @@
             <w:r/>
             <w:r>
               <w:rPr/>
-              <w:t xml:space="preserve">Its sector, or </w:t>
-            </w:r>
-            <w:r>
-              <w:rPr>
-                <w:i/>
-              </w:rPr>
-              <w:t>Unknown</w:t>
-            </w:r>
-            <w:r>
-              <w:rPr/>
-              <w:t xml:space="preserve"> for ETFs and instruments outside the classification.</w:t>
+              <w:t>A pure lookup over side x IV state x dealer levels</w:t>
             </w:r>
           </w:p>
         </w:tc>
@@ -24885,20 +24393,8 @@
           <w:p>
             <w:r/>
             <w:r>
-              <w:rPr>
-                <w:b/>
-              </w:rPr>
-              <w:t>QTY</w:t>
-            </w:r>
-            <w:r>
-              <w:rPr/>
-              <w:t xml:space="preserve"> / </w:t>
-            </w:r>
-            <w:r>
-              <w:rPr>
-                <w:b/>
-              </w:rPr>
-              <w:t>MARKET VALUE</w:t>
+              <w:rPr/>
+              <w:t>Stop</w:t>
             </w:r>
           </w:p>
         </w:tc>
@@ -24910,129 +24406,7 @@
             <w:r/>
             <w:r>
               <w:rPr/>
-              <w:t>Size and current value.</w:t>
-            </w:r>
-          </w:p>
-        </w:tc>
-      </w:tr>
-      <w:tr>
-        <w:tc>
-          <w:tcPr>
-            <w:tcW w:type="dxa" w:w="4320"/>
-            <w:shd w:val="clear" w:color="auto" w:fill="F4F6FA"/>
-          </w:tcPr>
-          <w:p>
-            <w:r/>
-            <w:r>
-              <w:rPr>
-                <w:b/>
-              </w:rPr>
-              <w:t>DAY P/L</w:t>
-            </w:r>
-          </w:p>
-        </w:tc>
-        <w:tc>
-          <w:tcPr>
-            <w:tcW w:type="dxa" w:w="4320"/>
-            <w:shd w:val="clear" w:color="auto" w:fill="F4F6FA"/>
-          </w:tcPr>
-          <w:p>
-            <w:r/>
-            <w:r>
-              <w:rPr/>
-              <w:t>Today's change. Streams live.</w:t>
-            </w:r>
-          </w:p>
-        </w:tc>
-      </w:tr>
-      <w:tr>
-        <w:tc>
-          <w:tcPr>
-            <w:tcW w:type="dxa" w:w="4320"/>
-          </w:tcPr>
-          <w:p>
-            <w:r/>
-            <w:r>
-              <w:rPr>
-                <w:b/>
-              </w:rPr>
-              <w:t>TOTAL P/L</w:t>
-            </w:r>
-          </w:p>
-        </w:tc>
-        <w:tc>
-          <w:tcPr>
-            <w:tcW w:type="dxa" w:w="4320"/>
-          </w:tcPr>
-          <w:p>
-            <w:r/>
-            <w:r>
-              <w:rPr/>
-              <w:t>Unrealized profit or loss since purchase.</w:t>
-            </w:r>
-          </w:p>
-        </w:tc>
-      </w:tr>
-      <w:tr>
-        <w:tc>
-          <w:tcPr>
-            <w:tcW w:type="dxa" w:w="4320"/>
-            <w:shd w:val="clear" w:color="auto" w:fill="F4F6FA"/>
-          </w:tcPr>
-          <w:p>
-            <w:r/>
-            <w:r>
-              <w:rPr>
-                <w:b/>
-              </w:rPr>
-              <w:t>VS SECTOR (RS)</w:t>
-            </w:r>
-          </w:p>
-        </w:tc>
-        <w:tc>
-          <w:tcPr>
-            <w:tcW w:type="dxa" w:w="4320"/>
-            <w:shd w:val="clear" w:color="auto" w:fill="F4F6FA"/>
-          </w:tcPr>
-          <w:p>
-            <w:r/>
-            <w:r>
-              <w:rPr>
-                <w:b/>
-              </w:rPr>
-              <w:t>The most useful column here.</w:t>
-            </w:r>
-            <w:r>
-              <w:rPr/>
-              <w:t xml:space="preserve"> Relative strength against the position's own sector over 1 day, 1 week and 1 month, indexed to 100. Above 100 = beating its sector.</w:t>
-            </w:r>
-          </w:p>
-        </w:tc>
-      </w:tr>
-      <w:tr>
-        <w:tc>
-          <w:tcPr>
-            <w:tcW w:type="dxa" w:w="4320"/>
-          </w:tcPr>
-          <w:p>
-            <w:r/>
-            <w:r>
-              <w:rPr>
-                <w:b/>
-              </w:rPr>
-              <w:t>SINCE PURCHASE</w:t>
-            </w:r>
-          </w:p>
-        </w:tc>
-        <w:tc>
-          <w:tcPr>
-            <w:tcW w:type="dxa" w:w="4320"/>
-          </w:tcPr>
-          <w:p>
-            <w:r/>
-            <w:r>
-              <w:rPr/>
-              <w:t>Return since you bought it.</w:t>
+              <w:t>ATR or the nearer wall, whichever is TIGHTER; absent if neither exists</w:t>
             </w:r>
           </w:p>
         </w:tc>
@@ -25040,113 +24414,65 @@
     </w:tbl>
     <w:p/>
     <w:p>
-      <w:r>
-        <w:rPr>
-          <w:b/>
-        </w:rPr>
-        <w:t>Sectors</w:t>
-      </w:r>
-      <w:r>
-        <w:rPr/>
-        <w:t xml:space="preserve"> shows your allocation against the S&amp;P — where you are over- and</w:t>
-        <w:br/>
-        <w:t xml:space="preserve">under-weight. </w:t>
-      </w:r>
-      <w:r>
-        <w:rPr>
-          <w:b/>
-        </w:rPr>
-        <w:t>Performance</w:t>
-      </w:r>
-      <w:r>
-        <w:rPr/>
-        <w:t xml:space="preserve"> grades each position and offers per-position commentary.</w:t>
-      </w:r>
-    </w:p>
-    <w:p>
-      <w:r>
-        <w:rPr>
-          <w:b/>
-        </w:rPr>
-        <w:t>Status indicators</w:t>
-      </w:r>
-      <w:r>
-        <w:rPr/>
-        <w:t xml:space="preserve"> at the top show whether the proxy is up and whether the price</w:t>
-        <w:br/>
-        <w:t>stream is live.</w:t>
-      </w:r>
-    </w:p>
-    <w:p>
       <w:pPr>
         <w:pStyle w:val="Heading3"/>
       </w:pPr>
       <w:r>
         <w:rPr/>
-        <w:t>Why it matters</w:t>
-      </w:r>
-    </w:p>
-    <w:p>
-      <w:r>
-        <w:rPr>
-          <w:b/>
-        </w:rPr>
-        <w:t>VS SECTOR is the column to read.</w:t>
-      </w:r>
-      <w:r>
-        <w:rPr/>
-        <w:t xml:space="preserve"> A position up 8% in a sector up 15% is a </w:t>
-      </w:r>
-      <w:r>
-        <w:rPr>
-          <w:i/>
-        </w:rPr>
-        <w:t>losing</w:t>
-      </w:r>
-      <w:r>
-        <w:rPr/>
-        <w:br/>
-        <w:t>position in the only sense that matters — you would have done better owning the sector</w:t>
-        <w:br/>
-        <w:t>ETF. Absolute P&amp;L cannot show you that; this can, over three horizons at once.</w:t>
-      </w:r>
-    </w:p>
-    <w:p>
-      <w:r>
-        <w:rPr/>
-        <w:t>The Sectors tab answers a different question: concentration. Most self-directed</w:t>
-        <w:br/>
-        <w:t>portfolios are far more concentrated than their owner believes, usually in technology,</w:t>
-        <w:br/>
-        <w:t>and seeing the weight against the index is the fastest correction to that.</w:t>
-      </w:r>
-    </w:p>
-    <w:p>
-      <w:r>
-        <w:rPr>
-          <w:b/>
-        </w:rPr>
-        <w:t>Where it is weak.</w:t>
-      </w:r>
-      <w:r>
-        <w:rPr/>
-        <w:t xml:space="preserve"> Expired or worthless option positions show a market value of</w:t>
-        <w:br/>
-        <w:t>$0.00 while retaining their historical loss, which can make the totals read oddly. The</w:t>
-        <w:br/>
-        <w:t>sector classification is missing for many ETFs and crypto-linked products, so those rows</w:t>
-        <w:br/>
-        <w:t xml:space="preserve">show </w:t>
-      </w:r>
-      <w:r>
-        <w:rPr>
-          <w:i/>
-        </w:rPr>
-        <w:t>Unknown</w:t>
-      </w:r>
-      <w:r>
-        <w:rPr/>
-        <w:t xml:space="preserve"> and no relative strength.</w:t>
+        <w:t>Reading the screen</w:t>
+      </w:r>
+    </w:p>
+    <w:p>
+      <w:r>
+        <w:rPr>
+          <w:b/>
+        </w:rPr>
+        <w:t>The time stop is highlighted deliberately.</w:t>
+      </w:r>
+      <w:r>
+        <w:rPr/>
+        <w:t xml:space="preserve"> It is the model's own 20-trading-day</w:t>
+        <w:br/>
+        <w:t>horizon, and it is the only field nothing else in the app enforces - a position</w:t>
+        <w:br/>
+        <w:t>opened on a 20-day edge and held three months is no longer being held for the</w:t>
+        <w:br/>
+        <w:t>reason it was opened.</w:t>
+      </w:r>
+    </w:p>
+    <w:p>
+      <w:r>
+        <w:rPr>
+          <w:b/>
+        </w:rPr>
+        <w:t>The no-trade card is always present</w:t>
+      </w:r>
+      <w:r>
+        <w:rPr/>
+        <w:t>, even when a plan is cleared. A refused side</w:t>
+        <w:br/>
+        <w:t>with its reasons is a research finding; hiding it would make the screen look like</w:t>
+        <w:br/>
+        <w:t>the model had nothing to say.</w:t>
+      </w:r>
+    </w:p>
+    <w:p>
+      <w:r>
+        <w:rPr/>
+        <w:t>⚠ Where the tape has not cleared a directional short, the alternative offered is a</w:t>
+        <w:br/>
+      </w:r>
+      <w:r>
+        <w:rPr>
+          <w:b/>
+        </w:rPr>
+        <w:t>pair against SPY</w:t>
+      </w:r>
+      <w:r>
+        <w:rPr/>
+        <w:t>. The model predicts excess return versus the index, so that is</w:t>
+        <w:br/>
+        <w:t>the expression the prediction actually supports.</w:t>
       </w:r>
     </w:p>
     <w:p>
@@ -25155,15 +24481,13 @@
       </w:pPr>
       <w:r>
         <w:rPr/>
-        <w:t>When to use it</w:t>
-      </w:r>
-    </w:p>
-    <w:p>
-      <w:r>
-        <w:rPr/>
-        <w:t>Daily for the P&amp;L weekly for the Sectors and Performance tabs, which is where the</w:t>
-        <w:br/>
-        <w:t>useful decisions are.</w:t>
+        <w:t>When to open it</w:t>
+      </w:r>
+    </w:p>
+    <w:p>
+      <w:r>
+        <w:rPr/>
+        <w:t>After Overview and Evidence, when you have decided the read is worth acting on.</w:t>
       </w:r>
     </w:p>
     <w:p>
@@ -25180,6 +24504,1738 @@
         <w:rPr>
           <w:color w:val="2E6DB4"/>
         </w:rPr>
+        <w:t>Overview</w:t>
+      </w:r>
+      <w:r>
+        <w:rPr/>
+        <w:t xml:space="preserve"> · </w:t>
+      </w:r>
+      <w:r>
+        <w:rPr>
+          <w:color w:val="2E6DB4"/>
+        </w:rPr>
+        <w:t>Evidence</w:t>
+      </w:r>
+      <w:r>
+        <w:rPr/>
+        <w:t xml:space="preserve"> · </w:t>
+      </w:r>
+      <w:r>
+        <w:rPr>
+          <w:color w:val="2E6DB4"/>
+        </w:rPr>
+        <w:t>Rank Board</w:t>
+      </w:r>
+      <w:r>
+        <w:rPr/>
+        <w:t>.</w:t>
+      </w:r>
+    </w:p>
+    <w:p>
+      <w:r>
+        <w:br/>
+      </w:r>
+    </w:p>
+    <w:p>
+      <w:pPr>
+        <w:pStyle w:val="Heading2"/>
+      </w:pPr>
+      <w:r>
+        <w:rPr/>
+        <w:t>Claude Trades</w:t>
+      </w:r>
+    </w:p>
+    <w:p>
+      <w:r>
+        <w:rPr>
+          <w:i/>
+        </w:rPr>
+        <w:t xml:space="preserve">Menu: STRATEGY → Claude Trades · Route </w:t>
+      </w:r>
+      <w:r>
+        <w:rPr>
+          <w:rFonts w:ascii="Consolas" w:hAnsi="Consolas"/>
+          <w:color w:val="334455"/>
+          <w:sz w:val="19"/>
+        </w:rPr>
+        <w:t>/driver</w:t>
+      </w:r>
+    </w:p>
+    <w:p>
+      <w:pPr>
+        <w:pStyle w:val="Heading3"/>
+      </w:pPr>
+      <w:r>
+        <w:rPr/>
+        <w:t>What it is</w:t>
+      </w:r>
+    </w:p>
+    <w:p>
+      <w:r>
+        <w:rPr/>
+        <w:t xml:space="preserve">An </w:t>
+      </w:r>
+      <w:r>
+        <w:rPr>
+          <w:b/>
+        </w:rPr>
+        <w:t>autonomous paper options trader</w:t>
+      </w:r>
+      <w:r>
+        <w:rPr/>
+        <w:t>. Claude selects and sizes defined-risk credit</w:t>
+        <w:br/>
+        <w:t>spreads from the scanner's output; code-enforced guardrails cap the risk. This page</w:t>
+        <w:br/>
+        <w:t>monitors it and can stop it.</w:t>
+      </w:r>
+    </w:p>
+    <w:p>
+      <w:r>
+        <w:rPr>
+          <w:b/>
+        </w:rPr>
+        <w:t>Nothing is ever sent to Schwab.</w:t>
+      </w:r>
+      <w:r>
+        <w:rPr/>
+        <w:t xml:space="preserve"> It trades its own isolated paper book.</w:t>
+      </w:r>
+    </w:p>
+    <w:p>
+      <w:pPr>
+        <w:pStyle w:val="Heading3"/>
+      </w:pPr>
+      <w:r>
+        <w:rPr/>
+        <w:t>Where the data comes from</w:t>
+      </w:r>
+    </w:p>
+    <w:tbl>
+      <w:tblPr>
+        <w:tblW w:type="auto" w:w="0"/>
+        <w:jc w:val="left"/>
+        <w:tblLayout w:type="autofit"/>
+        <w:tblLook w:firstColumn="1" w:firstRow="1" w:lastColumn="0" w:lastRow="0" w:noHBand="0" w:noVBand="1" w:val="04A0"/>
+        <w:tblBorders>
+          <w:top w:val="single" w:sz="4" w:space="0" w:color="D8DEE9"/>
+          <w:left w:val="single" w:sz="4" w:space="0" w:color="D8DEE9"/>
+          <w:bottom w:val="single" w:sz="4" w:space="0" w:color="D8DEE9"/>
+          <w:right w:val="single" w:sz="4" w:space="0" w:color="D8DEE9"/>
+          <w:insideH w:val="single" w:sz="4" w:space="0" w:color="D8DEE9"/>
+          <w:insideV w:val="single" w:sz="4" w:space="0" w:color="D8DEE9"/>
+        </w:tblBorders>
+      </w:tblPr>
+      <w:tblGrid>
+        <w:gridCol w:w="4320"/>
+        <w:gridCol w:w="4320"/>
+      </w:tblGrid>
+      <w:tr>
+        <w:tc>
+          <w:tcPr>
+            <w:tcW w:type="dxa" w:w="4320"/>
+            <w:shd w:val="clear" w:color="auto" w:fill="EAF2FB"/>
+          </w:tcPr>
+          <w:p>
+            <w:r>
+              <w:rPr>
+                <w:b/>
+              </w:rPr>
+            </w:r>
+          </w:p>
+        </w:tc>
+        <w:tc>
+          <w:tcPr>
+            <w:tcW w:type="dxa" w:w="4320"/>
+            <w:shd w:val="clear" w:color="auto" w:fill="EAF2FB"/>
+          </w:tcPr>
+          <w:p>
+            <w:r>
+              <w:rPr>
+                <w:b/>
+              </w:rPr>
+            </w:r>
+          </w:p>
+        </w:tc>
+      </w:tr>
+      <w:tr>
+        <w:tc>
+          <w:tcPr>
+            <w:tcW w:type="dxa" w:w="4320"/>
+          </w:tcPr>
+          <w:p>
+            <w:r/>
+            <w:r>
+              <w:rPr/>
+              <w:t>Service</w:t>
+            </w:r>
+          </w:p>
+        </w:tc>
+        <w:tc>
+          <w:tcPr>
+            <w:tcW w:type="dxa" w:w="4320"/>
+          </w:tcPr>
+          <w:p>
+            <w:r/>
+            <w:r>
+              <w:rPr>
+                <w:rFonts w:ascii="Consolas" w:hAnsi="Consolas"/>
+                <w:color w:val="334455"/>
+                <w:sz w:val="19"/>
+              </w:rPr>
+              <w:t>driver_svc</w:t>
+            </w:r>
+            <w:r>
+              <w:rPr/>
+              <w:t xml:space="preserve"> (:8214) decides; </w:t>
+            </w:r>
+            <w:r>
+              <w:rPr>
+                <w:rFonts w:ascii="Consolas" w:hAnsi="Consolas"/>
+                <w:color w:val="334455"/>
+                <w:sz w:val="19"/>
+              </w:rPr>
+              <w:t>options_svc</w:t>
+            </w:r>
+            <w:r>
+              <w:rPr/>
+              <w:t xml:space="preserve"> (:8211) executes into the isolated book</w:t>
+            </w:r>
+          </w:p>
+        </w:tc>
+      </w:tr>
+      <w:tr>
+        <w:tc>
+          <w:tcPr>
+            <w:tcW w:type="dxa" w:w="4320"/>
+            <w:shd w:val="clear" w:color="auto" w:fill="F4F6FA"/>
+          </w:tcPr>
+          <w:p>
+            <w:r/>
+            <w:r>
+              <w:rPr/>
+              <w:t>Cache keys</w:t>
+            </w:r>
+          </w:p>
+        </w:tc>
+        <w:tc>
+          <w:tcPr>
+            <w:tcW w:type="dxa" w:w="4320"/>
+            <w:shd w:val="clear" w:color="auto" w:fill="F4F6FA"/>
+          </w:tcPr>
+          <w:p>
+            <w:r/>
+            <w:r>
+              <w:rPr>
+                <w:rFonts w:ascii="Consolas" w:hAnsi="Consolas"/>
+                <w:color w:val="334455"/>
+                <w:sz w:val="19"/>
+              </w:rPr>
+              <w:t>cache:driver:autonomous</w:t>
+            </w:r>
+            <w:r>
+              <w:rPr/>
+              <w:t xml:space="preserve">, </w:t>
+            </w:r>
+            <w:r>
+              <w:rPr>
+                <w:rFonts w:ascii="Consolas" w:hAnsi="Consolas"/>
+                <w:color w:val="334455"/>
+                <w:sz w:val="19"/>
+              </w:rPr>
+              <w:t>:control</w:t>
+            </w:r>
+            <w:r>
+              <w:rPr/>
+              <w:t xml:space="preserve">, </w:t>
+            </w:r>
+            <w:r>
+              <w:rPr>
+                <w:rFonts w:ascii="Consolas" w:hAnsi="Consolas"/>
+                <w:color w:val="334455"/>
+                <w:sz w:val="19"/>
+              </w:rPr>
+              <w:t>cache:options:driver_paper_account</w:t>
+            </w:r>
+            <w:r>
+              <w:rPr/>
+              <w:t xml:space="preserve">, </w:t>
+            </w:r>
+            <w:r>
+              <w:rPr>
+                <w:rFonts w:ascii="Consolas" w:hAnsi="Consolas"/>
+                <w:color w:val="334455"/>
+                <w:sz w:val="19"/>
+              </w:rPr>
+              <w:t>:driver_paper_perf</w:t>
+            </w:r>
+          </w:p>
+        </w:tc>
+      </w:tr>
+      <w:tr>
+        <w:tc>
+          <w:tcPr>
+            <w:tcW w:type="dxa" w:w="4320"/>
+          </w:tcPr>
+          <w:p>
+            <w:r/>
+            <w:r>
+              <w:rPr/>
+              <w:t>Checkpoints</w:t>
+            </w:r>
+          </w:p>
+        </w:tc>
+        <w:tc>
+          <w:tcPr>
+            <w:tcW w:type="dxa" w:w="4320"/>
+          </w:tcPr>
+          <w:p>
+            <w:r/>
+            <w:r>
+              <w:rPr/>
+              <w:t xml:space="preserve">09:28 ET morning run, then every 30 minutes within the entry window </w:t>
+            </w:r>
+            <w:r>
+              <w:rPr>
+                <w:b/>
+              </w:rPr>
+              <w:t>09:45–15:30 ET</w:t>
+            </w:r>
+          </w:p>
+        </w:tc>
+      </w:tr>
+      <w:tr>
+        <w:tc>
+          <w:tcPr>
+            <w:tcW w:type="dxa" w:w="4320"/>
+            <w:shd w:val="clear" w:color="auto" w:fill="F4F6FA"/>
+          </w:tcPr>
+          <w:p>
+            <w:r/>
+            <w:r>
+              <w:rPr/>
+              <w:t>Re-pricing</w:t>
+            </w:r>
+          </w:p>
+        </w:tc>
+        <w:tc>
+          <w:tcPr>
+            <w:tcW w:type="dxa" w:w="4320"/>
+            <w:shd w:val="clear" w:color="auto" w:fill="F4F6FA"/>
+          </w:tcPr>
+          <w:p>
+            <w:r/>
+            <w:r>
+              <w:rPr/>
+              <w:t xml:space="preserve">Open positions re-priced </w:t>
+            </w:r>
+            <w:r>
+              <w:rPr>
+                <w:b/>
+              </w:rPr>
+              <w:t>every minute</w:t>
+            </w:r>
+            <w:r>
+              <w:rPr/>
+              <w:t xml:space="preserve"> during market hours</w:t>
+            </w:r>
+          </w:p>
+        </w:tc>
+      </w:tr>
+    </w:tbl>
+    <w:p/>
+    <w:p>
+      <w:r>
+        <w:rPr>
+          <w:b/>
+        </w:rPr>
+        <w:t>Why the entry window is shaped that way.</w:t>
+      </w:r>
+      <w:r>
+        <w:rPr/>
+        <w:t xml:space="preserve"> The first ~15 minutes after the open are</w:t>
+        <w:br/>
+        <w:t xml:space="preserve">skipped so the post-open structure is readable, and no </w:t>
+      </w:r>
+      <w:r>
+        <w:rPr>
+          <w:i/>
+        </w:rPr>
+        <w:t>new</w:t>
+      </w:r>
+      <w:r>
+        <w:rPr/>
+        <w:t xml:space="preserve"> entries are taken in the</w:t>
+        <w:br/>
+        <w:t>last 30 minutes before the close. Management and exits are unaffected.</w:t>
+      </w:r>
+    </w:p>
+    <w:p>
+      <w:pPr>
+        <w:pStyle w:val="Heading3"/>
+      </w:pPr>
+      <w:r>
+        <w:rPr/>
+        <w:t>Reading the screen</w:t>
+      </w:r>
+    </w:p>
+    <w:p>
+      <w:r>
+        <w:rPr>
+          <w:b/>
+        </w:rPr>
+        <w:t>Status row:</w:t>
+      </w:r>
+      <w:r>
+        <w:rPr/>
+        <w:t xml:space="preserve"> whether autonomy is ACTIVE, the last cycle time, and three controls —</w:t>
+        <w:br/>
+      </w:r>
+      <w:r>
+        <w:rPr>
+          <w:b/>
+        </w:rPr>
+        <w:t>Autonomous</w:t>
+      </w:r>
+      <w:r>
+        <w:rPr/>
+        <w:t xml:space="preserve"> (enable/disable), </w:t>
+      </w:r>
+      <w:r>
+        <w:rPr>
+          <w:b/>
+        </w:rPr>
+        <w:t>Run now</w:t>
+      </w:r>
+      <w:r>
+        <w:rPr/>
+        <w:t xml:space="preserve"> (one immediate checkpoint) and a</w:t>
+        <w:br/>
+        <w:t xml:space="preserve">confirm-gated </w:t>
+      </w:r>
+      <w:r>
+        <w:rPr>
+          <w:b/>
+        </w:rPr>
+        <w:t>STOP</w:t>
+      </w:r>
+      <w:r>
+        <w:rPr/>
+        <w:t xml:space="preserve"> (halts new trades for the day; open positions keep managing).</w:t>
+      </w:r>
+    </w:p>
+    <w:p>
+      <w:r>
+        <w:rPr>
+          <w:b/>
+        </w:rPr>
+        <w:t>Tiles:</w:t>
+      </w:r>
+      <w:r>
+        <w:rPr/>
+        <w:t xml:space="preserve"> Day P&amp;L against the day's target · Session P&amp;L · Realized · Open P&amp;L ·</w:t>
+        <w:br/>
+        <w:t>Equity · Open count.</w:t>
+      </w:r>
+    </w:p>
+    <w:p>
+      <w:pPr>
+        <w:pStyle w:val="IntenseQuote"/>
+      </w:pPr>
+      <w:r>
+        <w:rPr>
+          <w:b/>
+        </w:rPr>
+        <w:t>The daily target is dynamic.</w:t>
+      </w:r>
+      <w:r>
+        <w:rPr/>
+        <w:t xml:space="preserve"> The base is </w:t>
+      </w:r>
+      <w:r>
+        <w:rPr>
+          <w:b/>
+        </w:rPr>
+        <w:t>$500</w:t>
+      </w:r>
+      <w:r>
+        <w:rPr/>
+        <w:t>, but it ratchets against the</w:t>
+        <w:br/>
+        <w:t xml:space="preserve">month-to-date pace — up to a </w:t>
+      </w:r>
+      <w:r>
+        <w:rPr>
+          <w:b/>
+        </w:rPr>
+        <w:t>$1,000</w:t>
+      </w:r>
+      <w:r>
+        <w:rPr/>
+        <w:t xml:space="preserve"> cap when behind, down to a </w:t>
+      </w:r>
+      <w:r>
+        <w:rPr>
+          <w:b/>
+        </w:rPr>
+        <w:t>$250</w:t>
+      </w:r>
+      <w:r>
+        <w:rPr/>
+        <w:t xml:space="preserve"> floor when</w:t>
+        <w:br/>
+        <w:t xml:space="preserve">ahead. So the number in the tile changes day to day. A </w:t>
+      </w:r>
+      <w:r>
+        <w:rPr>
+          <w:b/>
+        </w:rPr>
+        <w:t>−$1,500</w:t>
+      </w:r>
+      <w:r>
+        <w:rPr/>
+        <w:t xml:space="preserve"> daily loss halts new</w:t>
+        <w:br/>
+        <w:t>entries outright.</w:t>
+      </w:r>
+    </w:p>
+    <w:p>
+      <w:r>
+        <w:rPr>
+          <w:b/>
+        </w:rPr>
+        <w:t>Open positions</w:t>
+      </w:r>
+      <w:r>
+        <w:rPr/>
+        <w:t xml:space="preserve"> and a </w:t>
+      </w:r>
+      <w:r>
+        <w:rPr>
+          <w:b/>
+        </w:rPr>
+        <w:t>decision log</w:t>
+      </w:r>
+      <w:r>
+        <w:rPr/>
+        <w:t xml:space="preserve"> (newest first, in CT) showing each checkpoint's</w:t>
+        <w:br/>
+        <w:t>reasoning, including a one-line market-context summary.</w:t>
+      </w:r>
+    </w:p>
+    <w:p>
+      <w:r>
+        <w:rPr>
+          <w:b/>
+        </w:rPr>
+        <w:t>Performance scorecard:</w:t>
+      </w:r>
+      <w:r>
+        <w:rPr/>
+        <w:t xml:space="preserve"> trades, open, closed, </w:t>
+      </w:r>
+      <w:r>
+        <w:rPr>
+          <w:b/>
+        </w:rPr>
+        <w:t>win rate</w:t>
+      </w:r>
+      <w:r>
+        <w:rPr/>
+        <w:t>, realized, open P&amp;L, total</w:t>
+        <w:br/>
+        <w:t xml:space="preserve">P&amp;L, </w:t>
+      </w:r>
+      <w:r>
+        <w:rPr>
+          <w:b/>
+        </w:rPr>
+        <w:t>average win</w:t>
+      </w:r>
+      <w:r>
+        <w:rPr/>
+        <w:t xml:space="preserve">, </w:t>
+      </w:r>
+      <w:r>
+        <w:rPr>
+          <w:b/>
+        </w:rPr>
+        <w:t>average loss</w:t>
+      </w:r>
+      <w:r>
+        <w:rPr/>
+        <w:t xml:space="preserve">, </w:t>
+      </w:r>
+      <w:r>
+        <w:rPr>
+          <w:b/>
+        </w:rPr>
+        <w:t>profit factor</w:t>
+      </w:r>
+      <w:r>
+        <w:rPr/>
+        <w:t>, best and worst trade, plus</w:t>
+        <w:br/>
+        <w:t xml:space="preserve">breakdowns of </w:t>
+      </w:r>
+      <w:r>
+        <w:rPr>
+          <w:b/>
+        </w:rPr>
+        <w:t>P&amp;L by symbol</w:t>
+      </w:r>
+      <w:r>
+        <w:rPr/>
+        <w:t xml:space="preserve"> and </w:t>
+      </w:r>
+      <w:r>
+        <w:rPr>
+          <w:b/>
+        </w:rPr>
+        <w:t>by strategy</w:t>
+      </w:r>
+      <w:r>
+        <w:rPr/>
+        <w:t>.</w:t>
+      </w:r>
+    </w:p>
+    <w:p>
+      <w:r>
+        <w:rPr>
+          <w:b/>
+        </w:rPr>
+        <w:t>Performance view:</w:t>
+      </w:r>
+      <w:r>
+        <w:rPr/>
+        <w:t xml:space="preserve"> the closed-trade list with exit reasons — </w:t>
+      </w:r>
+      <w:r>
+        <w:rPr>
+          <w:i/>
+        </w:rPr>
+        <w:t>Target hit</w:t>
+      </w:r>
+      <w:r>
+        <w:rPr/>
+        <w:t xml:space="preserve">, </w:t>
+      </w:r>
+      <w:r>
+        <w:rPr>
+          <w:i/>
+        </w:rPr>
+        <w:t>Delta</w:t>
+        <w:br/>
+        <w:t>stop</w:t>
+      </w:r>
+      <w:r>
+        <w:rPr/>
+        <w:t xml:space="preserve">, </w:t>
+      </w:r>
+      <w:r>
+        <w:rPr>
+          <w:i/>
+        </w:rPr>
+        <w:t>Time stop</w:t>
+      </w:r>
+      <w:r>
+        <w:rPr/>
+        <w:t xml:space="preserve">, </w:t>
+      </w:r>
+      <w:r>
+        <w:rPr>
+          <w:i/>
+        </w:rPr>
+        <w:t>Money stop</w:t>
+      </w:r>
+      <w:r>
+        <w:rPr/>
+        <w:t>.</w:t>
+      </w:r>
+    </w:p>
+    <w:p>
+      <w:pPr>
+        <w:pStyle w:val="Heading3"/>
+      </w:pPr>
+      <w:r>
+        <w:rPr/>
+        <w:t>How the guardrails work</w:t>
+      </w:r>
+    </w:p>
+    <w:p>
+      <w:r>
+        <w:rPr/>
+        <w:t>This is the part worth understanding, because it is what makes the design defensible:</w:t>
+        <w:br/>
+      </w:r>
+      <w:r>
+        <w:rPr>
+          <w:b/>
+        </w:rPr>
+        <w:t>the model never sizes its own risk.</w:t>
+      </w:r>
+      <w:r>
+        <w:rPr/>
+        <w:t xml:space="preserve"> The cycle is</w:t>
+      </w:r>
+    </w:p>
+    <w:p>
+      <w:pPr>
+        <w:pStyle w:val="ListNumber"/>
+      </w:pPr>
+      <w:r>
+        <w:rPr>
+          <w:rFonts w:ascii="Consolas" w:hAnsi="Consolas"/>
+          <w:color w:val="334455"/>
+          <w:sz w:val="19"/>
+        </w:rPr>
+        <w:t>build_packet</w:t>
+      </w:r>
+      <w:r>
+        <w:t xml:space="preserve"> — assemble market context, candidates and account state;</w:t>
+      </w:r>
+    </w:p>
+    <w:p>
+      <w:pPr>
+        <w:pStyle w:val="ListNumber"/>
+      </w:pPr>
+      <w:r>
+        <w:rPr>
+          <w:rFonts w:ascii="Consolas" w:hAnsi="Consolas"/>
+          <w:color w:val="334455"/>
+          <w:sz w:val="19"/>
+        </w:rPr>
+        <w:t>decider.decide</w:t>
+      </w:r>
+      <w:r>
+        <w:t xml:space="preserve"> — Claude picks a candidate and proposes a size;</w:t>
+      </w:r>
+    </w:p>
+    <w:p>
+      <w:pPr>
+        <w:pStyle w:val="ListNumber"/>
+      </w:pPr>
+      <w:r>
+        <w:rPr>
+          <w:rFonts w:ascii="Consolas" w:hAnsi="Consolas"/>
+          <w:color w:val="334455"/>
+          <w:sz w:val="19"/>
+        </w:rPr>
+        <w:t>guardrails.apply_guardrails</w:t>
+      </w:r>
+      <w:r>
+        <w:t xml:space="preserve"> — </w:t>
+      </w:r>
+      <w:r>
+        <w:rPr>
+          <w:b/>
+        </w:rPr>
+        <w:t>pure code</w:t>
+      </w:r>
+      <w:r>
+        <w:t xml:space="preserve"> clamps the size and halts on the banked</w:t>
+        <w:br/>
+        <w:t xml:space="preserve">   target, the loss cap, or a VIX threshold;</w:t>
+      </w:r>
+    </w:p>
+    <w:p>
+      <w:pPr>
+        <w:pStyle w:val="ListNumber"/>
+      </w:pPr>
+      <w:r>
+        <w:t>the clamped order is enqueued to the paper book.</w:t>
+      </w:r>
+    </w:p>
+    <w:p>
+      <w:r>
+        <w:rPr/>
+        <w:t xml:space="preserve">Step 3 cannot be argued with by the model. Per-trade risk is evaluated in </w:t>
+      </w:r>
+      <w:r>
+        <w:rPr>
+          <w:b/>
+        </w:rPr>
+        <w:t>per-contract</w:t>
+        <w:br/>
+        <w:t>dollars</w:t>
+      </w:r>
+      <w:r>
+        <w:rPr/>
+        <w:t>, and the driver's own book carries a higher per-trade cap ($1,500) than the</w:t>
+        <w:br/>
+        <w:t>manual account ($250).</w:t>
+      </w:r>
+    </w:p>
+    <w:p>
+      <w:pPr>
+        <w:pStyle w:val="Heading3"/>
+      </w:pPr>
+      <w:r>
+        <w:rPr/>
+        <w:t>Why it matters</w:t>
+      </w:r>
+    </w:p>
+    <w:p>
+      <w:r>
+        <w:rPr/>
+        <w:t>As a research instrument this is the most interesting thing in the app: an unbiased,</w:t>
+        <w:br/>
+        <w:t>fully-logged record of what a rules-plus-model system does with the app's own signals.</w:t>
+        <w:br/>
+        <w:t xml:space="preserve">The decision log tells you </w:t>
+      </w:r>
+      <w:r>
+        <w:rPr>
+          <w:i/>
+        </w:rPr>
+        <w:t>why</w:t>
+      </w:r>
+      <w:r>
+        <w:rPr/>
+        <w:t xml:space="preserve"> each trade was taken, which no human trading journal</w:t>
+        <w:br/>
+        <w:t>manages consistently.</w:t>
+      </w:r>
+    </w:p>
+    <w:p>
+      <w:r>
+        <w:rPr>
+          <w:b/>
+        </w:rPr>
+        <w:t>Be clear-eyed about the results.</w:t>
+      </w:r>
+      <w:r>
+        <w:rPr/>
+        <w:t xml:space="preserve"> At the time of writing this book's record is</w:t>
+        <w:br/>
+      </w:r>
+      <w:r>
+        <w:rPr>
+          <w:b/>
+        </w:rPr>
+        <w:t>negative</w:t>
+      </w:r>
+      <w:r>
+        <w:rPr/>
+        <w:t xml:space="preserve">: 151 closed trades, a </w:t>
+      </w:r>
+      <w:r>
+        <w:rPr>
+          <w:b/>
+        </w:rPr>
+        <w:t>45% win rate</w:t>
+      </w:r>
+      <w:r>
+        <w:rPr/>
+        <w:t xml:space="preserve">, a </w:t>
+      </w:r>
+      <w:r>
+        <w:rPr>
+          <w:b/>
+        </w:rPr>
+        <w:t>profit factor of 0.57</w:t>
+      </w:r>
+      <w:r>
+        <w:rPr/>
+        <w:t>, an</w:t>
+        <w:br/>
+        <w:t xml:space="preserve">average win of </w:t>
+      </w:r>
+      <w:r>
+        <w:rPr>
+          <w:b/>
+        </w:rPr>
+        <w:t>+$165</w:t>
+      </w:r>
+      <w:r>
+        <w:rPr/>
+        <w:t xml:space="preserve"> against an average loss of </w:t>
+      </w:r>
+      <w:r>
+        <w:rPr>
+          <w:b/>
+        </w:rPr>
+        <w:t>−$236</w:t>
+      </w:r>
+      <w:r>
+        <w:rPr/>
+        <w:t>, and realized P&amp;L of</w:t>
+        <w:br/>
+        <w:t xml:space="preserve">about </w:t>
+      </w:r>
+      <w:r>
+        <w:rPr>
+          <w:b/>
+        </w:rPr>
+        <w:t>−$8,300</w:t>
+      </w:r>
+      <w:r>
+        <w:rPr/>
+        <w:t>. Put credit spreads account for essentially all of the loss while call</w:t>
+        <w:br/>
+        <w:t>credit spreads are roughly flat.</w:t>
+      </w:r>
+    </w:p>
+    <w:p>
+      <w:r>
+        <w:rPr/>
+        <w:t>That shape — winning less than half the time while losing more per loss than you make</w:t>
+        <w:br/>
+        <w:t>per win — is the classic failure mode for premium selling: the wins are capped at the</w:t>
+        <w:br/>
+        <w:t xml:space="preserve">credit while the losses run to the width. It is </w:t>
+      </w:r>
+      <w:r>
+        <w:rPr>
+          <w:i/>
+        </w:rPr>
+        <w:t>the</w:t>
+      </w:r>
+      <w:r>
+        <w:rPr/>
+        <w:t xml:space="preserve"> thing this page exists to make</w:t>
+        <w:br/>
+        <w:t>visible, and it is a strong argument for treating the driver as an experiment rather</w:t>
+        <w:br/>
+        <w:t>than a strategy.</w:t>
+      </w:r>
+    </w:p>
+    <w:p>
+      <w:pPr>
+        <w:pStyle w:val="Heading3"/>
+      </w:pPr>
+      <w:r>
+        <w:rPr/>
+        <w:t>Caveats and gotchas</w:t>
+      </w:r>
+    </w:p>
+    <w:p>
+      <w:pPr>
+        <w:pStyle w:val="ListBullet"/>
+      </w:pPr>
+      <w:r>
+        <w:rPr>
+          <w:b/>
+        </w:rPr>
+        <w:t>"Executed" in the decision log means the order was enqueued, not filled.</w:t>
+      </w:r>
+      <w:r>
+        <w:t xml:space="preserve"> The true</w:t>
+        <w:br/>
+        <w:t xml:space="preserve">  outcome is in the account view's open results. A trade can be logged as executed and</w:t>
+        <w:br/>
+        <w:t xml:space="preserve">  then rejected for risk.</w:t>
+      </w:r>
+    </w:p>
+    <w:p>
+      <w:pPr>
+        <w:pStyle w:val="ListBullet"/>
+      </w:pPr>
+      <w:r>
+        <w:t xml:space="preserve">Analytics are </w:t>
+      </w:r>
+      <w:r>
+        <w:rPr>
+          <w:b/>
+        </w:rPr>
+        <w:t>forward-only</w:t>
+      </w:r>
+      <w:r>
+        <w:t xml:space="preserve"> — the equity curve is complete, but posture and</w:t>
+        <w:br/>
+        <w:t xml:space="preserve">  MAE/MFE statistics only accrue on trades opened after those were added.</w:t>
+      </w:r>
+    </w:p>
+    <w:p>
+      <w:pPr>
+        <w:pStyle w:val="ListBullet"/>
+      </w:pPr>
+      <w:r>
+        <w:t xml:space="preserve">Enabling autonomy costs Claude API calls per checkpoint. </w:t>
+      </w:r>
+      <w:r>
+        <w:rPr>
+          <w:color w:val="2E6DB4"/>
+        </w:rPr>
+        <w:t>Settings</w:t>
+      </w:r>
+      <w:r>
+        <w:t xml:space="preserve"> shows</w:t>
+        <w:br/>
+        <w:t xml:space="preserve">  the running count.</w:t>
+      </w:r>
+    </w:p>
+    <w:p>
+      <w:pPr>
+        <w:pStyle w:val="Heading3"/>
+      </w:pPr>
+      <w:r>
+        <w:rPr/>
+        <w:t>Related pages</w:t>
+      </w:r>
+    </w:p>
+    <w:p>
+      <w:r>
+        <w:rPr>
+          <w:color w:val="2E6DB4"/>
+        </w:rPr>
+        <w:t>Market Scanner</w:t>
+      </w:r>
+      <w:r>
+        <w:rPr/>
+        <w:t xml:space="preserve"> (its candidate source) · </w:t>
+      </w:r>
+      <w:r>
+        <w:rPr>
+          <w:color w:val="2E6DB4"/>
+        </w:rPr>
+        <w:t>Sentiment</w:t>
+      </w:r>
+      <w:r>
+        <w:rPr/>
+        <w:t xml:space="preserve"> ·</w:t>
+        <w:br/>
+      </w:r>
+      <w:r>
+        <w:rPr>
+          <w:color w:val="2E6DB4"/>
+        </w:rPr>
+        <w:t>Paper Account</w:t>
+      </w:r>
+      <w:r>
+        <w:rPr/>
+        <w:t xml:space="preserve"> · </w:t>
+      </w:r>
+      <w:r>
+        <w:rPr>
+          <w:color w:val="2E6DB4"/>
+        </w:rPr>
+        <w:t>EOD Report</w:t>
+      </w:r>
+      <w:r>
+        <w:rPr/>
+        <w:t>.</w:t>
+      </w:r>
+    </w:p>
+    <w:p>
+      <w:r>
+        <w:br/>
+      </w:r>
+    </w:p>
+    <w:p>
+      <w:pPr>
+        <w:pStyle w:val="Heading1"/>
+      </w:pPr>
+      <w:r>
+        <w:rPr/>
+        <w:t>ACCOUNT</w:t>
+      </w:r>
+    </w:p>
+    <w:p>
+      <w:r>
+        <w:rPr/>
+        <w:t>Two entries: your real holdings, and the day's results.</w:t>
+      </w:r>
+    </w:p>
+    <w:p>
+      <w:pPr>
+        <w:pStyle w:val="Heading2"/>
+      </w:pPr>
+      <w:r>
+        <w:rPr/>
+        <w:t>Portfolio</w:t>
+      </w:r>
+    </w:p>
+    <w:p>
+      <w:r>
+        <w:rPr>
+          <w:i/>
+        </w:rPr>
+        <w:t xml:space="preserve">Menu: ACCOUNT → Portfolio · Route </w:t>
+      </w:r>
+      <w:r>
+        <w:rPr>
+          <w:rFonts w:ascii="Consolas" w:hAnsi="Consolas"/>
+          <w:color w:val="334455"/>
+          <w:sz w:val="19"/>
+        </w:rPr>
+        <w:t>/portfolio</w:t>
+      </w:r>
+    </w:p>
+    <w:p>
+      <w:pPr>
+        <w:pStyle w:val="Heading3"/>
+      </w:pPr>
+      <w:r>
+        <w:rPr/>
+        <w:t>What it is</w:t>
+      </w:r>
+    </w:p>
+    <w:p>
+      <w:r>
+        <w:rPr/>
+        <w:t xml:space="preserve">Your </w:t>
+      </w:r>
+      <w:r>
+        <w:rPr>
+          <w:b/>
+        </w:rPr>
+        <w:t>real</w:t>
+      </w:r>
+      <w:r>
+        <w:rPr/>
+        <w:t xml:space="preserve"> Schwab holdings — the only place in the app where real money appears. It</w:t>
+        <w:br/>
+        <w:t>is strictly read-only; no action on this page can affect your account.</w:t>
+      </w:r>
+    </w:p>
+    <w:p>
+      <w:pPr>
+        <w:pStyle w:val="Heading3"/>
+      </w:pPr>
+      <w:r>
+        <w:rPr/>
+        <w:t>Where the data comes from</w:t>
+      </w:r>
+    </w:p>
+    <w:tbl>
+      <w:tblPr>
+        <w:tblW w:type="auto" w:w="0"/>
+        <w:jc w:val="left"/>
+        <w:tblLayout w:type="autofit"/>
+        <w:tblLook w:firstColumn="1" w:firstRow="1" w:lastColumn="0" w:lastRow="0" w:noHBand="0" w:noVBand="1" w:val="04A0"/>
+        <w:tblBorders>
+          <w:top w:val="single" w:sz="4" w:space="0" w:color="D8DEE9"/>
+          <w:left w:val="single" w:sz="4" w:space="0" w:color="D8DEE9"/>
+          <w:bottom w:val="single" w:sz="4" w:space="0" w:color="D8DEE9"/>
+          <w:right w:val="single" w:sz="4" w:space="0" w:color="D8DEE9"/>
+          <w:insideH w:val="single" w:sz="4" w:space="0" w:color="D8DEE9"/>
+          <w:insideV w:val="single" w:sz="4" w:space="0" w:color="D8DEE9"/>
+        </w:tblBorders>
+      </w:tblPr>
+      <w:tblGrid>
+        <w:gridCol w:w="4320"/>
+        <w:gridCol w:w="4320"/>
+      </w:tblGrid>
+      <w:tr>
+        <w:tc>
+          <w:tcPr>
+            <w:tcW w:type="dxa" w:w="4320"/>
+            <w:shd w:val="clear" w:color="auto" w:fill="EAF2FB"/>
+          </w:tcPr>
+          <w:p>
+            <w:r>
+              <w:rPr>
+                <w:b/>
+              </w:rPr>
+            </w:r>
+          </w:p>
+        </w:tc>
+        <w:tc>
+          <w:tcPr>
+            <w:tcW w:type="dxa" w:w="4320"/>
+            <w:shd w:val="clear" w:color="auto" w:fill="EAF2FB"/>
+          </w:tcPr>
+          <w:p>
+            <w:r>
+              <w:rPr>
+                <w:b/>
+              </w:rPr>
+            </w:r>
+          </w:p>
+        </w:tc>
+      </w:tr>
+      <w:tr>
+        <w:tc>
+          <w:tcPr>
+            <w:tcW w:type="dxa" w:w="4320"/>
+          </w:tcPr>
+          <w:p>
+            <w:r/>
+            <w:r>
+              <w:rPr/>
+              <w:t>Service</w:t>
+            </w:r>
+          </w:p>
+        </w:tc>
+        <w:tc>
+          <w:tcPr>
+            <w:tcW w:type="dxa" w:w="4320"/>
+          </w:tcPr>
+          <w:p>
+            <w:r/>
+            <w:r>
+              <w:rPr>
+                <w:rFonts w:ascii="Consolas" w:hAnsi="Consolas"/>
+                <w:color w:val="334455"/>
+                <w:sz w:val="19"/>
+              </w:rPr>
+              <w:t>portfolio_svc</w:t>
+            </w:r>
+            <w:r>
+              <w:rPr/>
+              <w:t xml:space="preserve"> (:8212), </w:t>
+            </w:r>
+            <w:r>
+              <w:rPr>
+                <w:rFonts w:ascii="Consolas" w:hAnsi="Consolas"/>
+                <w:color w:val="334455"/>
+                <w:sz w:val="19"/>
+              </w:rPr>
+              <w:t>cache:portfolio:positions</w:t>
+            </w:r>
+          </w:p>
+        </w:tc>
+      </w:tr>
+      <w:tr>
+        <w:tc>
+          <w:tcPr>
+            <w:tcW w:type="dxa" w:w="4320"/>
+            <w:shd w:val="clear" w:color="auto" w:fill="F4F6FA"/>
+          </w:tcPr>
+          <w:p>
+            <w:r/>
+            <w:r>
+              <w:rPr/>
+              <w:t>Live P&amp;L</w:t>
+            </w:r>
+          </w:p>
+        </w:tc>
+        <w:tc>
+          <w:tcPr>
+            <w:tcW w:type="dxa" w:w="4320"/>
+            <w:shd w:val="clear" w:color="auto" w:fill="F4F6FA"/>
+          </w:tcPr>
+          <w:p>
+            <w:r/>
+            <w:r>
+              <w:rPr/>
+              <w:t xml:space="preserve">Streamed from Schwab and republished at most every </w:t>
+            </w:r>
+            <w:r>
+              <w:rPr>
+                <w:b/>
+              </w:rPr>
+              <w:t>2 seconds</w:t>
+            </w:r>
+          </w:p>
+        </w:tc>
+      </w:tr>
+      <w:tr>
+        <w:tc>
+          <w:tcPr>
+            <w:tcW w:type="dxa" w:w="4320"/>
+          </w:tcPr>
+          <w:p>
+            <w:r/>
+            <w:r>
+              <w:rPr/>
+              <w:t>Full rebuild</w:t>
+            </w:r>
+          </w:p>
+        </w:tc>
+        <w:tc>
+          <w:tcPr>
+            <w:tcW w:type="dxa" w:w="4320"/>
+          </w:tcPr>
+          <w:p>
+            <w:r/>
+            <w:r>
+              <w:rPr/>
+              <w:t xml:space="preserve">Every </w:t>
+            </w:r>
+            <w:r>
+              <w:rPr>
+                <w:b/>
+              </w:rPr>
+              <w:t>10 minutes</w:t>
+            </w:r>
+            <w:r>
+              <w:rPr/>
+              <w:t xml:space="preserve"> during market hours (hourly off-hours), or on </w:t>
+            </w:r>
+            <w:r>
+              <w:rPr>
+                <w:b/>
+              </w:rPr>
+              <w:t>Refresh</w:t>
+            </w:r>
+          </w:p>
+        </w:tc>
+      </w:tr>
+    </w:tbl>
+    <w:p/>
+    <w:p>
+      <w:pPr>
+        <w:pStyle w:val="Heading3"/>
+      </w:pPr>
+      <w:r>
+        <w:rPr/>
+        <w:t>Reading the screen</w:t>
+      </w:r>
+    </w:p>
+    <w:p>
+      <w:r>
+        <w:rPr>
+          <w:b/>
+        </w:rPr>
+        <w:t>Three subtabs: Holdings · Sectors · Performance.</w:t>
+      </w:r>
+    </w:p>
+    <w:p>
+      <w:r>
+        <w:rPr>
+          <w:b/>
+        </w:rPr>
+        <w:t>Holdings</w:t>
+      </w:r>
+      <w:r>
+        <w:rPr/>
+        <w:t xml:space="preserve"> — one row per position:</w:t>
+      </w:r>
+    </w:p>
+    <w:tbl>
+      <w:tblPr>
+        <w:tblW w:type="auto" w:w="0"/>
+        <w:jc w:val="left"/>
+        <w:tblLayout w:type="autofit"/>
+        <w:tblLook w:firstColumn="1" w:firstRow="1" w:lastColumn="0" w:lastRow="0" w:noHBand="0" w:noVBand="1" w:val="04A0"/>
+        <w:tblBorders>
+          <w:top w:val="single" w:sz="4" w:space="0" w:color="D8DEE9"/>
+          <w:left w:val="single" w:sz="4" w:space="0" w:color="D8DEE9"/>
+          <w:bottom w:val="single" w:sz="4" w:space="0" w:color="D8DEE9"/>
+          <w:right w:val="single" w:sz="4" w:space="0" w:color="D8DEE9"/>
+          <w:insideH w:val="single" w:sz="4" w:space="0" w:color="D8DEE9"/>
+          <w:insideV w:val="single" w:sz="4" w:space="0" w:color="D8DEE9"/>
+        </w:tblBorders>
+      </w:tblPr>
+      <w:tblGrid>
+        <w:gridCol w:w="4320"/>
+        <w:gridCol w:w="4320"/>
+      </w:tblGrid>
+      <w:tr>
+        <w:tc>
+          <w:tcPr>
+            <w:tcW w:type="dxa" w:w="4320"/>
+            <w:shd w:val="clear" w:color="auto" w:fill="EAF2FB"/>
+          </w:tcPr>
+          <w:p>
+            <w:r>
+              <w:rPr>
+                <w:b/>
+              </w:rPr>
+            </w:r>
+            <w:r>
+              <w:rPr>
+                <w:b/>
+              </w:rPr>
+              <w:t>Column</w:t>
+            </w:r>
+          </w:p>
+        </w:tc>
+        <w:tc>
+          <w:tcPr>
+            <w:tcW w:type="dxa" w:w="4320"/>
+            <w:shd w:val="clear" w:color="auto" w:fill="EAF2FB"/>
+          </w:tcPr>
+          <w:p>
+            <w:r>
+              <w:rPr>
+                <w:b/>
+              </w:rPr>
+            </w:r>
+            <w:r>
+              <w:rPr>
+                <w:b/>
+              </w:rPr>
+              <w:t>Meaning</w:t>
+            </w:r>
+          </w:p>
+        </w:tc>
+      </w:tr>
+      <w:tr>
+        <w:tc>
+          <w:tcPr>
+            <w:tcW w:type="dxa" w:w="4320"/>
+          </w:tcPr>
+          <w:p>
+            <w:r/>
+            <w:r>
+              <w:rPr>
+                <w:b/>
+              </w:rPr>
+              <w:t>SYMBOL</w:t>
+            </w:r>
+          </w:p>
+        </w:tc>
+        <w:tc>
+          <w:tcPr>
+            <w:tcW w:type="dxa" w:w="4320"/>
+          </w:tcPr>
+          <w:p>
+            <w:r/>
+            <w:r>
+              <w:rPr/>
+              <w:t xml:space="preserve">Stock, ETF, or an option contract in OCC format (e.g. </w:t>
+            </w:r>
+            <w:r>
+              <w:rPr>
+                <w:rFonts w:ascii="Consolas" w:hAnsi="Consolas"/>
+                <w:color w:val="334455"/>
+                <w:sz w:val="19"/>
+              </w:rPr>
+              <w:t>IWM 270617C00400000</w:t>
+            </w:r>
+            <w:r>
+              <w:rPr/>
+              <w:t xml:space="preserve"> = IWM, expiring 2027-06-17, Call, strike 400).</w:t>
+            </w:r>
+          </w:p>
+        </w:tc>
+      </w:tr>
+      <w:tr>
+        <w:tc>
+          <w:tcPr>
+            <w:tcW w:type="dxa" w:w="4320"/>
+            <w:shd w:val="clear" w:color="auto" w:fill="F4F6FA"/>
+          </w:tcPr>
+          <w:p>
+            <w:r/>
+            <w:r>
+              <w:rPr>
+                <w:b/>
+              </w:rPr>
+              <w:t>SECTOR</w:t>
+            </w:r>
+          </w:p>
+        </w:tc>
+        <w:tc>
+          <w:tcPr>
+            <w:tcW w:type="dxa" w:w="4320"/>
+            <w:shd w:val="clear" w:color="auto" w:fill="F4F6FA"/>
+          </w:tcPr>
+          <w:p>
+            <w:r/>
+            <w:r>
+              <w:rPr/>
+              <w:t xml:space="preserve">Its sector, or </w:t>
+            </w:r>
+            <w:r>
+              <w:rPr>
+                <w:i/>
+              </w:rPr>
+              <w:t>Unknown</w:t>
+            </w:r>
+            <w:r>
+              <w:rPr/>
+              <w:t xml:space="preserve"> for ETFs and instruments outside the classification.</w:t>
+            </w:r>
+          </w:p>
+        </w:tc>
+      </w:tr>
+      <w:tr>
+        <w:tc>
+          <w:tcPr>
+            <w:tcW w:type="dxa" w:w="4320"/>
+          </w:tcPr>
+          <w:p>
+            <w:r/>
+            <w:r>
+              <w:rPr>
+                <w:b/>
+              </w:rPr>
+              <w:t>QTY</w:t>
+            </w:r>
+            <w:r>
+              <w:rPr/>
+              <w:t xml:space="preserve"> / </w:t>
+            </w:r>
+            <w:r>
+              <w:rPr>
+                <w:b/>
+              </w:rPr>
+              <w:t>MARKET VALUE</w:t>
+            </w:r>
+          </w:p>
+        </w:tc>
+        <w:tc>
+          <w:tcPr>
+            <w:tcW w:type="dxa" w:w="4320"/>
+          </w:tcPr>
+          <w:p>
+            <w:r/>
+            <w:r>
+              <w:rPr/>
+              <w:t>Size and current value.</w:t>
+            </w:r>
+          </w:p>
+        </w:tc>
+      </w:tr>
+      <w:tr>
+        <w:tc>
+          <w:tcPr>
+            <w:tcW w:type="dxa" w:w="4320"/>
+            <w:shd w:val="clear" w:color="auto" w:fill="F4F6FA"/>
+          </w:tcPr>
+          <w:p>
+            <w:r/>
+            <w:r>
+              <w:rPr>
+                <w:b/>
+              </w:rPr>
+              <w:t>DAY P/L</w:t>
+            </w:r>
+          </w:p>
+        </w:tc>
+        <w:tc>
+          <w:tcPr>
+            <w:tcW w:type="dxa" w:w="4320"/>
+            <w:shd w:val="clear" w:color="auto" w:fill="F4F6FA"/>
+          </w:tcPr>
+          <w:p>
+            <w:r/>
+            <w:r>
+              <w:rPr/>
+              <w:t>Today's change. Streams live.</w:t>
+            </w:r>
+          </w:p>
+        </w:tc>
+      </w:tr>
+      <w:tr>
+        <w:tc>
+          <w:tcPr>
+            <w:tcW w:type="dxa" w:w="4320"/>
+          </w:tcPr>
+          <w:p>
+            <w:r/>
+            <w:r>
+              <w:rPr>
+                <w:b/>
+              </w:rPr>
+              <w:t>TOTAL P/L</w:t>
+            </w:r>
+          </w:p>
+        </w:tc>
+        <w:tc>
+          <w:tcPr>
+            <w:tcW w:type="dxa" w:w="4320"/>
+          </w:tcPr>
+          <w:p>
+            <w:r/>
+            <w:r>
+              <w:rPr/>
+              <w:t>Unrealized profit or loss since purchase.</w:t>
+            </w:r>
+          </w:p>
+        </w:tc>
+      </w:tr>
+      <w:tr>
+        <w:tc>
+          <w:tcPr>
+            <w:tcW w:type="dxa" w:w="4320"/>
+            <w:shd w:val="clear" w:color="auto" w:fill="F4F6FA"/>
+          </w:tcPr>
+          <w:p>
+            <w:r/>
+            <w:r>
+              <w:rPr>
+                <w:b/>
+              </w:rPr>
+              <w:t>VS SECTOR (RS)</w:t>
+            </w:r>
+          </w:p>
+        </w:tc>
+        <w:tc>
+          <w:tcPr>
+            <w:tcW w:type="dxa" w:w="4320"/>
+            <w:shd w:val="clear" w:color="auto" w:fill="F4F6FA"/>
+          </w:tcPr>
+          <w:p>
+            <w:r/>
+            <w:r>
+              <w:rPr>
+                <w:b/>
+              </w:rPr>
+              <w:t>The most useful column here.</w:t>
+            </w:r>
+            <w:r>
+              <w:rPr/>
+              <w:t xml:space="preserve"> Relative strength against the position's own sector over 1 day, 1 week and 1 month, indexed to 100. Above 100 = beating its sector.</w:t>
+            </w:r>
+          </w:p>
+        </w:tc>
+      </w:tr>
+      <w:tr>
+        <w:tc>
+          <w:tcPr>
+            <w:tcW w:type="dxa" w:w="4320"/>
+          </w:tcPr>
+          <w:p>
+            <w:r/>
+            <w:r>
+              <w:rPr>
+                <w:b/>
+              </w:rPr>
+              <w:t>SINCE PURCHASE</w:t>
+            </w:r>
+          </w:p>
+        </w:tc>
+        <w:tc>
+          <w:tcPr>
+            <w:tcW w:type="dxa" w:w="4320"/>
+          </w:tcPr>
+          <w:p>
+            <w:r/>
+            <w:r>
+              <w:rPr/>
+              <w:t>Return since you bought it.</w:t>
+            </w:r>
+          </w:p>
+        </w:tc>
+      </w:tr>
+    </w:tbl>
+    <w:p/>
+    <w:p>
+      <w:r>
+        <w:rPr>
+          <w:b/>
+        </w:rPr>
+        <w:t>Sectors</w:t>
+      </w:r>
+      <w:r>
+        <w:rPr/>
+        <w:t xml:space="preserve"> shows your allocation against the S&amp;P — where you are over- and</w:t>
+        <w:br/>
+        <w:t xml:space="preserve">under-weight. </w:t>
+      </w:r>
+      <w:r>
+        <w:rPr>
+          <w:b/>
+        </w:rPr>
+        <w:t>Performance</w:t>
+      </w:r>
+      <w:r>
+        <w:rPr/>
+        <w:t xml:space="preserve"> grades each position and offers per-position commentary.</w:t>
+      </w:r>
+    </w:p>
+    <w:p>
+      <w:r>
+        <w:rPr>
+          <w:b/>
+        </w:rPr>
+        <w:t>Status indicators</w:t>
+      </w:r>
+      <w:r>
+        <w:rPr/>
+        <w:t xml:space="preserve"> at the top show whether the proxy is up and whether the price</w:t>
+        <w:br/>
+        <w:t>stream is live.</w:t>
+      </w:r>
+    </w:p>
+    <w:p>
+      <w:pPr>
+        <w:pStyle w:val="Heading3"/>
+      </w:pPr>
+      <w:r>
+        <w:rPr/>
+        <w:t>Why it matters</w:t>
+      </w:r>
+    </w:p>
+    <w:p>
+      <w:r>
+        <w:rPr>
+          <w:b/>
+        </w:rPr>
+        <w:t>VS SECTOR is the column to read.</w:t>
+      </w:r>
+      <w:r>
+        <w:rPr/>
+        <w:t xml:space="preserve"> A position up 8% in a sector up 15% is a </w:t>
+      </w:r>
+      <w:r>
+        <w:rPr>
+          <w:i/>
+        </w:rPr>
+        <w:t>losing</w:t>
+      </w:r>
+      <w:r>
+        <w:rPr/>
+        <w:br/>
+        <w:t>position in the only sense that matters — you would have done better owning the sector</w:t>
+        <w:br/>
+        <w:t>ETF. Absolute P&amp;L cannot show you that; this can, over three horizons at once.</w:t>
+      </w:r>
+    </w:p>
+    <w:p>
+      <w:r>
+        <w:rPr/>
+        <w:t>The Sectors tab answers a different question: concentration. Most self-directed</w:t>
+        <w:br/>
+        <w:t>portfolios are far more concentrated than their owner believes, usually in technology,</w:t>
+        <w:br/>
+        <w:t>and seeing the weight against the index is the fastest correction to that.</w:t>
+      </w:r>
+    </w:p>
+    <w:p>
+      <w:r>
+        <w:rPr>
+          <w:b/>
+        </w:rPr>
+        <w:t>Where it is weak.</w:t>
+      </w:r>
+      <w:r>
+        <w:rPr/>
+        <w:t xml:space="preserve"> Expired or worthless option positions show a market value of</w:t>
+        <w:br/>
+        <w:t>$0.00 while retaining their historical loss, which can make the totals read oddly. The</w:t>
+        <w:br/>
+        <w:t>sector classification is missing for many ETFs and crypto-linked products, so those rows</w:t>
+        <w:br/>
+        <w:t xml:space="preserve">show </w:t>
+      </w:r>
+      <w:r>
+        <w:rPr>
+          <w:i/>
+        </w:rPr>
+        <w:t>Unknown</w:t>
+      </w:r>
+      <w:r>
+        <w:rPr/>
+        <w:t xml:space="preserve"> and no relative strength.</w:t>
+      </w:r>
+    </w:p>
+    <w:p>
+      <w:pPr>
+        <w:pStyle w:val="Heading3"/>
+      </w:pPr>
+      <w:r>
+        <w:rPr/>
+        <w:t>When to use it</w:t>
+      </w:r>
+    </w:p>
+    <w:p>
+      <w:r>
+        <w:rPr/>
+        <w:t>Daily for the P&amp;L weekly for the Sectors and Performance tabs, which is where the</w:t>
+        <w:br/>
+        <w:t>useful decisions are.</w:t>
+      </w:r>
+    </w:p>
+    <w:p>
+      <w:pPr>
+        <w:pStyle w:val="Heading3"/>
+      </w:pPr>
+      <w:r>
+        <w:rPr/>
+        <w:t>Related pages</w:t>
+      </w:r>
+    </w:p>
+    <w:p>
+      <w:r>
+        <w:rPr>
+          <w:color w:val="2E6DB4"/>
+        </w:rPr>
         <w:t>Sector &amp; Industry</w:t>
       </w:r>
       <w:r>
@@ -25191,7 +26247,7 @@
         <w:rPr>
           <w:color w:val="2E6DB4"/>
         </w:rPr>
-        <w:t>Trade Analyzer</w:t>
+        <w:t>Overview</w:t>
       </w:r>
       <w:r>
         <w:rPr/>

</xml_diff>

<commit_message>
docs(manuals): the desk's tiles now explain themselves on hover
The Reference Guide's Overview section says so, and leads with the two labels
that prompted the work — that LONG CLEARED is permission rather than a
recommendation, and that SHORT RELATIVE ONLY follows from the model predicting
a lag against the index rather than a fall.

Co-Authored-By: Claude Fable 5 <noreply@anthropic.com>
</commit_message>
<xml_diff>
--- a/docs/manuals/reference-guide/reference-guide.docx
+++ b/docs/manuals/reference-guide/reference-guide.docx
@@ -32,7 +32,7 @@
           <w:color w:val="5B6678"/>
           <w:sz w:val="18"/>
         </w:rPr>
-        <w:t>WebGUI Trading with Schwab · Generated 2026-08-22</w:t>
+        <w:t>WebGUI Trading with Schwab · Generated 2026-08-23</w:t>
       </w:r>
     </w:p>
     <w:p/>
@@ -22951,6 +22951,58 @@
         <w:t>committed symbol and opens the result in a new tab when it lands; the cache version is</w:t>
         <w:br/>
         <w:t>baselined at click time, so a stale report from an earlier run never opens a tab.</w:t>
+      </w:r>
+    </w:p>
+    <w:p>
+      <w:r>
+        <w:rPr>
+          <w:b/>
+        </w:rPr>
+        <w:t>Hover anything you do not recognise.</w:t>
+      </w:r>
+      <w:r>
+        <w:rPr/>
+        <w:t xml:space="preserve"> Every tile on these four screens</w:t>
+        <w:br/>
+        <w:t>carries its own plain-English explanation on hover: the clearance chips and side</w:t>
+        <w:br/>
+        <w:t>cards, each factor name, every table column on the Rank board and the Evidence</w:t>
+        <w:br/>
+        <w:t>screen, the trade-plan rows, the dealer levels, the panel titles and the two</w:t>
+        <w:br/>
+        <w:t>report buttons. The explanations say what the number is and where it misleads,</w:t>
+        <w:br/>
+        <w:t xml:space="preserve">not just what it is called - so </w:t>
+      </w:r>
+      <w:r>
+        <w:rPr>
+          <w:rFonts w:ascii="Consolas" w:hAnsi="Consolas"/>
+          <w:color w:val="334455"/>
+          <w:sz w:val="19"/>
+        </w:rPr>
+        <w:t>LONG CLEARED</w:t>
+      </w:r>
+      <w:r>
+        <w:rPr/>
+        <w:t xml:space="preserve"> explains that it is permission</w:t>
+        <w:br/>
+        <w:t xml:space="preserve">rather than a recommendation, and </w:t>
+      </w:r>
+      <w:r>
+        <w:rPr>
+          <w:rFonts w:ascii="Consolas" w:hAnsi="Consolas"/>
+          <w:color w:val="334455"/>
+          <w:sz w:val="19"/>
+        </w:rPr>
+        <w:t>SHORT RELATIVE ONLY</w:t>
+      </w:r>
+      <w:r>
+        <w:rPr/>
+        <w:t xml:space="preserve"> explains that the model</w:t>
+        <w:br/>
+        <w:t>predicts a LAG against the index rather than a fall, which is why a plain short</w:t>
+        <w:br/>
+        <w:t>on a correct read can still lose money.</w:t>
       </w:r>
     </w:p>
     <w:p>

</xml_diff>

<commit_message>
docs(manuals): the Position card recommends now, and says how much to trust it
The Reference Guide leads with the part a reader can most easily get wrong:
the action is not the model's verdict, it is the verdict combined with what
the market permits — which is why a bottom-ranked name can read "Pair short"
rather than "Sell short".

It also explains the confidence chip as distance from a coin flip rather than
a raw percentage, since that is what makes a 44% hit rate a strong short-side
reading instead of a weak one.

Co-Authored-By: Claude Fable 5 <noreply@anthropic.com>
</commit_message>
<xml_diff>
--- a/docs/manuals/reference-guide/reference-guide.docx
+++ b/docs/manuals/reference-guide/reference-guide.docx
@@ -23508,9 +23508,71 @@
       </w:r>
       <w:r>
         <w:rPr/>
-        <w:t xml:space="preserve"> shows a band reading on a rail rather than a verdict word, because the</w:t>
-        <w:br/>
-        <w:t xml:space="preserve">model's output is a rank. </w:t>
+        <w:t xml:space="preserve"> leads with a RECOMMENDATION - an action, a confidence chip and one</w:t>
+        <w:br/>
+        <w:t>line saying what to do - and keeps the ranking underneath as information.</w:t>
+      </w:r>
+    </w:p>
+    <w:p>
+      <w:r>
+        <w:rPr>
+          <w:b/>
+        </w:rPr>
+        <w:t>The action is not the model's verdict.</w:t>
+      </w:r>
+      <w:r>
+        <w:rPr/>
+        <w:t xml:space="preserve"> It combines the verdict with what the</w:t>
+        <w:br/>
+        <w:t>broad market permits, which is why a name the model ranks at the very bottom can</w:t>
+        <w:br/>
+        <w:t>read "Pair short" rather than "Sell short": the model predicts the stock will LAG</w:t>
+        <w:br/>
+        <w:t>the index, and in a rising market a stock can lag and still go up. The six actions</w:t>
+        <w:br/>
+        <w:t>are Buy, Buy paired, Sell short, Pair short, Stand aside and No trade.</w:t>
+      </w:r>
+    </w:p>
+    <w:p>
+      <w:r>
+        <w:rPr>
+          <w:b/>
+        </w:rPr>
+        <w:t>Read the confidence chip with the action, not after it.</w:t>
+      </w:r>
+      <w:r>
+        <w:rPr/>
+        <w:t xml:space="preserve"> It is the band's own</w:t>
+        <w:br/>
+        <w:t>historical hit rate expressed as DISTANCE from a coin flip - so a band that beat</w:t>
+        <w:br/>
+        <w:t>the index only 44% of the time reads Moderate on the short side, because lagging</w:t>
+        <w:br/>
+        <w:t>is what that side predicted. Moderate means at least 5 percentage points from</w:t>
+        <w:br/>
+        <w:t>50/50, Low at least 2, Very low is within noise. Even Moderate is a small edge; it</w:t>
+        <w:br/>
+        <w:t>shows up across many trades rather than in any one, so it argues about sizing more</w:t>
+        <w:br/>
+        <w:t>than about picking.</w:t>
+      </w:r>
+    </w:p>
+    <w:p>
+      <w:r>
+        <w:rPr/>
+        <w:t>The amber line beneath states what share of the model's weight sits on volatility</w:t>
+        <w:br/>
+        <w:t>factors. It used to appear only on the Evidence screen - a card that merely ranked</w:t>
+        <w:br/>
+        <w:t>could afford that, one that says "Buy" cannot.</w:t>
+      </w:r>
+    </w:p>
+    <w:p>
+      <w:r>
+        <w:rPr/>
+        <w:t>The ranking still appears below the rule, on the same rail: the band, the</w:t>
+        <w:br/>
+        <w:t xml:space="preserve">calibrated expectation against the S&amp;P over 20 trading days, and the hit rate. </w:t>
       </w:r>
       <w:r>
         <w:rPr>

</xml_diff>

<commit_message>
docs: the app stops saying earnings surprises are unavailable
The Reference Guide, the nav hover guide and the module docstring all stated
that Schwab publishes no surprises so the component can never score. The first
half is still true and the conclusion no longer is: Alpha Vantage supplies the
history, so the row scores.

Each now says what the row measures — the last four quarters of surprises,
four beats being the strongest reading and a recent miss the weakest — where
the data comes from and why, and what a zero means now that it is no longer
structural: a genuinely mixed record, or a symbol the vendor has no history
for, which the row cannot tell apart.

Guidance and free cash flow are still absent everywhere, and all three still
say so.

Co-Authored-By: Claude Fable 5 <noreply@anthropic.com>
</commit_message>
<xml_diff>
--- a/docs/manuals/reference-guide/reference-guide.docx
+++ b/docs/manuals/reference-guide/reference-guide.docx
@@ -23626,31 +23626,55 @@
       </w:r>
       <w:r>
         <w:rPr/>
-        <w:t xml:space="preserve"> with no bar, never a zero-length one. </w:t>
-      </w:r>
-      <w:r>
-        <w:rPr>
-          <w:b/>
-        </w:rPr>
-        <w:t>Earnings trajectory is</w:t>
-        <w:br/>
-        <w:t>a special case and always reads "not published by Schwab".</w:t>
-      </w:r>
-      <w:r>
-        <w:rPr/>
-        <w:t xml:space="preserve"> Schwab's fundamentals</w:t>
-        <w:br/>
-        <w:t>payload carries 56 fields and neither earnings surprises nor company guidance, so both</w:t>
-        <w:br/>
-        <w:t>of that component's inputs are missing and it contributes exactly 0 for every symbol -</w:t>
-        <w:br/>
-        <w:t>15 of the score's 100 points are off the table before any stock is examined. Free cash</w:t>
-        <w:br/>
-        <w:t>flow is absent for the same reason, so the check that would cap a stock at HOLD on</w:t>
-        <w:br/>
-        <w:t>negative cash flow can never fire. Read a middling Long Term score against what could</w:t>
-        <w:br/>
-        <w:t>have contributed, not as a verdict on the company.</w:t>
+        <w:t xml:space="preserve"> with no bar, never a zero-length one.</w:t>
+      </w:r>
+    </w:p>
+    <w:p>
+      <w:r>
+        <w:rPr>
+          <w:b/>
+        </w:rPr>
+        <w:t>Earnings trajectory scores the last four quarters of earnings surprises.</w:t>
+      </w:r>
+      <w:r>
+        <w:rPr/>
+        <w:t xml:space="preserve"> Four</w:t>
+        <w:br/>
+        <w:t>clear beats in a row is the strongest reading; a miss in the most recent quarter is</w:t>
+        <w:br/>
+        <w:t xml:space="preserve">the weakest, whatever came before it. That history comes from </w:t>
+      </w:r>
+      <w:r>
+        <w:rPr>
+          <w:b/>
+        </w:rPr>
+        <w:t>Alpha Vantage</w:t>
+      </w:r>
+      <w:r>
+        <w:rPr/>
+        <w:t>, not</w:t>
+        <w:br/>
+        <w:t>Schwab - Schwab's fundamentals payload carries 56 fields and no surprises at all,</w:t>
+        <w:br/>
+        <w:t>which is why this row contributed exactly 0 for every stock until that source was</w:t>
+        <w:br/>
+        <w:t>wired in. Forward guidance is still unavailable from any source here, so the</w:t>
+        <w:br/>
+        <w:t>component scores on the surprise record alone rather than averaging in a permanent</w:t>
+        <w:br/>
+        <w:t>zero, which used to halve it.</w:t>
+      </w:r>
+    </w:p>
+    <w:p>
+      <w:r>
+        <w:rPr/>
+        <w:t>A zero on that row now means what a zero means anywhere else - a genuinely mixed</w:t>
+        <w:br/>
+        <w:t>record - or that the vendor holds no history for the symbol, which the row cannot</w:t>
+        <w:br/>
+        <w:t>tell apart. Free cash flow is still absent, so the check that would cap a stock at</w:t>
+        <w:br/>
+        <w:t>HOLD on negative cash flow can never fire.</w:t>
       </w:r>
     </w:p>
     <w:p>

</xml_diff>

<commit_message>
feat(sentiment): name the Market Trend in flight words, with a hover picture
Bull / Weak Bull / Neutral / Resilient / Bear -> Climbing / Stalling /
Circling / Gliding / Diving, on the /sentiment console pill, the Desk pill
and the phone snapshot. Resilient (lack_of_bearishness) mostly showed
beside a trend score in its bearish band - two of its three grid cells are
<= 40 - so the word contradicted the number next to it. Each flight word
names the direction AND whether there is force behind it, the classifier's
two axes. Display only: the state keys are unchanged.

Hovering the word now shows its picture (sentiment.TREND_PICTURE), hung by
one helper, console_cards.pill_tooltip, on both pills so the two screens
describe one word identically.

The phone snapshot's copy of the word list is now pinned to the page's by
test_cross_tier_mirrors (watched failing with only one side changed).

Co-Authored-By: Claude Opus 5 <noreply@anthropic.com>
</commit_message>
<xml_diff>
--- a/docs/manuals/reference-guide/reference-guide.docx
+++ b/docs/manuals/reference-guide/reference-guide.docx
@@ -32,7 +32,7 @@
           <w:color w:val="5B6678"/>
           <w:sz w:val="18"/>
         </w:rPr>
-        <w:t>NeuralStrike · Generated 2026-09-07</w:t>
+        <w:t>NeuralStrike · Generated 2026-09-10</w:t>
       </w:r>
     </w:p>
     <w:p/>
@@ -9857,7 +9857,33 @@
         <w:rPr/>
         <w:t>) and the trend ring</w:t>
         <w:br/>
-        <w:t>shows a five-state label from the direction-and-aggression vocabulary:</w:t>
+        <w:t>shows a five-state label from the direction-and-aggression vocabulary. The labels</w:t>
+        <w:br/>
+        <w:t xml:space="preserve">are flight words: each one names the direction </w:t>
+      </w:r>
+      <w:r>
+        <w:rPr>
+          <w:i/>
+        </w:rPr>
+        <w:t>and</w:t>
+      </w:r>
+      <w:r>
+        <w:rPr/>
+        <w:t xml:space="preserve"> whether there is force behind</w:t>
+        <w:br/>
+        <w:t xml:space="preserve">it (engine on or off), which are the two things the classifier measures. </w:t>
+      </w:r>
+      <w:r>
+        <w:rPr>
+          <w:b/>
+        </w:rPr>
+        <w:t>Hover</w:t>
+        <w:br/>
+        <w:t>the word</w:t>
+      </w:r>
+      <w:r>
+        <w:rPr/>
+        <w:t xml:space="preserve"> and it shows its picture:</w:t>
       </w:r>
     </w:p>
     <w:tbl>
@@ -9876,14 +9902,15 @@
         </w:tblBorders>
       </w:tblPr>
       <w:tblGrid>
-        <w:gridCol w:w="2880"/>
-        <w:gridCol w:w="2880"/>
-        <w:gridCol w:w="2880"/>
+        <w:gridCol w:w="2160"/>
+        <w:gridCol w:w="2160"/>
+        <w:gridCol w:w="2160"/>
+        <w:gridCol w:w="2160"/>
       </w:tblGrid>
       <w:tr>
         <w:tc>
           <w:tcPr>
-            <w:tcW w:type="dxa" w:w="2880"/>
+            <w:tcW w:type="dxa" w:w="2160"/>
             <w:shd w:val="clear" w:color="auto" w:fill="EAF2FB"/>
           </w:tcPr>
           <w:p>
@@ -9902,7 +9929,7 @@
         </w:tc>
         <w:tc>
           <w:tcPr>
-            <w:tcW w:type="dxa" w:w="2880"/>
+            <w:tcW w:type="dxa" w:w="2160"/>
             <w:shd w:val="clear" w:color="auto" w:fill="EAF2FB"/>
           </w:tcPr>
           <w:p>
@@ -9915,13 +9942,32 @@
               <w:rPr>
                 <w:b/>
               </w:rPr>
-              <w:t>Meaning</w:t>
-            </w:r>
-          </w:p>
-        </w:tc>
-        <w:tc>
-          <w:tcPr>
-            <w:tcW w:type="dxa" w:w="2880"/>
+              <w:t>State</w:t>
+            </w:r>
+          </w:p>
+        </w:tc>
+        <w:tc>
+          <w:tcPr>
+            <w:tcW w:type="dxa" w:w="2160"/>
+            <w:shd w:val="clear" w:color="auto" w:fill="EAF2FB"/>
+          </w:tcPr>
+          <w:p>
+            <w:r>
+              <w:rPr>
+                <w:b/>
+              </w:rPr>
+            </w:r>
+            <w:r>
+              <w:rPr>
+                <w:b/>
+              </w:rPr>
+              <w:t>The picture (the hover text)</w:t>
+            </w:r>
+          </w:p>
+        </w:tc>
+        <w:tc>
+          <w:tcPr>
+            <w:tcW w:type="dxa" w:w="2160"/>
             <w:shd w:val="clear" w:color="auto" w:fill="EAF2FB"/>
           </w:tcPr>
           <w:p>
@@ -9942,7 +9988,7 @@
       <w:tr>
         <w:tc>
           <w:tcPr>
-            <w:tcW w:type="dxa" w:w="2880"/>
+            <w:tcW w:type="dxa" w:w="2160"/>
           </w:tcPr>
           <w:p>
             <w:r/>
@@ -9950,25 +9996,37 @@
               <w:rPr>
                 <w:b/>
               </w:rPr>
-              <w:t>Bull</w:t>
-            </w:r>
-          </w:p>
-        </w:tc>
-        <w:tc>
-          <w:tcPr>
-            <w:tcW w:type="dxa" w:w="2880"/>
-          </w:tcPr>
-          <w:p>
-            <w:r/>
-            <w:r>
-              <w:rPr/>
-              <w:t>Direction up, buyers aggressive</w:t>
-            </w:r>
-          </w:p>
-        </w:tc>
-        <w:tc>
-          <w:tcPr>
-            <w:tcW w:type="dxa" w:w="2880"/>
+              <w:t>Climbing</w:t>
+            </w:r>
+          </w:p>
+        </w:tc>
+        <w:tc>
+          <w:tcPr>
+            <w:tcW w:type="dxa" w:w="2160"/>
+          </w:tcPr>
+          <w:p>
+            <w:r/>
+            <w:r>
+              <w:rPr/>
+              <w:t>Bullish</w:t>
+            </w:r>
+          </w:p>
+        </w:tc>
+        <w:tc>
+          <w:tcPr>
+            <w:tcW w:type="dxa" w:w="2160"/>
+          </w:tcPr>
+          <w:p>
+            <w:r/>
+            <w:r>
+              <w:rPr/>
+              <w:t>Engine on, gaining height: buyers are pushing and price is rising.</w:t>
+            </w:r>
+          </w:p>
+        </w:tc>
+        <w:tc>
+          <w:tcPr>
+            <w:tcW w:type="dxa" w:w="2160"/>
           </w:tcPr>
           <w:p>
             <w:r/>
@@ -9982,7 +10040,7 @@
       <w:tr>
         <w:tc>
           <w:tcPr>
-            <w:tcW w:type="dxa" w:w="2880"/>
+            <w:tcW w:type="dxa" w:w="2160"/>
             <w:shd w:val="clear" w:color="auto" w:fill="F4F6FA"/>
           </w:tcPr>
           <w:p>
@@ -9991,26 +10049,39 @@
               <w:rPr>
                 <w:b/>
               </w:rPr>
-              <w:t>Weak Bull</w:t>
-            </w:r>
-          </w:p>
-        </w:tc>
-        <w:tc>
-          <w:tcPr>
-            <w:tcW w:type="dxa" w:w="2880"/>
+              <w:t>Stalling</w:t>
+            </w:r>
+          </w:p>
+        </w:tc>
+        <w:tc>
+          <w:tcPr>
+            <w:tcW w:type="dxa" w:w="2160"/>
             <w:shd w:val="clear" w:color="auto" w:fill="F4F6FA"/>
           </w:tcPr>
           <w:p>
             <w:r/>
             <w:r>
               <w:rPr/>
-              <w:t>Up, but buyers are not pressing</w:t>
-            </w:r>
-          </w:p>
-        </w:tc>
-        <w:tc>
-          <w:tcPr>
-            <w:tcW w:type="dxa" w:w="2880"/>
+              <w:t>Lack of Bullishness</w:t>
+            </w:r>
+          </w:p>
+        </w:tc>
+        <w:tc>
+          <w:tcPr>
+            <w:tcW w:type="dxa" w:w="2160"/>
+            <w:shd w:val="clear" w:color="auto" w:fill="F4F6FA"/>
+          </w:tcPr>
+          <w:p>
+            <w:r/>
+            <w:r>
+              <w:rPr/>
+              <w:t>Nose still up but losing lift: price is high and the buying has run out. A stall comes before a drop.</w:t>
+            </w:r>
+          </w:p>
+        </w:tc>
+        <w:tc>
+          <w:tcPr>
+            <w:tcW w:type="dxa" w:w="2160"/>
             <w:shd w:val="clear" w:color="auto" w:fill="F4F6FA"/>
           </w:tcPr>
           <w:p>
@@ -10025,7 +10096,7 @@
       <w:tr>
         <w:tc>
           <w:tcPr>
-            <w:tcW w:type="dxa" w:w="2880"/>
+            <w:tcW w:type="dxa" w:w="2160"/>
           </w:tcPr>
           <w:p>
             <w:r/>
@@ -10033,25 +10104,37 @@
               <w:rPr>
                 <w:b/>
               </w:rPr>
+              <w:t>Circling</w:t>
+            </w:r>
+          </w:p>
+        </w:tc>
+        <w:tc>
+          <w:tcPr>
+            <w:tcW w:type="dxa" w:w="2160"/>
+          </w:tcPr>
+          <w:p>
+            <w:r/>
+            <w:r>
+              <w:rPr/>
               <w:t>Neutral</w:t>
             </w:r>
           </w:p>
         </w:tc>
         <w:tc>
           <w:tcPr>
-            <w:tcW w:type="dxa" w:w="2880"/>
-          </w:tcPr>
-          <w:p>
-            <w:r/>
-            <w:r>
-              <w:rPr/>
-              <w:t>No directional edge</w:t>
-            </w:r>
-          </w:p>
-        </w:tc>
-        <w:tc>
-          <w:tcPr>
-            <w:tcW w:type="dxa" w:w="2880"/>
+            <w:tcW w:type="dxa" w:w="2160"/>
+          </w:tcPr>
+          <w:p>
+            <w:r/>
+            <w:r>
+              <w:rPr/>
+              <w:t>Holding pattern, waiting for clearance: buyers and sellers are balanced.</w:t>
+            </w:r>
+          </w:p>
+        </w:tc>
+        <w:tc>
+          <w:tcPr>
+            <w:tcW w:type="dxa" w:w="2160"/>
           </w:tcPr>
           <w:p>
             <w:r/>
@@ -10065,7 +10148,7 @@
       <w:tr>
         <w:tc>
           <w:tcPr>
-            <w:tcW w:type="dxa" w:w="2880"/>
+            <w:tcW w:type="dxa" w:w="2160"/>
             <w:shd w:val="clear" w:color="auto" w:fill="F4F6FA"/>
           </w:tcPr>
           <w:p>
@@ -10074,26 +10157,39 @@
               <w:rPr>
                 <w:b/>
               </w:rPr>
-              <w:t>Resilient</w:t>
-            </w:r>
-          </w:p>
-        </w:tc>
-        <w:tc>
-          <w:tcPr>
-            <w:tcW w:type="dxa" w:w="2880"/>
+              <w:t>Gliding</w:t>
+            </w:r>
+          </w:p>
+        </w:tc>
+        <w:tc>
+          <w:tcPr>
+            <w:tcW w:type="dxa" w:w="2160"/>
             <w:shd w:val="clear" w:color="auto" w:fill="F4F6FA"/>
           </w:tcPr>
           <w:p>
             <w:r/>
             <w:r>
               <w:rPr/>
-              <w:t>Refuses to fall despite pressure; puts cheap and undefended</w:t>
-            </w:r>
-          </w:p>
-        </w:tc>
-        <w:tc>
-          <w:tcPr>
-            <w:tcW w:type="dxa" w:w="2880"/>
+              <w:t>Lack of Bearishness</w:t>
+            </w:r>
+          </w:p>
+        </w:tc>
+        <w:tc>
+          <w:tcPr>
+            <w:tcW w:type="dxa" w:w="2160"/>
+            <w:shd w:val="clear" w:color="auto" w:fill="F4F6FA"/>
+          </w:tcPr>
+          <w:p>
+            <w:r/>
+            <w:r>
+              <w:rPr/>
+              <w:t>Coming down with the engine off: lower, but nobody is pushing it. A glide ends on a runway — a floor is forming.</w:t>
+            </w:r>
+          </w:p>
+        </w:tc>
+        <w:tc>
+          <w:tcPr>
+            <w:tcW w:type="dxa" w:w="2160"/>
             <w:shd w:val="clear" w:color="auto" w:fill="F4F6FA"/>
           </w:tcPr>
           <w:p>
@@ -10108,7 +10204,7 @@
       <w:tr>
         <w:tc>
           <w:tcPr>
-            <w:tcW w:type="dxa" w:w="2880"/>
+            <w:tcW w:type="dxa" w:w="2160"/>
           </w:tcPr>
           <w:p>
             <w:r/>
@@ -10116,25 +10212,37 @@
               <w:rPr>
                 <w:b/>
               </w:rPr>
-              <w:t>Bear</w:t>
-            </w:r>
-          </w:p>
-        </w:tc>
-        <w:tc>
-          <w:tcPr>
-            <w:tcW w:type="dxa" w:w="2880"/>
-          </w:tcPr>
-          <w:p>
-            <w:r/>
-            <w:r>
-              <w:rPr/>
-              <w:t>Direction down, sellers aggressive</w:t>
-            </w:r>
-          </w:p>
-        </w:tc>
-        <w:tc>
-          <w:tcPr>
-            <w:tcW w:type="dxa" w:w="2880"/>
+              <w:t>Diving</w:t>
+            </w:r>
+          </w:p>
+        </w:tc>
+        <w:tc>
+          <w:tcPr>
+            <w:tcW w:type="dxa" w:w="2160"/>
+          </w:tcPr>
+          <w:p>
+            <w:r/>
+            <w:r>
+              <w:rPr/>
+              <w:t>Bearish</w:t>
+            </w:r>
+          </w:p>
+        </w:tc>
+        <w:tc>
+          <w:tcPr>
+            <w:tcW w:type="dxa" w:w="2160"/>
+          </w:tcPr>
+          <w:p>
+            <w:r/>
+            <w:r>
+              <w:rPr/>
+              <w:t>Nose down under power: urgent selling.</w:t>
+            </w:r>
+          </w:p>
+        </w:tc>
+        <w:tc>
+          <w:tcPr>
+            <w:tcW w:type="dxa" w:w="2160"/>
           </w:tcPr>
           <w:p>
             <w:r/>

</xml_diff>

<commit_message>
feat(market_svc): the Desk summary is written in plain English
The prompt no longer asks for the screen words verbatim. It asks for plain everyday English that says what the six readings mean, with no app labels, scores, decimals or size multipliers - the chips under the sentence carry those. Simple counts and standard options terms stay. Same call, same change-driven trigger. The prompt test now requires plain everyday English and forbids verbatim. Docs updated; the User and Reference guides rebuilt.

Co-Authored-By: Claude Opus 5 <noreply@anthropic.com>
</commit_message>
<xml_diff>
--- a/docs/manuals/reference-guide/reference-guide.docx
+++ b/docs/manuals/reference-guide/reference-guide.docx
@@ -2911,7 +2911,23 @@
       </w:r>
       <w:r>
         <w:rPr/>
-        <w:t xml:space="preserve"> timestamp.</w:t>
+        <w:t xml:space="preserve"> timestamp. It is written in </w:t>
+      </w:r>
+      <w:r>
+        <w:rPr>
+          <w:b/>
+        </w:rPr>
+        <w:t>plain</w:t>
+        <w:br/>
+        <w:t>everyday English</w:t>
+      </w:r>
+      <w:r>
+        <w:rPr/>
+        <w:t>: it says what the readings mean rather than repeating the</w:t>
+        <w:br/>
+        <w:t>app's labels, scores or position sizes (the chips under it carry those), keeping</w:t>
+        <w:br/>
+        <w:t>only simple counts and standard options terms such as "put credit spreads".</w:t>
       </w:r>
     </w:p>
     <w:p>

</xml_diff>

<commit_message>
fix(market_svc): accuracy first, and never a cut-off summary sentence
The 20:42 CT sentence called put credit spreads bearish trades (they are bullish-to-neutral) and ended mid-word, because a 400-character slice cut it. The prompt now leads with accuracy is paramount, states each strategy's real direction and asks for conflicting readings to be named, not blended. generate_summary withholds a reply that ties a credit spread to the wrong direction, never shortens a finished reply, trims one that ran out of room to its complete sentences, and withholds one with none; a withheld reply keeps the last good sentence and is retried after the gap. _SUMMARY_MAX_CHARS is gone.

Co-Authored-By: Claude Opus 5 <noreply@anthropic.com>
</commit_message>
<xml_diff>
--- a/docs/manuals/reference-guide/reference-guide.docx
+++ b/docs/manuals/reference-guide/reference-guide.docx
@@ -2897,11 +2897,11 @@
         <w:rPr/>
         <w:t xml:space="preserve"> Full width, across the bottom. One Claude-written sentence (at</w:t>
         <w:br/>
-        <w:t>most two, at most 350 characters) consolidating the six readings above it —</w:t>
-        <w:br/>
-        <w:t>Sentiment, Trend, Bias, Signal, Regime, Bull/Bear — and closing with a trading</w:t>
-        <w:br/>
-        <w:t xml:space="preserve">posture, next to an </w:t>
+        <w:t>most two, always shown complete — never cut off mid-sentence) consolidating the</w:t>
+        <w:br/>
+        <w:t>six readings above it — Sentiment, Trend, Bias, Signal, Regime, Bull/Bear — and</w:t>
+        <w:br/>
+        <w:t xml:space="preserve">closing with a trading posture, next to an </w:t>
       </w:r>
       <w:r>
         <w:rPr>
@@ -2911,23 +2911,41 @@
       </w:r>
       <w:r>
         <w:rPr/>
-        <w:t xml:space="preserve"> timestamp. It is written in </w:t>
-      </w:r>
-      <w:r>
-        <w:rPr>
-          <w:b/>
-        </w:rPr>
-        <w:t>plain</w:t>
-        <w:br/>
-        <w:t>everyday English</w:t>
-      </w:r>
-      <w:r>
-        <w:rPr/>
-        <w:t>: it says what the readings mean rather than repeating the</w:t>
-        <w:br/>
-        <w:t>app's labels, scores or position sizes (the chips under it carry those), keeping</w:t>
-        <w:br/>
-        <w:t>only simple counts and standard options terms such as "put credit spreads".</w:t>
+        <w:t xml:space="preserve"> timestamp. It is</w:t>
+        <w:br/>
+        <w:t xml:space="preserve">written in </w:t>
+      </w:r>
+      <w:r>
+        <w:rPr>
+          <w:b/>
+        </w:rPr>
+        <w:t>plain everyday English</w:t>
+      </w:r>
+      <w:r>
+        <w:rPr/>
+        <w:t>: it says what the readings mean rather than</w:t>
+        <w:br/>
+        <w:t>repeating the app's labels, scores or position sizes (the chips under it carry</w:t>
+        <w:br/>
+        <w:t>those), keeping only simple counts and standard options terms such as "put credit</w:t>
+        <w:br/>
+        <w:t xml:space="preserve">spreads". </w:t>
+      </w:r>
+      <w:r>
+        <w:rPr>
+          <w:b/>
+        </w:rPr>
+        <w:t>Accuracy comes first</w:t>
+      </w:r>
+      <w:r>
+        <w:rPr/>
+        <w:t>: the prompt states each strategy's real</w:t>
+        <w:br/>
+        <w:t>direction (a put credit spread is bullish-to-neutral, a call credit spread</w:t>
+        <w:br/>
+        <w:t>bearish-to-neutral), and a sentence that ties a credit spread to the wrong</w:t>
+        <w:br/>
+        <w:t>direction is withheld rather than shown — the previous sentence stays up.</w:t>
       </w:r>
     </w:p>
     <w:p>

</xml_diff>

<commit_message>
feat(market): add IYT to the Thematic / Industry ETF frame
The iShares Transportation Average ETF joins the Market Dashboard as a
Thematic tile (69 -> 70 tiles). It counts in the rail's advance/decline
meter because breadth_counts reads every tile in the four equity frames;
a new webgui test drives that from market_svc's build_dashboard so moving
IYT out of a counted frame fails.

Co-Authored-By: Claude Opus 5 <noreply@anthropic.com>
</commit_message>
<xml_diff>
--- a/docs/manuals/reference-guide/reference-guide.docx
+++ b/docs/manuals/reference-guide/reference-guide.docx
@@ -32,7 +32,7 @@
           <w:color w:val="5B6678"/>
           <w:sz w:val="18"/>
         </w:rPr>
-        <w:t>NeuralStrike · Generated 2026-09-10</w:t>
+        <w:t>NeuralStrike · Generated 2026-09-11</w:t>
       </w:r>
     </w:p>
     <w:p/>
@@ -8857,7 +8857,7 @@
             <w:r/>
             <w:r>
               <w:rPr/>
-              <w:t>Semis, biotech, software, retail, oil…</w:t>
+              <w:t>Semis, biotech, software, retail, oil, transports (IYT)…</w:t>
             </w:r>
           </w:p>
         </w:tc>

</xml_diff>

<commit_message>
fix(sentiment): describe the composite the way it scores - calm high, stress low
Every screen and manual called the 0-10 sentiment composite contrarian (a
high score means fear), while every scorer rates calm, supportive conditions
HIGH: heavy put buying, a VIX spike, backwardation and a weak tape all score
low. On a calm, rising morning (VIX down 10%, P/C 0.88, A/D 1.9:1) the Desk's
summary told the reader investors were fearful. regime_filter always read it
correctly; only the prose was backwards.

Rewritten: the five summary facts, the Desk chip hover, the BIAS/SIGNAL hovers
(cut-offs and sizes unchanged), the Sentiment page guide, three manuals, the
routes doc and sentiment-dashboard/CLAUDE.md. test_scale_direction pins the
premise; three wording tests forbid fear/greed/complacent/contrarian and
require calm/stress on the right bands. Each new summary fact passed every
check against the live API before promoting.

Co-Authored-By: Claude Opus 5 <noreply@anthropic.com>
</commit_message>
<xml_diff>
--- a/docs/manuals/reference-guide/reference-guide.docx
+++ b/docs/manuals/reference-guide/reference-guide.docx
@@ -2069,20 +2069,18 @@
         <w:t>0–100 with higher meaning better</w:t>
       </w:r>
       <w:r>
-        <w:t>, except the sentiment composite,</w:t>
-        <w:br/>
-        <w:t xml:space="preserve">  which is </w:t>
-      </w:r>
-      <w:r>
-        <w:rPr>
-          <w:b/>
-        </w:rPr>
-        <w:t>0–10 and contrarian</w:t>
-      </w:r>
-      <w:r>
-        <w:t xml:space="preserve"> — high means fearful, which historically has been</w:t>
-        <w:br/>
-        <w:t xml:space="preserve">  the better time to sell premium.</w:t>
+        <w:t>. The sentiment composite runs</w:t>
+        <w:br/>
+        <w:t xml:space="preserve">  </w:t>
+      </w:r>
+      <w:r>
+        <w:rPr>
+          <w:b/>
+        </w:rPr>
+        <w:t>0–10</w:t>
+      </w:r>
+      <w:r>
+        <w:t>: high means calm, supportive conditions and low means stress.</w:t>
       </w:r>
     </w:p>
     <w:p>
@@ -3026,11 +3024,11 @@
         <w:br/>
         <w:t>behind. Hovering a chip opens the same hover its counterpart uses elsewhere on the</w:t>
         <w:br/>
-        <w:t>page; the Sentiment chip's own hover reads "The sentiment composite, 0–10.</w:t>
-        <w:br/>
-        <w:t>Contrarian: a higher score means more fear, which this model reads as</w:t>
-        <w:br/>
-        <w:t>opportunity." and the Bull/Bear chip's hover lists every quadrant's count and</w:t>
+        <w:t>page; the Sentiment chip's own hover reads "The sentiment composite, 0–10. A</w:t>
+        <w:br/>
+        <w:t>higher score means calmer, more supportive conditions (quieter volatility, more</w:t>
+        <w:br/>
+        <w:t>call buying, broader gains); a lower score means stress." and the Bull/Bear chip's hover lists every quadrant's count and</w:t>
         <w:br/>
         <w:t>which horizon (today or the quarter) it was counted on.</w:t>
       </w:r>
@@ -9444,41 +9442,23 @@
         <w:rPr>
           <w:b/>
         </w:rPr>
-        <w:t>The most important thing to understand: the sentiment score is contrarian.</w:t>
-      </w:r>
-      <w:r>
-        <w:rPr/>
-        <w:t xml:space="preserve"> It runs</w:t>
-        <w:br/>
-        <w:t xml:space="preserve">0–10, and </w:t>
-      </w:r>
-      <w:r>
-        <w:rPr>
-          <w:b/>
-        </w:rPr>
-        <w:t>high means fearful</w:t>
-      </w:r>
-      <w:r>
-        <w:rPr/>
-        <w:t>. A reading of 8 does not mean the market is happy; it</w:t>
-        <w:br/>
-        <w:t>means participants are defensive — buying puts, bidding volatility, rotating to</w:t>
-        <w:br/>
-        <w:t xml:space="preserve">defensives. Historically that has been the better environment to </w:t>
-      </w:r>
-      <w:r>
-        <w:rPr>
-          <w:i/>
-        </w:rPr>
-        <w:t>sell</w:t>
-      </w:r>
-      <w:r>
-        <w:rPr/>
-        <w:t xml:space="preserve"> premium, which</w:t>
-        <w:br/>
-        <w:t>is what this app is mostly built to do. A low reading means complacency, which is when</w:t>
-        <w:br/>
-        <w:t>selling premium pays least and hurts most.</w:t>
+        <w:t>The most important thing to understand: a high sentiment score means calm,</w:t>
+        <w:br/>
+        <w:t>supportive conditions — not fear.</w:t>
+      </w:r>
+      <w:r>
+        <w:rPr/>
+        <w:t xml:space="preserve"> It runs 0–10. A reading of 8 means volatility is</w:t>
+        <w:br/>
+        <w:t>quiet, options traders lean toward calls, most stocks are advancing and cyclical</w:t>
+        <w:br/>
+        <w:t>sectors are leading. A low reading means stress: volatility bid, heavy put buying, a</w:t>
+        <w:br/>
+        <w:t>weak tape, money rotating into defensives. Every input scores stress low. (Earlier</w:t>
+        <w:br/>
+        <w:t>versions of this guide called the scale contrarian, with high meaning fearful. That</w:t>
+        <w:br/>
+        <w:t>was backwards.)</w:t>
       </w:r>
     </w:p>
     <w:p>
@@ -10574,18 +10554,9 @@
         <w:br/>
         <w:t>and the word explains itself — including the same Bias word on the Sentiment card's</w:t>
         <w:br/>
-        <w:t>pill. Both words are bands of the one sentiment composite, and that scale is</w:t>
-        <w:br/>
-      </w:r>
-      <w:r>
-        <w:rPr>
-          <w:b/>
-        </w:rPr>
-        <w:t>contrarian</w:t>
-      </w:r>
-      <w:r>
-        <w:rPr/>
-        <w:t xml:space="preserve">: a </w:t>
+        <w:t>pill. Both words are bands of the one sentiment composite, where high means calm,</w:t>
+        <w:br/>
+        <w:t xml:space="preserve">supportive conditions: a </w:t>
       </w:r>
       <w:r>
         <w:rPr>
@@ -10595,9 +10566,9 @@
       </w:r>
       <w:r>
         <w:rPr/>
-        <w:t xml:space="preserve"> signal means the crowd is fearful, not that price is</w:t>
-        <w:br/>
-        <w:t>rising.</w:t>
+        <w:t xml:space="preserve"> signal describes a supportive backdrop — not fear,</w:t>
+        <w:br/>
+        <w:t>and not a promise that price will rise.</w:t>
       </w:r>
     </w:p>
     <w:tbl>

</xml_diff>

<commit_message>
docs: rebuild the Reference Guide for the merged caps; five limits, not four
The merged branch edited reference-guide.md but not its built .html and
.docx, which main had since rebuilt - so the served manual would have kept
the old "Same-day expirations" wording and lacked the concentration limits.
Rebuilt with build_docs.py.

Also corrects the limits paragraph it added: "Four limits, checked in this
order" sat above a table of five, and run_entry_cycle checks the
concentration limits twice (before sizing and against the fill), so no
single order exists. It now says five limits and claims no order.

The gap assessment records that dde98b8 is merged here (05ed539) with the
promote still pending, and the CHANGELOG entry notes both manual fixes.
Docs tests: test_docs_cover_the_ui 77 passed, test_cross_tier_mirrors 16.

Co-Authored-By: Claude Opus 5 <noreply@anthropic.com>
</commit_message>
<xml_diff>
--- a/docs/manuals/reference-guide/reference-guide.docx
+++ b/docs/manuals/reference-guide/reference-guide.docx
@@ -2018,7 +2018,38 @@
         <w:t>0-DTE</w:t>
       </w:r>
       <w:r>
-        <w:t xml:space="preserve"> means expiring today.</w:t>
+        <w:t xml:space="preserve"> as a </w:t>
+      </w:r>
+      <w:r>
+        <w:rPr>
+          <w:i/>
+        </w:rPr>
+        <w:t>term</w:t>
+      </w:r>
+      <w:r>
+        <w:t xml:space="preserve"> means expiring today; the</w:t>
+        <w:br/>
+        <w:t xml:space="preserve">  Market Scanner's </w:t>
+      </w:r>
+      <w:r>
+        <w:rPr>
+          <w:b/>
+        </w:rPr>
+        <w:t>0-DTE tab</w:t>
+      </w:r>
+      <w:r>
+        <w:t xml:space="preserve"> is a wider bucket covering </w:t>
+      </w:r>
+      <w:r>
+        <w:rPr>
+          <w:b/>
+        </w:rPr>
+        <w:t>0–4 DTE</w:t>
+      </w:r>
+      <w:r>
+        <w:t>, so check the</w:t>
+        <w:br/>
+        <w:t xml:space="preserve">  Exp column rather than assuming same-day.</w:t>
       </w:r>
     </w:p>
     <w:p>
@@ -19132,7 +19163,27 @@
             <w:r/>
             <w:r>
               <w:rPr/>
-              <w:t>Same-day expirations. Fast, high-decay, unforgiving.</w:t>
+              <w:t xml:space="preserve">The </w:t>
+            </w:r>
+            <w:r>
+              <w:rPr>
+                <w:i/>
+              </w:rPr>
+              <w:t>short-dated</w:t>
+            </w:r>
+            <w:r>
+              <w:rPr/>
+              <w:t xml:space="preserve"> bucket: </w:t>
+            </w:r>
+            <w:r>
+              <w:rPr>
+                <w:b/>
+              </w:rPr>
+              <w:t>0 to 4 DTE</w:t>
+            </w:r>
+            <w:r>
+              <w:rPr/>
+              <w:t>, not only today. Fast, high-decay, unforgiving. Read the Exp column — a 3-DTE spread in this tab is held across sessions, and can straddle an earnings report.</w:t>
             </w:r>
           </w:p>
         </w:tc>
@@ -21604,13 +21655,53 @@
         <w:rPr/>
         <w:t>At 30–45 days a straddled earnings report is close to certain for most names, which is</w:t>
         <w:br/>
-        <w:t>why the gate matters more here than at any shorter horizon — and why the third state</w:t>
-        <w:br/>
-        <w:t>matters. A symbol the calendar has never heard of and a symbol it knows is clear both</w:t>
-        <w:br/>
-        <w:t>leave the date blank; collapsing them would let the gate fail open silently on exactly</w:t>
-        <w:br/>
-        <w:t>the names most likely to be traded.</w:t>
+        <w:t>why the gate bites hardest here — and why the third state matters. A symbol the calendar</w:t>
+        <w:br/>
+        <w:t>has never heard of and a symbol it knows is clear both leave the date blank; collapsing</w:t>
+        <w:br/>
+        <w:t>them would let the gate fail open silently on exactly the names most likely to be traded.</w:t>
+      </w:r>
+    </w:p>
+    <w:p>
+      <w:r>
+        <w:rPr/>
+        <w:t xml:space="preserve">The shorter windows are gated too, as of </w:t>
+      </w:r>
+      <w:r>
+        <w:rPr>
+          <w:b/>
+        </w:rPr>
+        <w:t>2026-09-09</w:t>
+      </w:r>
+      <w:r>
+        <w:rPr/>
+        <w:t>. They were not before: the live</w:t>
+        <w:br/>
+        <w:t>scan never handed the gate a date to check, so it was a no-op everywhere except here.</w:t>
+        <w:br/>
+        <w:t>The Market Scanner's swing signals, and every 0-DTE-bucket candidate that is not a</w:t>
+        <w:br/>
+      </w:r>
+      <w:r>
+        <w:rPr>
+          <w:i/>
+        </w:rPr>
+        <w:t>same-day</w:t>
+      </w:r>
+      <w:r>
+        <w:rPr/>
+        <w:t xml:space="preserve"> expiry, now consult the same calendar. This screen remains the only one that</w:t>
+        <w:br/>
+      </w:r>
+      <w:r>
+        <w:rPr>
+          <w:b/>
+        </w:rPr>
+        <w:t>shows</w:t>
+      </w:r>
+      <w:r>
+        <w:rPr/>
+        <w:t xml:space="preserve"> you the three-state answer; the others simply drop what straddles a report.</w:t>
       </w:r>
     </w:p>
     <w:p>
@@ -24241,35 +24332,370 @@
       </w:pPr>
       <w:r>
         <w:rPr/>
-        <w:t>Why it matters</w:t>
-      </w:r>
-    </w:p>
-    <w:p>
-      <w:r>
-        <w:rPr/>
-        <w:t>This is the app's mechanical baseline. The engine applies the same rules every time</w:t>
-        <w:br/>
-        <w:t>without hesitation, fear or improvisation — so comparing it against your hand-kept</w:t>
-        <w:br/>
-        <w:t xml:space="preserve">ledger tells you something specific: whether your discretion </w:t>
-      </w:r>
-      <w:r>
-        <w:rPr>
-          <w:b/>
-        </w:rPr>
-        <w:t>adds</w:t>
-      </w:r>
-      <w:r>
-        <w:rPr/>
-        <w:t xml:space="preserve"> value over the</w:t>
-        <w:br/>
-        <w:t>rules, or subtracts it. That is an uncomfortable comparison and a genuinely useful one.</w:t>
-      </w:r>
-    </w:p>
-    <w:p>
-      <w:r>
-        <w:rPr/>
-        <w:t>The fills log is also the best available audit trail when a position behaves unexpectedly.</w:t>
+        <w:t>What the engine will refuse</w:t>
+      </w:r>
+    </w:p>
+    <w:p>
+      <w:r>
+        <w:rPr/>
+        <w:t>Five limits. The first four each refuse a single trade; the fifth</w:t>
+        <w:br/>
+        <w:t>stops the day.</w:t>
+      </w:r>
+    </w:p>
+    <w:tbl>
+      <w:tblPr>
+        <w:tblW w:type="auto" w:w="0"/>
+        <w:jc w:val="left"/>
+        <w:tblLayout w:type="autofit"/>
+        <w:tblLook w:firstColumn="1" w:firstRow="1" w:lastColumn="0" w:lastRow="0" w:noHBand="0" w:noVBand="1" w:val="04A0"/>
+        <w:tblBorders>
+          <w:top w:val="single" w:sz="4" w:space="0" w:color="D8DEE9"/>
+          <w:left w:val="single" w:sz="4" w:space="0" w:color="D8DEE9"/>
+          <w:bottom w:val="single" w:sz="4" w:space="0" w:color="D8DEE9"/>
+          <w:right w:val="single" w:sz="4" w:space="0" w:color="D8DEE9"/>
+          <w:insideH w:val="single" w:sz="4" w:space="0" w:color="D8DEE9"/>
+          <w:insideV w:val="single" w:sz="4" w:space="0" w:color="D8DEE9"/>
+        </w:tblBorders>
+      </w:tblPr>
+      <w:tblGrid>
+        <w:gridCol w:w="2880"/>
+        <w:gridCol w:w="2880"/>
+        <w:gridCol w:w="2880"/>
+      </w:tblGrid>
+      <w:tr>
+        <w:tc>
+          <w:tcPr>
+            <w:tcW w:type="dxa" w:w="2880"/>
+            <w:shd w:val="clear" w:color="auto" w:fill="EAF2FB"/>
+          </w:tcPr>
+          <w:p>
+            <w:r>
+              <w:rPr>
+                <w:b/>
+              </w:rPr>
+            </w:r>
+            <w:r>
+              <w:rPr>
+                <w:b/>
+              </w:rPr>
+              <w:t>Limit</w:t>
+            </w:r>
+          </w:p>
+        </w:tc>
+        <w:tc>
+          <w:tcPr>
+            <w:tcW w:type="dxa" w:w="2880"/>
+            <w:shd w:val="clear" w:color="auto" w:fill="EAF2FB"/>
+          </w:tcPr>
+          <w:p>
+            <w:r>
+              <w:rPr>
+                <w:b/>
+              </w:rPr>
+            </w:r>
+            <w:r>
+              <w:rPr>
+                <w:b/>
+              </w:rPr>
+              <w:t>Default</w:t>
+            </w:r>
+          </w:p>
+        </w:tc>
+        <w:tc>
+          <w:tcPr>
+            <w:tcW w:type="dxa" w:w="2880"/>
+            <w:shd w:val="clear" w:color="auto" w:fill="EAF2FB"/>
+          </w:tcPr>
+          <w:p>
+            <w:r>
+              <w:rPr>
+                <w:b/>
+              </w:rPr>
+            </w:r>
+            <w:r>
+              <w:rPr>
+                <w:b/>
+              </w:rPr>
+              <w:t>Refuses</w:t>
+            </w:r>
+          </w:p>
+        </w:tc>
+      </w:tr>
+      <w:tr>
+        <w:tc>
+          <w:tcPr>
+            <w:tcW w:type="dxa" w:w="2880"/>
+          </w:tcPr>
+          <w:p>
+            <w:r/>
+            <w:r>
+              <w:rPr/>
+              <w:t>Risk per trade</w:t>
+            </w:r>
+          </w:p>
+        </w:tc>
+        <w:tc>
+          <w:tcPr>
+            <w:tcW w:type="dxa" w:w="2880"/>
+          </w:tcPr>
+          <w:p>
+            <w:r/>
+            <w:r>
+              <w:rPr/>
+              <w:t>$250</w:t>
+            </w:r>
+          </w:p>
+        </w:tc>
+        <w:tc>
+          <w:tcPr>
+            <w:tcW w:type="dxa" w:w="2880"/>
+          </w:tcPr>
+          <w:p>
+            <w:r/>
+            <w:r>
+              <w:rPr/>
+              <w:t>A spread whose single contract already exceeds the cap</w:t>
+            </w:r>
+          </w:p>
+        </w:tc>
+      </w:tr>
+      <w:tr>
+        <w:tc>
+          <w:tcPr>
+            <w:tcW w:type="dxa" w:w="2880"/>
+            <w:shd w:val="clear" w:color="auto" w:fill="F4F6FA"/>
+          </w:tcPr>
+          <w:p>
+            <w:r/>
+            <w:r>
+              <w:rPr>
+                <w:b/>
+              </w:rPr>
+              <w:t>Positions in one symbol</w:t>
+            </w:r>
+          </w:p>
+        </w:tc>
+        <w:tc>
+          <w:tcPr>
+            <w:tcW w:type="dxa" w:w="2880"/>
+            <w:shd w:val="clear" w:color="auto" w:fill="F4F6FA"/>
+          </w:tcPr>
+          <w:p>
+            <w:r/>
+            <w:r>
+              <w:rPr>
+                <w:b/>
+              </w:rPr>
+              <w:t>3</w:t>
+            </w:r>
+          </w:p>
+        </w:tc>
+        <w:tc>
+          <w:tcPr>
+            <w:tcW w:type="dxa" w:w="2880"/>
+            <w:shd w:val="clear" w:color="auto" w:fill="F4F6FA"/>
+          </w:tcPr>
+          <w:p>
+            <w:r/>
+            <w:r>
+              <w:rPr/>
+              <w:t>A fourth open position in the same underlying</w:t>
+            </w:r>
+          </w:p>
+        </w:tc>
+      </w:tr>
+      <w:tr>
+        <w:tc>
+          <w:tcPr>
+            <w:tcW w:type="dxa" w:w="2880"/>
+          </w:tcPr>
+          <w:p>
+            <w:r/>
+            <w:r>
+              <w:rPr>
+                <w:b/>
+              </w:rPr>
+              <w:t>Risk in one symbol</w:t>
+            </w:r>
+          </w:p>
+        </w:tc>
+        <w:tc>
+          <w:tcPr>
+            <w:tcW w:type="dxa" w:w="2880"/>
+          </w:tcPr>
+          <w:p>
+            <w:r/>
+            <w:r>
+              <w:rPr>
+                <w:b/>
+              </w:rPr>
+              <w:t>$750</w:t>
+            </w:r>
+          </w:p>
+        </w:tc>
+        <w:tc>
+          <w:tcPr>
+            <w:tcW w:type="dxa" w:w="2880"/>
+          </w:tcPr>
+          <w:p>
+            <w:r/>
+            <w:r>
+              <w:rPr/>
+              <w:t>An entry that would push one name's summed max loss past the cap</w:t>
+            </w:r>
+          </w:p>
+        </w:tc>
+      </w:tr>
+      <w:tr>
+        <w:tc>
+          <w:tcPr>
+            <w:tcW w:type="dxa" w:w="2880"/>
+            <w:shd w:val="clear" w:color="auto" w:fill="F4F6FA"/>
+          </w:tcPr>
+          <w:p>
+            <w:r/>
+            <w:r>
+              <w:rPr>
+                <w:b/>
+              </w:rPr>
+              <w:t>Positions in one expiry</w:t>
+            </w:r>
+          </w:p>
+        </w:tc>
+        <w:tc>
+          <w:tcPr>
+            <w:tcW w:type="dxa" w:w="2880"/>
+            <w:shd w:val="clear" w:color="auto" w:fill="F4F6FA"/>
+          </w:tcPr>
+          <w:p>
+            <w:r/>
+            <w:r>
+              <w:rPr>
+                <w:b/>
+              </w:rPr>
+              <w:t>5</w:t>
+            </w:r>
+          </w:p>
+        </w:tc>
+        <w:tc>
+          <w:tcPr>
+            <w:tcW w:type="dxa" w:w="2880"/>
+            <w:shd w:val="clear" w:color="auto" w:fill="F4F6FA"/>
+          </w:tcPr>
+          <w:p>
+            <w:r/>
+            <w:r>
+              <w:rPr/>
+              <w:t xml:space="preserve">A sixth open position sharing an expiration date, </w:t>
+            </w:r>
+            <w:r>
+              <w:rPr>
+                <w:i/>
+              </w:rPr>
+              <w:t>across all names</w:t>
+            </w:r>
+          </w:p>
+        </w:tc>
+      </w:tr>
+      <w:tr>
+        <w:tc>
+          <w:tcPr>
+            <w:tcW w:type="dxa" w:w="2880"/>
+          </w:tcPr>
+          <w:p>
+            <w:r/>
+            <w:r>
+              <w:rPr/>
+              <w:t>Session drawdown</w:t>
+            </w:r>
+          </w:p>
+        </w:tc>
+        <w:tc>
+          <w:tcPr>
+            <w:tcW w:type="dxa" w:w="2880"/>
+          </w:tcPr>
+          <w:p>
+            <w:r/>
+            <w:r>
+              <w:rPr/>
+              <w:t>$2,500</w:t>
+            </w:r>
+          </w:p>
+        </w:tc>
+        <w:tc>
+          <w:tcPr>
+            <w:tcW w:type="dxa" w:w="2880"/>
+          </w:tcPr>
+          <w:p>
+            <w:r/>
+            <w:r>
+              <w:rPr/>
+              <w:t>Halts the account for the day</w:t>
+            </w:r>
+          </w:p>
+        </w:tc>
+      </w:tr>
+    </w:tbl>
+    <w:p/>
+    <w:p>
+      <w:r>
+        <w:rPr/>
+        <w:t>The three concentration limits were added on 2026-09-09. Before them the engine had</w:t>
+        <w:br/>
+        <w:t>nothing between "one trade" and "the whole account", and a book could be entirely one</w:t>
+        <w:br/>
+        <w:t>name while clearing both ends — which is what happened: fourteen open positions, all</w:t>
+        <w:br/>
+        <w:t>ORCL, all expiring the same Friday, over an earnings report scheduled the day before.</w:t>
+      </w:r>
+    </w:p>
+    <w:p>
+      <w:r>
+        <w:rPr/>
+        <w:t xml:space="preserve">The expiry limit counts </w:t>
+      </w:r>
+      <w:r>
+        <w:rPr>
+          <w:b/>
+        </w:rPr>
+        <w:t>across symbols on purpose</w:t>
+      </w:r>
+      <w:r>
+        <w:rPr/>
+        <w:t>. Five positions expiring the same</w:t>
+        <w:br/>
+        <w:t>Friday is a bet on one date even when no single name is over its own cap.</w:t>
+      </w:r>
+    </w:p>
+    <w:p>
+      <w:r>
+        <w:rPr/>
+        <w:t xml:space="preserve">All three live in </w:t>
+      </w:r>
+      <w:r>
+        <w:rPr>
+          <w:rFonts w:ascii="Consolas" w:hAnsi="Consolas"/>
+          <w:color w:val="334455"/>
+          <w:sz w:val="19"/>
+        </w:rPr>
+        <w:t>options-scanner/config_paper.py</w:t>
+      </w:r>
+      <w:r>
+        <w:rPr/>
+        <w:t xml:space="preserve"> — edit and restart </w:t>
+      </w:r>
+      <w:r>
+        <w:rPr>
+          <w:rFonts w:ascii="Consolas" w:hAnsi="Consolas"/>
+          <w:color w:val="334455"/>
+          <w:sz w:val="19"/>
+        </w:rPr>
+        <w:t>options_svc</w:t>
+      </w:r>
+      <w:r>
+        <w:rPr/>
+        <w:t>.</w:t>
       </w:r>
     </w:p>
     <w:p>
@@ -24278,6 +24704,43 @@
       </w:pPr>
       <w:r>
         <w:rPr/>
+        <w:t>Why it matters</w:t>
+      </w:r>
+    </w:p>
+    <w:p>
+      <w:r>
+        <w:rPr/>
+        <w:t>This is the app's mechanical baseline. The engine applies the same rules every time</w:t>
+        <w:br/>
+        <w:t>without hesitation, fear or improvisation — so comparing it against your hand-kept</w:t>
+        <w:br/>
+        <w:t xml:space="preserve">ledger tells you something specific: whether your discretion </w:t>
+      </w:r>
+      <w:r>
+        <w:rPr>
+          <w:b/>
+        </w:rPr>
+        <w:t>adds</w:t>
+      </w:r>
+      <w:r>
+        <w:rPr/>
+        <w:t xml:space="preserve"> value over the</w:t>
+        <w:br/>
+        <w:t>rules, or subtracts it. That is an uncomfortable comparison and a genuinely useful one.</w:t>
+      </w:r>
+    </w:p>
+    <w:p>
+      <w:r>
+        <w:rPr/>
+        <w:t>The fills log is also the best available audit trail when a position behaves unexpectedly.</w:t>
+      </w:r>
+    </w:p>
+    <w:p>
+      <w:pPr>
+        <w:pStyle w:val="Heading3"/>
+      </w:pPr>
+      <w:r>
+        <w:rPr/>
         <w:t>Caveats and gotchas</w:t>
       </w:r>
     </w:p>
@@ -24321,6 +24784,81 @@
       </w:r>
       <w:r>
         <w:t xml:space="preserve"> There is no undo.</w:t>
+      </w:r>
+    </w:p>
+    <w:p>
+      <w:pPr>
+        <w:pStyle w:val="ListBullet"/>
+      </w:pPr>
+      <w:r>
+        <w:t xml:space="preserve">⚠ </w:t>
+      </w:r>
+      <w:r>
+        <w:rPr>
+          <w:b/>
+        </w:rPr>
+        <w:t>A concentration refusal leaves no row on this screen.</w:t>
+      </w:r>
+      <w:r>
+        <w:t xml:space="preserve"> The risk-per-trade and</w:t>
+        <w:br/>
+        <w:t xml:space="preserve">  buying-power refusals appear in the fills log as </w:t>
+      </w:r>
+      <w:r>
+        <w:rPr>
+          <w:rFonts w:ascii="Consolas" w:hAnsi="Consolas"/>
+          <w:color w:val="334455"/>
+          <w:sz w:val="19"/>
+        </w:rPr>
+        <w:t>REJECTED</w:t>
+      </w:r>
+      <w:r>
+        <w:t>; the three concentration</w:t>
+        <w:br/>
+        <w:t xml:space="preserve">  limits do not — they skip the signal silently and log to the service journal</w:t>
+        <w:br/>
+        <w:t xml:space="preserve">  (</w:t>
+      </w:r>
+      <w:r>
+        <w:rPr>
+          <w:rFonts w:ascii="Consolas" w:hAnsi="Consolas"/>
+          <w:color w:val="334455"/>
+          <w:sz w:val="19"/>
+        </w:rPr>
+        <w:t>SKIPPED &lt;symbol&gt; &lt;reason&gt; (concentration cap)</w:t>
+      </w:r>
+      <w:r>
+        <w:t>). That is deliberate: the condition</w:t>
+        <w:br/>
+        <w:t xml:space="preserve">  is </w:t>
+      </w:r>
+      <w:r>
+        <w:rPr>
+          <w:i/>
+        </w:rPr>
+        <w:t>temporary</w:t>
+      </w:r>
+      <w:r>
+        <w:t>, and a rejected order row would blacklist the signal permanently, so a</w:t>
+        <w:br/>
+        <w:t xml:space="preserve">  name that freed up an hour later could never be entered. The visible symptom is a</w:t>
+        <w:br/>
+        <w:t xml:space="preserve">  high-scoring captured signal that simply never opens. Check</w:t>
+        <w:br/>
+        <w:t xml:space="preserve">  </w:t>
+      </w:r>
+      <w:r>
+        <w:rPr>
+          <w:rFonts w:ascii="Consolas" w:hAnsi="Consolas"/>
+          <w:color w:val="334455"/>
+          <w:sz w:val="19"/>
+        </w:rPr>
+        <w:t>journalctl --user -u trading-prod-options_svc | grep concentration</w:t>
+      </w:r>
+      <w:r>
+        <w:t xml:space="preserve"> before assuming</w:t>
+        <w:br/>
+        <w:t xml:space="preserve">  the engine is stuck.</w:t>
       </w:r>
     </w:p>
     <w:p>
@@ -34198,7 +34736,31 @@
       </w:r>
       <w:r>
         <w:rPr/>
-        <w:t xml:space="preserve"> — expiring today. Maximum time decay, maximum gamma risk.</w:t>
+        <w:t xml:space="preserve"> — expiring today. Maximum time decay, maximum gamma risk. ⚠ The Market</w:t>
+        <w:br/>
+        <w:t xml:space="preserve">Scanner's </w:t>
+      </w:r>
+      <w:r>
+        <w:rPr>
+          <w:b/>
+        </w:rPr>
+        <w:t>0-DTE tab</w:t>
+      </w:r>
+      <w:r>
+        <w:rPr/>
+        <w:t xml:space="preserve"> is named for this but spans </w:t>
+      </w:r>
+      <w:r>
+        <w:rPr>
+          <w:b/>
+        </w:rPr>
+        <w:t>0–4 DTE</w:t>
+      </w:r>
+      <w:r>
+        <w:rPr/>
+        <w:t>, so a position opened</w:t>
+        <w:br/>
+        <w:t>from it is not necessarily flat by the close.</w:t>
       </w:r>
     </w:p>
     <w:p>

</xml_diff>